<commit_message>
docs: revise the two advisor briefs against the mail text
Drop names and dates that are not in the provided bodies, keep missing attachments unknown, and leave quote figures uncalculated.

Co-authored-by: whelp99-code <whelp99-code@users.noreply.github.com>
</commit_message>
<xml_diff>
--- a/docs/ops/mail-analysis/20260923-doyeon-nvh-advisor.docx
+++ b/docs/ops/mail-analysis/20260923-doyeon-nvh-advisor.docx
@@ -4,16 +4,15 @@
   <w:body>
     <w:p>
       <w:pPr>
-        <w:spacing w:after="0" w:before="0" w:line="276" w:lineRule="auto"/>
+        <w:spacing w:after="40" w:before="0" w:line="276" w:lineRule="auto"/>
       </w:pPr>
       <w:r>
         <w:rPr>
           <w:rFonts w:ascii="Malgun Gothic" w:hAnsi="Malgun Gothic" w:cs="Malgun Gothic" w:eastAsia="맑은 고딕"/>
           <w:b/>
-          <w:color w:val="555F6D"/>
           <w:sz w:val="22"/>
         </w:rPr>
-        <w:t>(주)베를로</w:t>
+        <w:t>【재민 확인 전 발송·회신 금지】 DEC-20260923-mail2-advisor</w:t>
       </w:r>
     </w:p>
     <w:p>
@@ -26,12 +25,12 @@
           <w:b/>
           <w:sz w:val="32"/>
         </w:rPr>
-        <w:t>(주)도연시스템즈 · NVH Korea 보안 범위 어드바이저 메모</w:t>
+        <w:t>BLRO 어드바이저 핸드오프 — (주)도연시스템즈 / NVH Korea · Sangfor 보안</w:t>
       </w:r>
     </w:p>
     <w:p>
       <w:pPr>
-        <w:spacing w:after="160" w:before="0" w:line="276" w:lineRule="auto"/>
+        <w:spacing w:after="20" w:before="0" w:line="276" w:lineRule="auto"/>
       </w:pPr>
       <w:r>
         <w:rPr>
@@ -40,7 +39,20 @@
           <w:color w:val="555F6D"/>
           <w:sz w:val="22"/>
         </w:rPr>
-        <w:t>내부 어드바이저 메모  ·  2026-09-23  ·  고객에게 보내지 않음</w:t>
+        <w:t>문서번호: 20260923-분석전달-도연NVH-Sangfor보안-어드바이저</w:t>
+      </w:r>
+    </w:p>
+    <w:p>
+      <w:pPr>
+        <w:spacing w:after="20" w:before="0" w:line="276" w:lineRule="auto"/>
+      </w:pPr>
+      <w:r>
+        <w:rPr>
+          <w:rFonts w:ascii="Malgun Gothic" w:hAnsi="Malgun Gothic" w:cs="Malgun Gothic" w:eastAsia="맑은 고딕"/>
+          <w:b w:val="0"/>
+          <w:sz w:val="22"/>
+        </w:rPr>
+        <w:t>작성일: 2026-09-23 (KST) ｜ 의사결정: DEC-20260923-mail2-advisor ｜ 역할: (주)베를로=어드바이저, 견적 실행=결정 절의 매입 파트너</w:t>
       </w:r>
     </w:p>
     <w:p>
@@ -53,347 +65,7 @@
           <w:b w:val="0"/>
           <w:sz w:val="22"/>
         </w:rPr>
-        <w:t>이 문서는 2026-09-23 14:43 수신 메일의 본문과 분류 패킷을 확인한 뒤 작성했다. 메일함은 다시 열지 않았고, 첨부 파일은 이 메일에 없다. 단가와 수량은 새로 적지 않았다.</w:t>
-      </w:r>
-    </w:p>
-    <w:p>
-      <w:pPr>
-        <w:spacing w:before="280" w:after="120"/>
-        <w:pBdr>
-          <w:bottom w:val="single" w:sz="8" w:space="1" w:color="1F2A37"/>
-        </w:pBdr>
-      </w:pPr>
-      <w:r>
-        <w:rPr>
-          <w:rFonts w:ascii="Malgun Gothic" w:hAnsi="Malgun Gothic" w:cs="Malgun Gothic" w:eastAsia="맑은 고딕"/>
-          <w:b/>
-          <w:color w:val="1F2A37"/>
-          <w:sz w:val="26"/>
-        </w:rPr>
-        <w:t>1. 원문 FACT</w:t>
-      </w:r>
-    </w:p>
-    <w:tbl>
-      <w:tblPr>
-        <w:tblStyle w:val="TableGrid"/>
-        <w:tblW w:type="auto" w:w="0"/>
-        <w:tblLayout w:type="autofit"/>
-        <w:tblLook w:firstColumn="1" w:firstRow="1" w:lastColumn="0" w:lastRow="0" w:noHBand="0" w:noVBand="1" w:val="04A0"/>
-      </w:tblPr>
-      <w:tblGrid>
-        <w:gridCol w:w="4819"/>
-        <w:gridCol w:w="4819"/>
-      </w:tblGrid>
-      <w:tr>
-        <w:tc>
-          <w:tcPr>
-            <w:tcW w:type="dxa" w:w="2381"/>
-            <w:shd w:val="clear" w:color="auto" w:fill="F4F6F8"/>
-          </w:tcPr>
-          <w:p>
-            <w:pPr>
-              <w:spacing w:after="40"/>
-            </w:pPr>
-            <w:r>
-              <w:rPr>
-                <w:rFonts w:ascii="Malgun Gothic" w:hAnsi="Malgun Gothic" w:cs="Malgun Gothic" w:eastAsia="맑은 고딕"/>
-                <w:b/>
-                <w:sz w:val="22"/>
-              </w:rPr>
-              <w:t>수신</w:t>
-            </w:r>
-          </w:p>
-        </w:tc>
-        <w:tc>
-          <w:tcPr>
-            <w:tcW w:type="dxa" w:w="6917"/>
-            <w:shd w:val="clear" w:color="auto" w:fill="FFFFFF"/>
-          </w:tcPr>
-          <w:p>
-            <w:pPr>
-              <w:spacing w:after="40"/>
-            </w:pPr>
-            <w:r>
-              <w:rPr>
-                <w:rFonts w:ascii="Malgun Gothic" w:hAnsi="Malgun Gothic" w:cs="Malgun Gothic" w:eastAsia="맑은 고딕"/>
-                <w:b w:val="0"/>
-                <w:sz w:val="22"/>
-              </w:rPr>
-              <w:t>2026-09-23 14:43:59 KST</w:t>
-            </w:r>
-          </w:p>
-        </w:tc>
-      </w:tr>
-      <w:tr>
-        <w:tc>
-          <w:tcPr>
-            <w:tcW w:type="dxa" w:w="2381"/>
-            <w:shd w:val="clear" w:color="auto" w:fill="F4F6F8"/>
-          </w:tcPr>
-          <w:p>
-            <w:pPr>
-              <w:spacing w:after="40"/>
-            </w:pPr>
-            <w:r>
-              <w:rPr>
-                <w:rFonts w:ascii="Malgun Gothic" w:hAnsi="Malgun Gothic" w:cs="Malgun Gothic" w:eastAsia="맑은 고딕"/>
-                <w:b/>
-                <w:sz w:val="22"/>
-              </w:rPr>
-              <w:t>수신함</w:t>
-            </w:r>
-          </w:p>
-        </w:tc>
-        <w:tc>
-          <w:tcPr>
-            <w:tcW w:type="dxa" w:w="6917"/>
-            <w:shd w:val="clear" w:color="auto" w:fill="FFFFFF"/>
-          </w:tcPr>
-          <w:p>
-            <w:pPr>
-              <w:spacing w:after="40"/>
-            </w:pPr>
-            <w:r>
-              <w:rPr>
-                <w:rFonts w:ascii="Malgun Gothic" w:hAnsi="Malgun Gothic" w:cs="Malgun Gothic" w:eastAsia="맑은 고딕"/>
-                <w:b w:val="0"/>
-                <w:sz w:val="22"/>
-              </w:rPr>
-              <w:t>jm.park@blro.co.kr · 미읽음 · WORK · NEW</w:t>
-            </w:r>
-          </w:p>
-        </w:tc>
-      </w:tr>
-      <w:tr>
-        <w:tc>
-          <w:tcPr>
-            <w:tcW w:type="dxa" w:w="2381"/>
-            <w:shd w:val="clear" w:color="auto" w:fill="F4F6F8"/>
-          </w:tcPr>
-          <w:p>
-            <w:pPr>
-              <w:spacing w:after="40"/>
-            </w:pPr>
-            <w:r>
-              <w:rPr>
-                <w:rFonts w:ascii="Malgun Gothic" w:hAnsi="Malgun Gothic" w:cs="Malgun Gothic" w:eastAsia="맑은 고딕"/>
-                <w:b/>
-                <w:sz w:val="22"/>
-              </w:rPr>
-              <w:t>제목에서 확인된 사업</w:t>
-            </w:r>
-          </w:p>
-        </w:tc>
-        <w:tc>
-          <w:tcPr>
-            <w:tcW w:type="dxa" w:w="6917"/>
-            <w:shd w:val="clear" w:color="auto" w:fill="FFFFFF"/>
-          </w:tcPr>
-          <w:p>
-            <w:pPr>
-              <w:spacing w:after="40"/>
-            </w:pPr>
-            <w:r>
-              <w:rPr>
-                <w:rFonts w:ascii="Malgun Gothic" w:hAnsi="Malgun Gothic" w:cs="Malgun Gothic" w:eastAsia="맑은 고딕"/>
-                <w:b w:val="0"/>
-                <w:sz w:val="22"/>
-              </w:rPr>
-              <w:t>(주)도연시스템즈 – NVH Korea Sangfor 보안 솔루션 제언</w:t>
-            </w:r>
-          </w:p>
-        </w:tc>
-      </w:tr>
-      <w:tr>
-        <w:tc>
-          <w:tcPr>
-            <w:tcW w:type="dxa" w:w="2381"/>
-            <w:shd w:val="clear" w:color="auto" w:fill="F4F6F8"/>
-          </w:tcPr>
-          <w:p>
-            <w:pPr>
-              <w:spacing w:after="40"/>
-            </w:pPr>
-            <w:r>
-              <w:rPr>
-                <w:rFonts w:ascii="Malgun Gothic" w:hAnsi="Malgun Gothic" w:cs="Malgun Gothic" w:eastAsia="맑은 고딕"/>
-                <w:b/>
-                <w:sz w:val="22"/>
-              </w:rPr>
-              <w:t>고객 측 요청자</w:t>
-            </w:r>
-          </w:p>
-        </w:tc>
-        <w:tc>
-          <w:tcPr>
-            <w:tcW w:type="dxa" w:w="6917"/>
-            <w:shd w:val="clear" w:color="auto" w:fill="FFFFFF"/>
-          </w:tcPr>
-          <w:p>
-            <w:pPr>
-              <w:spacing w:after="40"/>
-            </w:pPr>
-            <w:r>
-              <w:rPr>
-                <w:rFonts w:ascii="Malgun Gothic" w:hAnsi="Malgun Gothic" w:cs="Malgun Gothic" w:eastAsia="맑은 고딕"/>
-                <w:b w:val="0"/>
-                <w:sz w:val="22"/>
-              </w:rPr>
-              <w:t>(주)도연시스템즈 라성주 이사 (sjra@dysys.co.kr). 주소는 분류 패킷 기준</w:t>
-            </w:r>
-          </w:p>
-        </w:tc>
-      </w:tr>
-      <w:tr>
-        <w:tc>
-          <w:tcPr>
-            <w:tcW w:type="dxa" w:w="2381"/>
-            <w:shd w:val="clear" w:color="auto" w:fill="F4F6F8"/>
-          </w:tcPr>
-          <w:p>
-            <w:pPr>
-              <w:spacing w:after="40"/>
-            </w:pPr>
-            <w:r>
-              <w:rPr>
-                <w:rFonts w:ascii="Malgun Gothic" w:hAnsi="Malgun Gothic" w:cs="Malgun Gothic" w:eastAsia="맑은 고딕"/>
-                <w:b/>
-                <w:sz w:val="22"/>
-              </w:rPr>
-              <w:t>이 메일의 역할</w:t>
-            </w:r>
-          </w:p>
-        </w:tc>
-        <w:tc>
-          <w:tcPr>
-            <w:tcW w:type="dxa" w:w="6917"/>
-            <w:shd w:val="clear" w:color="auto" w:fill="FFFFFF"/>
-          </w:tcPr>
-          <w:p>
-            <w:pPr>
-              <w:spacing w:after="40"/>
-            </w:pPr>
-            <w:r>
-              <w:rPr>
-                <w:rFonts w:ascii="Malgun Gothic" w:hAnsi="Malgun Gothic" w:cs="Malgun Gothic" w:eastAsia="맑은 고딕"/>
-                <w:b w:val="0"/>
-                <w:sz w:val="22"/>
-              </w:rPr>
-              <w:t>파트너 담당자가 라성주 이사 메일을 전달하고 참조를 요청함</w:t>
-            </w:r>
-          </w:p>
-        </w:tc>
-      </w:tr>
-      <w:tr>
-        <w:tc>
-          <w:tcPr>
-            <w:tcW w:type="dxa" w:w="2381"/>
-            <w:shd w:val="clear" w:color="auto" w:fill="F4F6F8"/>
-          </w:tcPr>
-          <w:p>
-            <w:pPr>
-              <w:spacing w:after="40"/>
-            </w:pPr>
-            <w:r>
-              <w:rPr>
-                <w:rFonts w:ascii="Malgun Gothic" w:hAnsi="Malgun Gothic" w:cs="Malgun Gothic" w:eastAsia="맑은 고딕"/>
-                <w:b/>
-                <w:sz w:val="22"/>
-              </w:rPr>
-              <w:t>첨부</w:t>
-            </w:r>
-          </w:p>
-        </w:tc>
-        <w:tc>
-          <w:tcPr>
-            <w:tcW w:type="dxa" w:w="6917"/>
-            <w:shd w:val="clear" w:color="auto" w:fill="FFFFFF"/>
-          </w:tcPr>
-          <w:p>
-            <w:pPr>
-              <w:spacing w:after="40"/>
-            </w:pPr>
-            <w:r>
-              <w:rPr>
-                <w:rFonts w:ascii="Malgun Gothic" w:hAnsi="Malgun Gothic" w:cs="Malgun Gothic" w:eastAsia="맑은 고딕"/>
-                <w:b w:val="0"/>
-                <w:sz w:val="22"/>
-              </w:rPr>
-              <w:t>없음 (hasAttachments=false)</w:t>
-            </w:r>
-          </w:p>
-        </w:tc>
-      </w:tr>
-      <w:tr>
-        <w:tc>
-          <w:tcPr>
-            <w:tcW w:type="dxa" w:w="2381"/>
-            <w:shd w:val="clear" w:color="auto" w:fill="F4F6F8"/>
-          </w:tcPr>
-          <w:p>
-            <w:pPr>
-              <w:spacing w:after="40"/>
-            </w:pPr>
-            <w:r>
-              <w:rPr>
-                <w:rFonts w:ascii="Malgun Gothic" w:hAnsi="Malgun Gothic" w:cs="Malgun Gothic" w:eastAsia="맑은 고딕"/>
-                <w:b/>
-                <w:sz w:val="22"/>
-              </w:rPr>
-              <w:t>메시지</w:t>
-            </w:r>
-          </w:p>
-        </w:tc>
-        <w:tc>
-          <w:tcPr>
-            <w:tcW w:type="dxa" w:w="6917"/>
-            <w:shd w:val="clear" w:color="auto" w:fill="FFFFFF"/>
-          </w:tcPr>
-          <w:p>
-            <w:pPr>
-              <w:spacing w:after="40"/>
-            </w:pPr>
-            <w:r>
-              <w:rPr>
-                <w:rFonts w:ascii="Malgun Gothic" w:hAnsi="Malgun Gothic" w:cs="Malgun Gothic" w:eastAsia="맑은 고딕"/>
-                <w:b w:val="0"/>
-                <w:sz w:val="22"/>
-              </w:rPr>
-              <w:t>Graph messageId 끝자리 AADdvBJBAAA=</w:t>
-            </w:r>
-          </w:p>
-        </w:tc>
-      </w:tr>
-    </w:tbl>
-    <w:p>
-      <w:pPr>
-        <w:spacing w:after="40"/>
-      </w:pPr>
-    </w:p>
-    <w:p>
-      <w:pPr>
-        <w:spacing w:after="40" w:before="0" w:line="276" w:lineRule="auto"/>
-      </w:pPr>
-      <w:r>
-        <w:rPr>
-          <w:rFonts w:ascii="Malgun Gothic" w:hAnsi="Malgun Gothic" w:cs="Malgun Gothic" w:eastAsia="맑은 고딕"/>
-          <w:b/>
-          <w:sz w:val="22"/>
-        </w:rPr>
-        <w:t>전달 문장</w:t>
-      </w:r>
-    </w:p>
-    <w:p>
-      <w:pPr>
-        <w:spacing w:after="120" w:before="0" w:line="276" w:lineRule="auto"/>
-      </w:pPr>
-      <w:r>
-        <w:rPr>
-          <w:rFonts w:ascii="Malgun Gothic" w:hAnsi="Malgun Gothic" w:cs="Malgun Gothic" w:eastAsia="맑은 고딕"/>
-          <w:b w:val="0"/>
-          <w:sz w:val="22"/>
-        </w:rPr>
-        <w:t>「도연시스템즈 라성주이사 메일 전달드리오니 참조부탁드립니다.」</w:t>
+        <w:t>용도: 재민 내부 전달. 녹음 정리와 견적 트랙은 묶음. 드라이브 업로드·메일 발송·CRM 수정 없음.</w:t>
       </w:r>
     </w:p>
     <w:p>
@@ -406,12 +78,12 @@
           <w:b/>
           <w:sz w:val="22"/>
         </w:rPr>
-        <w:t>라성주 이사, 2026-09-23 13:40</w:t>
+        <w:t>검토 보완</w:t>
       </w:r>
     </w:p>
     <w:p>
       <w:pPr>
-        <w:spacing w:after="120" w:before="0" w:line="276" w:lineRule="auto"/>
+        <w:spacing w:after="80" w:before="0" w:line="276" w:lineRule="auto"/>
       </w:pPr>
       <w:r>
         <w:rPr>
@@ -419,149 +91,12 @@
           <w:b w:val="0"/>
           <w:sz w:val="22"/>
         </w:rPr>
-        <w:t>「상포내 VM뿐만 아니라, 외부 물리서버도 포함하여 랜썸웨어 대응하는 방안을 제안하려는 것입니다.」 원문 표기는 랜썸웨어다.</w:t>
+        <w:t>기안 초안을 제공된 메일 본문과 맞췄다. 첨부 폴더는 비어 있어 첨부 요지는 UNKNOWN이고, 아래는 본문만 반영했다. 본문에 없는 참조자 이름, 초안 삭제일의 특정 일자, 근거 없는 다른 파트너 상호는 넣지 않았다. 제목 대괄호의 상호는 고객면 문장에서 [파트너]로만 적고, 실명은 결정 절에만 둔다.</w:t>
       </w:r>
     </w:p>
     <w:p>
       <w:pPr>
-        <w:spacing w:after="40" w:before="0" w:line="276" w:lineRule="auto"/>
-      </w:pPr>
-      <w:r>
-        <w:rPr>
-          <w:rFonts w:ascii="Malgun Gothic" w:hAnsi="Malgun Gothic" w:cs="Malgun Gothic" w:eastAsia="맑은 고딕"/>
-          <w:b/>
-          <w:sz w:val="22"/>
-        </w:rPr>
-        <w:t>라성주 이사, 2026-09-23 12:36</w:t>
-      </w:r>
-    </w:p>
-    <w:p>
-      <w:pPr>
-        <w:spacing w:after="60" w:before="0" w:line="276" w:lineRule="auto"/>
-        <w:ind w:left="425" w:hanging="227"/>
-      </w:pPr>
-      <w:r>
-        <w:rPr>
-          <w:rFonts w:ascii="Malgun Gothic" w:hAnsi="Malgun Gothic" w:cs="Malgun Gothic" w:eastAsia="맑은 고딕"/>
-          <w:b w:val="0"/>
-          <w:sz w:val="22"/>
-        </w:rPr>
-        <w:t>·  내년 사업계획 때문에 랜섬웨어 관련 예산 작업을 우선한다.</w:t>
-      </w:r>
-    </w:p>
-    <w:p>
-      <w:pPr>
-        <w:spacing w:after="60" w:before="0" w:line="276" w:lineRule="auto"/>
-        <w:ind w:left="425" w:hanging="227"/>
-      </w:pPr>
-      <w:r>
-        <w:rPr>
-          <w:rFonts w:ascii="Malgun Gothic" w:hAnsi="Malgun Gothic" w:cs="Malgun Gothic" w:eastAsia="맑은 고딕"/>
-          <w:b w:val="0"/>
-          <w:sz w:val="22"/>
-        </w:rPr>
-        <w:t>·  상세 기술은 추석 이후 논의한다.</w:t>
-      </w:r>
-    </w:p>
-    <w:p>
-      <w:pPr>
-        <w:spacing w:after="60" w:before="0" w:line="276" w:lineRule="auto"/>
-        <w:ind w:left="425" w:hanging="227"/>
-      </w:pPr>
-      <w:r>
-        <w:rPr>
-          <w:rFonts w:ascii="Malgun Gothic" w:hAnsi="Malgun Gothic" w:cs="Malgun Gothic" w:eastAsia="맑은 고딕"/>
-          <w:b w:val="0"/>
-          <w:sz w:val="22"/>
-        </w:rPr>
-        <w:t>·  EPP, NDR, aSEC, CDP 견적을 요청한다. 필요 없는 항목도 견적은 주되, 빼야 하는 사유를 적는다.</w:t>
-      </w:r>
-    </w:p>
-    <w:p>
-      <w:pPr>
-        <w:spacing w:after="60" w:before="0" w:line="276" w:lineRule="auto"/>
-        <w:ind w:left="425" w:hanging="227"/>
-      </w:pPr>
-      <w:r>
-        <w:rPr>
-          <w:rFonts w:ascii="Malgun Gothic" w:hAnsi="Malgun Gothic" w:cs="Malgun Gothic" w:eastAsia="맑은 고딕"/>
-          <w:b w:val="0"/>
-          <w:sz w:val="22"/>
-        </w:rPr>
-        <w:t>·  EPP와 CDP는 서버 1대 기준 단가를 받고, 이후 대수에 곱한다.</w:t>
-      </w:r>
-    </w:p>
-    <w:p>
-      <w:pPr>
-        <w:spacing w:after="60" w:before="0" w:line="276" w:lineRule="auto"/>
-        <w:ind w:left="425" w:hanging="227"/>
-      </w:pPr>
-      <w:r>
-        <w:rPr>
-          <w:rFonts w:ascii="Malgun Gothic" w:hAnsi="Malgun Gothic" w:cs="Malgun Gothic" w:eastAsia="맑은 고딕"/>
-          <w:b w:val="0"/>
-          <w:sz w:val="22"/>
-        </w:rPr>
-        <w:t>·  CDP는 별도 스토리지 고려사항을 함께 본다.</w:t>
-      </w:r>
-    </w:p>
-    <w:p>
-      <w:pPr>
-        <w:spacing w:after="60" w:before="0" w:line="276" w:lineRule="auto"/>
-        <w:ind w:left="425" w:hanging="227"/>
-      </w:pPr>
-      <w:r>
-        <w:rPr>
-          <w:rFonts w:ascii="Malgun Gothic" w:hAnsi="Malgun Gothic" w:cs="Malgun Gothic" w:eastAsia="맑은 고딕"/>
-          <w:b w:val="0"/>
-          <w:sz w:val="22"/>
-        </w:rPr>
-        <w:t>·  설치·기술지원 비용에는 안정화 단계가 포함된다.</w:t>
-      </w:r>
-    </w:p>
-    <w:p>
-      <w:pPr>
-        <w:spacing w:after="60" w:before="0" w:line="276" w:lineRule="auto"/>
-        <w:ind w:left="425" w:hanging="227"/>
-      </w:pPr>
-      <w:r>
-        <w:rPr>
-          <w:rFonts w:ascii="Malgun Gothic" w:hAnsi="Malgun Gothic" w:cs="Malgun Gothic" w:eastAsia="맑은 고딕"/>
-          <w:b w:val="0"/>
-          <w:sz w:val="22"/>
-        </w:rPr>
-        <w:t>·  추가 장비·솔루션이 필요하면 함께 제안한다.</w:t>
-      </w:r>
-    </w:p>
-    <w:p>
-      <w:pPr>
-        <w:spacing w:after="40" w:before="120" w:line="276" w:lineRule="auto"/>
-      </w:pPr>
-      <w:r>
-        <w:rPr>
-          <w:rFonts w:ascii="Malgun Gothic" w:hAnsi="Malgun Gothic" w:cs="Malgun Gothic" w:eastAsia="맑은 고딕"/>
-          <w:b/>
-          <w:sz w:val="22"/>
-        </w:rPr>
-        <w:t>2026-09-17 제언은 이번 전달문에 요지로만 있다</w:t>
-      </w:r>
-    </w:p>
-    <w:p>
-      <w:pPr>
-        <w:spacing w:after="120" w:before="0" w:line="276" w:lineRule="auto"/>
-      </w:pPr>
-      <w:r>
-        <w:rPr>
-          <w:rFonts w:ascii="Malgun Gothic" w:hAnsi="Malgun Gothic" w:cs="Malgun Gothic" w:eastAsia="맑은 고딕"/>
-          <w:b w:val="0"/>
-          <w:sz w:val="22"/>
-        </w:rPr>
-        <w:t>NVH Korea가 Sangfor HCI와 SCP를 사용 중이라는 전제에서 aSEC와 EDR/EPP를 제언했고, NGFW·NDR·IAG·SDWAN·vAD·CDP를 언급했다. EPP·aSEC 표준자료를 첨부했다고 적혀 있으나, 그 문장은 이번 메일의 첨부 사실이 아니다. 9월 17일 메일의 수신 시각과 전문은 이 추출에 없다.</w:t>
-      </w:r>
-    </w:p>
-    <w:p>
-      <w:pPr>
-        <w:spacing w:before="280" w:after="120"/>
+        <w:spacing w:after="120" w:before="240" w:line="276" w:lineRule="auto"/>
         <w:pBdr>
           <w:bottom w:val="single" w:sz="8" w:space="1" w:color="1F2A37"/>
         </w:pBdr>
@@ -570,15 +105,14 @@
         <w:rPr>
           <w:rFonts w:ascii="Malgun Gothic" w:hAnsi="Malgun Gothic" w:cs="Malgun Gothic" w:eastAsia="맑은 고딕"/>
           <w:b/>
-          <w:color w:val="1F2A37"/>
           <w:sz w:val="26"/>
         </w:rPr>
-        <w:t>2. 첨부 요지</w:t>
+        <w:t>1. 원문 요약 (FACT)</w:t>
       </w:r>
     </w:p>
     <w:p>
       <w:pPr>
-        <w:spacing w:after="120" w:before="0" w:line="276" w:lineRule="auto"/>
+        <w:spacing w:after="80" w:before="0" w:line="276" w:lineRule="auto"/>
       </w:pPr>
       <w:r>
         <w:rPr>
@@ -586,12 +120,12 @@
           <w:b w:val="0"/>
           <w:sz w:val="22"/>
         </w:rPr>
-        <w:t>이 메일에는 첨부 파일이 없다. 첨부 요지로 인용할 문서가 없다.</w:t>
+        <w:t>수신: 2026-09-23 14:43:59 KST. 수신함 jm.park@blro.co.kr. 미읽음. 분류 패킷상 WORK / NEW. From: 양해광. CC 2명은 파트너 측이며 주소는 고객면 문서에 적지 않는다. hasAttachments=false.</w:t>
       </w:r>
     </w:p>
     <w:p>
       <w:pPr>
-        <w:spacing w:after="120" w:before="0" w:line="276" w:lineRule="auto"/>
+        <w:spacing w:after="80" w:before="0" w:line="276" w:lineRule="auto"/>
       </w:pPr>
       <w:r>
         <w:rPr>
@@ -599,12 +133,176 @@
           <w:b w:val="0"/>
           <w:sz w:val="22"/>
         </w:rPr>
-        <w:t>9월 17일 제언 쪽의 EPP·aSEC 표준자료는 이번 전달에 포함되지 않았다. 그 파일의 파일명, 위치, 보존 여부는 UNKNOWN이다.</w:t>
+        <w:t>제목(고객면 치환): Fw: RE: [파트너] (주)도연시스템즈 - NVH Korea Sangfor 보안 솔루션 제언관련. 원문 대괄호의 상호는 7절 실행 주체와 같다.</w:t>
       </w:r>
     </w:p>
     <w:p>
       <w:pPr>
-        <w:spacing w:before="280" w:after="120"/>
+        <w:spacing w:after="40" w:before="80" w:line="276" w:lineRule="auto"/>
+      </w:pPr>
+      <w:r>
+        <w:rPr>
+          <w:rFonts w:ascii="Malgun Gothic" w:hAnsi="Malgun Gothic" w:cs="Malgun Gothic" w:eastAsia="맑은 고딕"/>
+          <w:b/>
+          <w:sz w:val="22"/>
+        </w:rPr>
+        <w:t>본문에 있는 스레드</w:t>
+      </w:r>
+    </w:p>
+    <w:p>
+      <w:pPr>
+        <w:pStyle w:val="ListBullet"/>
+        <w:spacing w:after="60" w:line="276" w:lineRule="auto"/>
+      </w:pPr>
+      <w:r>
+        <w:rPr>
+          <w:rFonts w:ascii="Malgun Gothic" w:hAnsi="Malgun Gothic" w:cs="Malgun Gothic" w:eastAsia="맑은 고딕"/>
+          <w:b w:val="0"/>
+          <w:sz w:val="22"/>
+        </w:rPr>
+        <w:t>2026-09-17 제언 요지: NVH Korea가 Sangfor HCI+SCP를 쓰는 전제에서 aSEC(인프라)와 EDR/EPP(단말)를 제언. NGFW·NDR·IAG·SDWAN·vAD·CDP를 언급. EPP·aSEC 표준자료 첨부 언급. 이 문장은 요지이며, 이번 Fw의 첨부는 아니다. 시각 19:26과 전문은 제공 본문에 없다.</w:t>
+      </w:r>
+    </w:p>
+    <w:p>
+      <w:pPr>
+        <w:pStyle w:val="ListBullet"/>
+        <w:spacing w:after="60" w:line="276" w:lineRule="auto"/>
+      </w:pPr>
+      <w:r>
+        <w:rPr>
+          <w:rFonts w:ascii="Malgun Gothic" w:hAnsi="Malgun Gothic" w:cs="Malgun Gothic" w:eastAsia="맑은 고딕"/>
+          <w:b w:val="0"/>
+          <w:sz w:val="22"/>
+        </w:rPr>
+        <w:t>2026-09-23 12:36 라성주: 내년 사업계획이라 랜섬웨어 예산 작업을 우선하고, 상세 기술은 추석 이후. 견적 4항은 아래. 원문 표기는 랜썸웨어, 사업계획떄. 제공 본문에는 이 시각의 참조자 이름이 없다.</w:t>
+      </w:r>
+    </w:p>
+    <w:p>
+      <w:pPr>
+        <w:pStyle w:val="ListBullet"/>
+        <w:spacing w:after="60" w:line="276" w:lineRule="auto"/>
+      </w:pPr>
+      <w:r>
+        <w:rPr>
+          <w:rFonts w:ascii="Malgun Gothic" w:hAnsi="Malgun Gothic" w:cs="Malgun Gothic" w:eastAsia="맑은 고딕"/>
+          <w:b w:val="0"/>
+          <w:sz w:val="22"/>
+        </w:rPr>
+        <w:t>2026-09-23 13:40 라성주: 「상포내 VM뿐만 아니라, 외부 물리서버도 포함하여 랜썸웨어 대응하는 방안을 제안하려는 것입니다.」</w:t>
+      </w:r>
+    </w:p>
+    <w:p>
+      <w:pPr>
+        <w:pStyle w:val="ListBullet"/>
+        <w:spacing w:after="60" w:line="276" w:lineRule="auto"/>
+      </w:pPr>
+      <w:r>
+        <w:rPr>
+          <w:rFonts w:ascii="Malgun Gothic" w:hAnsi="Malgun Gothic" w:cs="Malgun Gothic" w:eastAsia="맑은 고딕"/>
+          <w:b w:val="0"/>
+          <w:sz w:val="22"/>
+        </w:rPr>
+        <w:t>2026-09-23 14:43 양해광 → 재민: 「도연시스템즈 라성주이사 메일 전달드리오니 참조부탁드립니다.」 그 외 지시 문장은 본문에 없다.</w:t>
+      </w:r>
+    </w:p>
+    <w:p>
+      <w:pPr>
+        <w:spacing w:after="40" w:before="80" w:line="276" w:lineRule="auto"/>
+      </w:pPr>
+      <w:r>
+        <w:rPr>
+          <w:rFonts w:ascii="Malgun Gothic" w:hAnsi="Malgun Gothic" w:cs="Malgun Gothic" w:eastAsia="맑은 고딕"/>
+          <w:b/>
+          <w:sz w:val="22"/>
+        </w:rPr>
+        <w:t>라성주 견적 요청 (본문)</w:t>
+      </w:r>
+    </w:p>
+    <w:p>
+      <w:pPr>
+        <w:spacing w:after="60" w:line="276" w:lineRule="auto"/>
+        <w:ind w:left="425" w:hanging="255"/>
+      </w:pPr>
+      <w:r>
+        <w:rPr>
+          <w:rFonts w:ascii="Malgun Gothic" w:hAnsi="Malgun Gothic" w:cs="Malgun Gothic" w:eastAsia="맑은 고딕"/>
+          <w:b w:val="0"/>
+          <w:sz w:val="22"/>
+        </w:rPr>
+        <w:t>1. EPP, NDR, aSEC, CDP 견적. 필요 없는 것도 견적은 주되, 빼야 하는 사유를 적는다.</w:t>
+      </w:r>
+    </w:p>
+    <w:p>
+      <w:pPr>
+        <w:spacing w:after="60" w:line="276" w:lineRule="auto"/>
+        <w:ind w:left="425" w:hanging="255"/>
+      </w:pPr>
+      <w:r>
+        <w:rPr>
+          <w:rFonts w:ascii="Malgun Gothic" w:hAnsi="Malgun Gothic" w:cs="Malgun Gothic" w:eastAsia="맑은 고딕"/>
+          <w:b w:val="0"/>
+          <w:sz w:val="22"/>
+        </w:rPr>
+        <w:t>2. EPP/CDP는 서버 1대 기준 단가 후 대수에 곱한다. CDP는 별도 스토리지 고려사항.</w:t>
+      </w:r>
+    </w:p>
+    <w:p>
+      <w:pPr>
+        <w:spacing w:after="60" w:line="276" w:lineRule="auto"/>
+        <w:ind w:left="425" w:hanging="255"/>
+      </w:pPr>
+      <w:r>
+        <w:rPr>
+          <w:rFonts w:ascii="Malgun Gothic" w:hAnsi="Malgun Gothic" w:cs="Malgun Gothic" w:eastAsia="맑은 고딕"/>
+          <w:b w:val="0"/>
+          <w:sz w:val="22"/>
+        </w:rPr>
+        <w:t>3. 설치·기술지원 비용. 안정화 포함.</w:t>
+      </w:r>
+    </w:p>
+    <w:p>
+      <w:pPr>
+        <w:spacing w:after="60" w:line="276" w:lineRule="auto"/>
+        <w:ind w:left="425" w:hanging="255"/>
+      </w:pPr>
+      <w:r>
+        <w:rPr>
+          <w:rFonts w:ascii="Malgun Gothic" w:hAnsi="Malgun Gothic" w:cs="Malgun Gothic" w:eastAsia="맑은 고딕"/>
+          <w:b w:val="0"/>
+          <w:sz w:val="22"/>
+        </w:rPr>
+        <w:t>4. 추가 장비·솔루션이 필요하면 함께.</w:t>
+      </w:r>
+    </w:p>
+    <w:p>
+      <w:pPr>
+        <w:spacing w:after="80" w:before="0" w:line="276" w:lineRule="auto"/>
+      </w:pPr>
+      <w:r>
+        <w:rPr>
+          <w:rFonts w:ascii="Malgun Gothic" w:hAnsi="Malgun Gothic" w:cs="Malgun Gothic" w:eastAsia="맑은 고딕"/>
+          <w:b w:val="0"/>
+          <w:sz w:val="22"/>
+        </w:rPr>
+        <w:t>범위: Sangfor(상포) 안 VM + 외부 물리서버. 분류 패킷의 고객 측 주소는 라성주 sjra@dysys.co.kr.</w:t>
+      </w:r>
+    </w:p>
+    <w:p>
+      <w:pPr>
+        <w:spacing w:after="80" w:before="80" w:line="276" w:lineRule="auto"/>
+      </w:pPr>
+      <w:r>
+        <w:rPr>
+          <w:rFonts w:ascii="Malgun Gothic" w:hAnsi="Malgun Gothic" w:cs="Malgun Gothic" w:eastAsia="맑은 고딕"/>
+          <w:b w:val="0"/>
+          <w:sz w:val="22"/>
+        </w:rPr>
+        <w:t>결정(DEC-20260923-mail2-advisor, 재민, 2026-09-23 15:01): 미팅 녹음 정리와 견적 트랙은 묶음. 견적 실행 주체는 넥시아스. (주)베를로는 어드바이저. (주)베를로의 견적 작성과 (주)도연시스템즈·NVH Korea 직송은 금지.</w:t>
+      </w:r>
+    </w:p>
+    <w:p>
+      <w:pPr>
+        <w:spacing w:after="120" w:before="240" w:line="276" w:lineRule="auto"/>
         <w:pBdr>
           <w:bottom w:val="single" w:sz="8" w:space="1" w:color="1F2A37"/>
         </w:pBdr>
@@ -613,15 +311,14 @@
         <w:rPr>
           <w:rFonts w:ascii="Malgun Gothic" w:hAnsi="Malgun Gothic" w:cs="Malgun Gothic" w:eastAsia="맑은 고딕"/>
           <w:b/>
-          <w:color w:val="1F2A37"/>
           <w:sz w:val="26"/>
         </w:rPr>
-        <w:t>3. 요구사항</w:t>
+        <w:t>2. 첨부 요지</w:t>
       </w:r>
     </w:p>
     <w:p>
       <w:pPr>
-        <w:spacing w:after="120" w:before="0" w:line="276" w:lineRule="auto"/>
+        <w:spacing w:after="80" w:before="0" w:line="276" w:lineRule="auto"/>
       </w:pPr>
       <w:r>
         <w:rPr>
@@ -629,13 +326,12 @@
           <w:b w:val="0"/>
           <w:sz w:val="22"/>
         </w:rPr>
-        <w:t>고객이 이번 메일에서 요구한 것은 아래 네 가지와 범위 한 줄이다. (주)베를로는 견적서가 아니다.</w:t>
+        <w:t>오늘의 Fw는 hasAttachments=false. 이 메일의 첨부 요지는 없다.</w:t>
       </w:r>
     </w:p>
     <w:p>
       <w:pPr>
-        <w:spacing w:after="60" w:before="0" w:line="276" w:lineRule="auto"/>
-        <w:ind w:left="425" w:hanging="227"/>
+        <w:spacing w:after="80" w:before="0" w:line="276" w:lineRule="auto"/>
       </w:pPr>
       <w:r>
         <w:rPr>
@@ -643,13 +339,12 @@
           <w:b w:val="0"/>
           <w:sz w:val="22"/>
         </w:rPr>
-        <w:t>·  품목: EPP, NDR, aSEC, CDP. 불필요 품목은 가격란을 비우지 말고, 제외 사유를 적는다.</w:t>
+        <w:t>로컬 첨부 폴더는 비어 있다. 파일 미도착. 첨부 실물 UNKNOWN.</w:t>
       </w:r>
     </w:p>
     <w:p>
       <w:pPr>
-        <w:spacing w:after="60" w:before="0" w:line="276" w:lineRule="auto"/>
-        <w:ind w:left="425" w:hanging="227"/>
+        <w:spacing w:after="80" w:before="0" w:line="276" w:lineRule="auto"/>
       </w:pPr>
       <w:r>
         <w:rPr>
@@ -657,81 +352,12 @@
           <w:b w:val="0"/>
           <w:sz w:val="22"/>
         </w:rPr>
-        <w:t>·  EPP·CDP: 서버 1대 단가. 대수를 곱하는 방식. 대수는 메일에 없다.</w:t>
+        <w:t>9월 17일 요지가 말한 EPP·aSEC 표준자료는 이번 Fw에 없다. 파일명·보존 위치 UNKNOWN. 이 문서는 그 파일을 반영하지 않았다.</w:t>
       </w:r>
     </w:p>
     <w:p>
       <w:pPr>
-        <w:spacing w:after="60" w:before="0" w:line="276" w:lineRule="auto"/>
-        <w:ind w:left="425" w:hanging="227"/>
-      </w:pPr>
-      <w:r>
-        <w:rPr>
-          <w:rFonts w:ascii="Malgun Gothic" w:hAnsi="Malgun Gothic" w:cs="Malgun Gothic" w:eastAsia="맑은 고딕"/>
-          <w:b w:val="0"/>
-          <w:sz w:val="22"/>
-        </w:rPr>
-        <w:t>·  CDP: 별도 스토리지가 필요한지와 고려사항.</w:t>
-      </w:r>
-    </w:p>
-    <w:p>
-      <w:pPr>
-        <w:spacing w:after="60" w:before="0" w:line="276" w:lineRule="auto"/>
-        <w:ind w:left="425" w:hanging="227"/>
-      </w:pPr>
-      <w:r>
-        <w:rPr>
-          <w:rFonts w:ascii="Malgun Gothic" w:hAnsi="Malgun Gothic" w:cs="Malgun Gothic" w:eastAsia="맑은 고딕"/>
-          <w:b w:val="0"/>
-          <w:sz w:val="22"/>
-        </w:rPr>
-        <w:t>·  기술지원: 설치와 안정화.</w:t>
-      </w:r>
-    </w:p>
-    <w:p>
-      <w:pPr>
-        <w:spacing w:after="60" w:before="0" w:line="276" w:lineRule="auto"/>
-        <w:ind w:left="425" w:hanging="227"/>
-      </w:pPr>
-      <w:r>
-        <w:rPr>
-          <w:rFonts w:ascii="Malgun Gothic" w:hAnsi="Malgun Gothic" w:cs="Malgun Gothic" w:eastAsia="맑은 고딕"/>
-          <w:b w:val="0"/>
-          <w:sz w:val="22"/>
-        </w:rPr>
-        <w:t>·  필요 시 추가 장비·솔루션.</w:t>
-      </w:r>
-    </w:p>
-    <w:p>
-      <w:pPr>
-        <w:spacing w:after="60" w:before="0" w:line="276" w:lineRule="auto"/>
-        <w:ind w:left="425" w:hanging="227"/>
-      </w:pPr>
-      <w:r>
-        <w:rPr>
-          <w:rFonts w:ascii="Malgun Gothic" w:hAnsi="Malgun Gothic" w:cs="Malgun Gothic" w:eastAsia="맑은 고딕"/>
-          <w:b w:val="0"/>
-          <w:sz w:val="22"/>
-        </w:rPr>
-        <w:t>·  범위: Sangfor(상포) 안의 VM과 외부 물리서버를 포함한 랜섬웨어 대응.</w:t>
-      </w:r>
-    </w:p>
-    <w:p>
-      <w:pPr>
-        <w:spacing w:after="120" w:before="80" w:line="276" w:lineRule="auto"/>
-      </w:pPr>
-      <w:r>
-        <w:rPr>
-          <w:rFonts w:ascii="Malgun Gothic" w:hAnsi="Malgun Gothic" w:cs="Malgun Gothic" w:eastAsia="맑은 고딕"/>
-          <w:b w:val="0"/>
-          <w:sz w:val="22"/>
-        </w:rPr>
-        <w:t>예산 목적과 기술 논의의 시점은 다르다. 예산은 내년 사업계획용으로 지금 필요하고, 상세 기술은 추석 이후다. 2026년 추석 당일은 9월 25일(금)이고 법정 연휴는 9월 24일부터 26일까지다. 이 날짜는 메일 문장이 아니라 달력이다.</w:t>
-      </w:r>
-    </w:p>
-    <w:p>
-      <w:pPr>
-        <w:spacing w:before="280" w:after="120"/>
+        <w:spacing w:after="120" w:before="240" w:line="276" w:lineRule="auto"/>
         <w:pBdr>
           <w:bottom w:val="single" w:sz="8" w:space="1" w:color="1F2A37"/>
         </w:pBdr>
@@ -740,16 +366,15 @@
         <w:rPr>
           <w:rFonts w:ascii="Malgun Gothic" w:hAnsi="Malgun Gothic" w:cs="Malgun Gothic" w:eastAsia="맑은 고딕"/>
           <w:b/>
-          <w:color w:val="1F2A37"/>
           <w:sz w:val="26"/>
         </w:rPr>
-        <w:t>4. 어드바이저 전달 포인트</w:t>
+        <w:t>3. 해석</w:t>
       </w:r>
     </w:p>
     <w:p>
       <w:pPr>
-        <w:spacing w:after="60" w:before="0" w:line="276" w:lineRule="auto"/>
-        <w:ind w:left="425" w:hanging="227"/>
+        <w:pStyle w:val="ListBullet"/>
+        <w:spacing w:after="60" w:line="276" w:lineRule="auto"/>
       </w:pPr>
       <w:r>
         <w:rPr>
@@ -757,13 +382,13 @@
           <w:b w:val="0"/>
           <w:sz w:val="22"/>
         </w:rPr>
-        <w:t>·  (주)베를로의 역할은 어드바이저다. 견적 작성, 단가 기입, 고객 직송은 이 결정의 범위 밖이다.</w:t>
+        <w:t>예산과 상세 기술은 고객 문장에서 이미 나뉘어 있다. 예산은 내년 사업계획용으로 지금 필요하고, 상세 기술은 추석 이후다. 달력상 추석 당일은 2026-09-25, 법정 연휴는 9월 24일부터 26일까지다. 이 날짜는 메일에 없다.</w:t>
       </w:r>
     </w:p>
     <w:p>
       <w:pPr>
-        <w:spacing w:after="60" w:before="0" w:line="276" w:lineRule="auto"/>
-        <w:ind w:left="425" w:hanging="227"/>
+        <w:pStyle w:val="ListBullet"/>
+        <w:spacing w:after="60" w:line="276" w:lineRule="auto"/>
       </w:pPr>
       <w:r>
         <w:rPr>
@@ -771,13 +396,13 @@
           <w:b w:val="0"/>
           <w:sz w:val="22"/>
         </w:rPr>
-        <w:t>·  미팅 녹음 정리와 견적 트랙은 한 줄로 묶여 있다. 녹음에 없는 대수·구성을 견적 전제로 올리지 않는다.</w:t>
+        <w:t>녹음 정리와 견적 트랙을 묶는 결정은, 상세 기술을 추석 이후로 미룬 고객 문장과 다른 축이다. 묶음은 (주)베를로 내부 작업 순서이고, 추석 이후는 고객이 말한 기술 논의 시점이다.</w:t>
       </w:r>
     </w:p>
     <w:p>
       <w:pPr>
-        <w:spacing w:after="60" w:before="0" w:line="276" w:lineRule="auto"/>
-        <w:ind w:left="425" w:hanging="227"/>
+        <w:pStyle w:val="ListBullet"/>
+        <w:spacing w:after="60" w:line="276" w:lineRule="auto"/>
       </w:pPr>
       <w:r>
         <w:rPr>
@@ -785,13 +410,13 @@
           <w:b w:val="0"/>
           <w:sz w:val="22"/>
         </w:rPr>
-        <w:t>·  녹음 파일의 내용, 서버 대수, VM과 물리서버의 구분 수량은 이 메일에 없다. UNKNOWN이다.</w:t>
+        <w:t>9월 17일 요지의 중심은 aSEC와 EDR/EPP다. 9월 23일 요청은 EPP·NDR·aSEC·CDP와 외부 물리서버다. EDR과 EPP가 같은 제품인지는 본문이 정하지 않는다.</w:t>
       </w:r>
     </w:p>
     <w:p>
       <w:pPr>
-        <w:spacing w:after="60" w:before="0" w:line="276" w:lineRule="auto"/>
-        <w:ind w:left="425" w:hanging="227"/>
+        <w:pStyle w:val="ListBullet"/>
+        <w:spacing w:after="60" w:line="276" w:lineRule="auto"/>
       </w:pPr>
       <w:r>
         <w:rPr>
@@ -799,13 +424,13 @@
           <w:b w:val="0"/>
           <w:sz w:val="22"/>
         </w:rPr>
-        <w:t>·  9월 17일 요지의 중심은 aSEC와 EDR/EPP다. 9월 23일 요청은 EPP·NDR·aSEC·CDP와 외부 물리서버로 넓어져 있다.</w:t>
+        <w:t>(주)베를로는 범위·질문·시점을 정리한다. 견적서 작성과 고객 회신은 실행 주체 일이다.</w:t>
       </w:r>
     </w:p>
     <w:p>
       <w:pPr>
-        <w:spacing w:after="60" w:before="0" w:line="276" w:lineRule="auto"/>
-        <w:ind w:left="425" w:hanging="227"/>
+        <w:pStyle w:val="ListBullet"/>
+        <w:spacing w:after="60" w:line="276" w:lineRule="auto"/>
       </w:pPr>
       <w:r>
         <w:rPr>
@@ -813,13 +438,13 @@
           <w:b w:val="0"/>
           <w:sz w:val="22"/>
         </w:rPr>
-        <w:t>·  EPP를 서버 1대 단가로 받는 요청이 곧 EPP의 과금 단위가 서버라는 뜻은 아니다. 단말 단위일 수 있다. NDR·aSEC·CDP도 단위가 다를 수 있다.</w:t>
+        <w:t>고객에게 나가는 문장에는 실행 주체 상호를 넣지 않는다. 이 파일은 내부 핸드오프다.</w:t>
       </w:r>
     </w:p>
     <w:p>
       <w:pPr>
-        <w:spacing w:after="60" w:before="0" w:line="276" w:lineRule="auto"/>
-        <w:ind w:left="425" w:hanging="227"/>
+        <w:pStyle w:val="ListBullet"/>
+        <w:spacing w:after="60" w:line="276" w:lineRule="auto"/>
       </w:pPr>
       <w:r>
         <w:rPr>
@@ -827,40 +452,12 @@
           <w:b w:val="0"/>
           <w:sz w:val="22"/>
         </w:rPr>
-        <w:t>·  청구와 견적을 받을 법인이 (주)도연시스템즈인지 NVH Korea인지는 메일만으로 닫히지 않는다.</w:t>
+        <w:t>삭제된 메일 초안(DEC-20260922-a16-drop-3)은 다시 쓰지 않는다. 오늘 14:43은 견적 요청이 붙은 NEW WORK라, 9월 18일 「참고용·회신 불필요」 후보와 같은 결정으로 닫지 않는다.</w:t>
       </w:r>
     </w:p>
     <w:p>
       <w:pPr>
-        <w:spacing w:after="60" w:before="0" w:line="276" w:lineRule="auto"/>
-        <w:ind w:left="425" w:hanging="227"/>
-      </w:pPr>
-      <w:r>
-        <w:rPr>
-          <w:rFonts w:ascii="Malgun Gothic" w:hAnsi="Malgun Gothic" w:cs="Malgun Gothic" w:eastAsia="맑은 고딕"/>
-          <w:b w:val="0"/>
-          <w:sz w:val="22"/>
-        </w:rPr>
-        <w:t>·  고객에게 보이는 문장에는 견적 실행 회사의 상호를 넣지 않는다. 실행 주체는 아래 결정 절에만 적는다.</w:t>
-      </w:r>
-    </w:p>
-    <w:p>
-      <w:pPr>
-        <w:spacing w:after="60" w:before="0" w:line="276" w:lineRule="auto"/>
-        <w:ind w:left="425" w:hanging="227"/>
-      </w:pPr>
-      <w:r>
-        <w:rPr>
-          <w:rFonts w:ascii="Malgun Gothic" w:hAnsi="Malgun Gothic" w:cs="Malgun Gothic" w:eastAsia="맑은 고딕"/>
-          <w:b w:val="0"/>
-          <w:sz w:val="22"/>
-        </w:rPr>
-        <w:t>·  이전에 만들다 삭제한 메일 초안은 이 문서의 근거가 아니다. 새 초안이 필요해도 재민 확인 전 발송은 없다.</w:t>
-      </w:r>
-    </w:p>
-    <w:p>
-      <w:pPr>
-        <w:spacing w:before="280" w:after="120"/>
+        <w:spacing w:after="120" w:before="240" w:line="276" w:lineRule="auto"/>
         <w:pBdr>
           <w:bottom w:val="single" w:sz="8" w:space="1" w:color="1F2A37"/>
         </w:pBdr>
@@ -869,15 +466,15 @@
         <w:rPr>
           <w:rFonts w:ascii="Malgun Gothic" w:hAnsi="Malgun Gothic" w:cs="Malgun Gothic" w:eastAsia="맑은 고딕"/>
           <w:b/>
-          <w:color w:val="1F2A37"/>
           <w:sz w:val="26"/>
         </w:rPr>
-        <w:t>5. 상대 확인 질문</w:t>
+        <w:t>4. UNKNOWN</w:t>
       </w:r>
     </w:p>
     <w:p>
       <w:pPr>
-        <w:spacing w:after="120" w:before="0" w:line="276" w:lineRule="auto"/>
+        <w:pStyle w:val="ListBullet"/>
+        <w:spacing w:after="60" w:line="276" w:lineRule="auto"/>
       </w:pPr>
       <w:r>
         <w:rPr>
@@ -885,13 +482,13 @@
           <w:b w:val="0"/>
           <w:sz w:val="22"/>
         </w:rPr>
-        <w:t>아래는 (주)도연시스템즈·NVH Korea 쪽에서 확인이 필요한 질문이다. 질문 목록이지 발송 문안이 아니다. 답변 전 견적 금액을 채우지 않는다.</w:t>
+        <w:t>NVH Korea 서버 대수(VM과 물리의 분리)와 기존 HCI 노드 규모.</w:t>
       </w:r>
     </w:p>
     <w:p>
       <w:pPr>
-        <w:spacing w:after="60" w:before="0" w:line="276" w:lineRule="auto"/>
-        <w:ind w:left="425" w:hanging="227"/>
+        <w:pStyle w:val="ListBullet"/>
+        <w:spacing w:after="60" w:line="276" w:lineRule="auto"/>
       </w:pPr>
       <w:r>
         <w:rPr>
@@ -899,13 +496,13 @@
           <w:b w:val="0"/>
           <w:sz w:val="22"/>
         </w:rPr>
-        <w:t>·  견적서의 수신 법인과 청구 법인은 (주)도연시스템즈인가, NVH Korea인가.</w:t>
+        <w:t>CDP 스토리지 용량·디스크 정책. 본문은 고려사항만 묻는다.</w:t>
       </w:r>
     </w:p>
     <w:p>
       <w:pPr>
-        <w:spacing w:after="60" w:before="0" w:line="276" w:lineRule="auto"/>
-        <w:ind w:left="425" w:hanging="227"/>
+        <w:pStyle w:val="ListBullet"/>
+        <w:spacing w:after="60" w:line="276" w:lineRule="auto"/>
       </w:pPr>
       <w:r>
         <w:rPr>
@@ -913,13 +510,13 @@
           <w:b w:val="0"/>
           <w:sz w:val="22"/>
         </w:rPr>
-        <w:t>·  Sangfor 안 VM 대수와 외부 물리서버 대수는 각각 몇 대인가.</w:t>
+        <w:t>9월 17일 EPP·aSEC 자료의 위치. 첨부 폴더는 비어 있다.</w:t>
       </w:r>
     </w:p>
     <w:p>
       <w:pPr>
-        <w:spacing w:after="60" w:before="0" w:line="276" w:lineRule="auto"/>
-        <w:ind w:left="425" w:hanging="227"/>
+        <w:pStyle w:val="ListBullet"/>
+        <w:spacing w:after="60" w:line="276" w:lineRule="auto"/>
       </w:pPr>
       <w:r>
         <w:rPr>
@@ -927,13 +524,13 @@
           <w:b w:val="0"/>
           <w:sz w:val="22"/>
         </w:rPr>
-        <w:t>·  EPP 수량의 단위는 서버인가, 단말인가.</w:t>
+        <w:t>미팅 녹음의 내용. 묶음 트랙의 재료이나 이 메일에는 없다.</w:t>
       </w:r>
     </w:p>
     <w:p>
       <w:pPr>
-        <w:spacing w:after="60" w:before="0" w:line="276" w:lineRule="auto"/>
-        <w:ind w:left="425" w:hanging="227"/>
+        <w:pStyle w:val="ListBullet"/>
+        <w:spacing w:after="60" w:line="276" w:lineRule="auto"/>
       </w:pPr>
       <w:r>
         <w:rPr>
@@ -941,13 +538,13 @@
           <w:b w:val="0"/>
           <w:sz w:val="22"/>
         </w:rPr>
-        <w:t>·  NDR과 aSEC의 수량 단위는 무엇인가.</w:t>
+        <w:t>청구·견적 수신 법인이 (주)도연시스템즈인지 NVH Korea인지.</w:t>
       </w:r>
     </w:p>
     <w:p>
       <w:pPr>
-        <w:spacing w:after="60" w:before="0" w:line="276" w:lineRule="auto"/>
-        <w:ind w:left="425" w:hanging="227"/>
+        <w:pStyle w:val="ListBullet"/>
+        <w:spacing w:after="60" w:line="276" w:lineRule="auto"/>
       </w:pPr>
       <w:r>
         <w:rPr>
@@ -955,13 +552,13 @@
           <w:b w:val="0"/>
           <w:sz w:val="22"/>
         </w:rPr>
-        <w:t>·  CDP에 별도 스토리지가 필요한가. 용량과 디스크 정책은 무엇인가.</w:t>
+        <w:t>EPP·NDR·aSEC·CDP 각각의 수량 단위. 서버 1대 단가 요청이 과금 단위의 확정은 아니다.</w:t>
       </w:r>
     </w:p>
     <w:p>
       <w:pPr>
-        <w:spacing w:after="60" w:before="0" w:line="276" w:lineRule="auto"/>
-        <w:ind w:left="425" w:hanging="227"/>
+        <w:pStyle w:val="ListBullet"/>
+        <w:spacing w:after="60" w:line="276" w:lineRule="auto"/>
       </w:pPr>
       <w:r>
         <w:rPr>
@@ -969,13 +566,13 @@
           <w:b w:val="0"/>
           <w:sz w:val="22"/>
         </w:rPr>
-        <w:t>·  네 품목 중 고객이 이미 제외하고 싶은 항목이 있는가.</w:t>
+        <w:t>CRM 페이지 존재. 이 작업에서 CRM에 쓰지 않는다.</w:t>
       </w:r>
     </w:p>
     <w:p>
       <w:pPr>
-        <w:spacing w:after="60" w:before="0" w:line="276" w:lineRule="auto"/>
-        <w:ind w:left="425" w:hanging="227"/>
+        <w:pStyle w:val="ListBullet"/>
+        <w:spacing w:after="60" w:line="276" w:lineRule="auto"/>
       </w:pPr>
       <w:r>
         <w:rPr>
@@ -983,13 +580,13 @@
           <w:b w:val="0"/>
           <w:sz w:val="22"/>
         </w:rPr>
-        <w:t>·  예산 숫자가 필요한 시점과, 상세 기술 논의를 추석 다음 평일 이후로 두어도 되는가.</w:t>
+        <w:t>과거 발주·성사 견적. 삭제된 초안과 녹음 보유는 별개 기록이다.</w:t>
       </w:r>
     </w:p>
     <w:p>
       <w:pPr>
-        <w:spacing w:after="60" w:before="0" w:line="276" w:lineRule="auto"/>
-        <w:ind w:left="425" w:hanging="227"/>
+        <w:pStyle w:val="ListBullet"/>
+        <w:spacing w:after="60" w:line="276" w:lineRule="auto"/>
       </w:pPr>
       <w:r>
         <w:rPr>
@@ -997,12 +594,12 @@
           <w:b w:val="0"/>
           <w:sz w:val="22"/>
         </w:rPr>
-        <w:t>·  기존 HCI·SCP와 이번 랜섬웨어 대응의 경계는 어디인가.</w:t>
+        <w:t>실행 주체의 SKU·정식 단가표. 이 문서에 금액을 적지 않았다.</w:t>
       </w:r>
     </w:p>
     <w:p>
       <w:pPr>
-        <w:spacing w:before="280" w:after="120"/>
+        <w:spacing w:after="120" w:before="240" w:line="276" w:lineRule="auto"/>
         <w:pBdr>
           <w:bottom w:val="single" w:sz="8" w:space="1" w:color="1F2A37"/>
         </w:pBdr>
@@ -1011,16 +608,15 @@
         <w:rPr>
           <w:rFonts w:ascii="Malgun Gothic" w:hAnsi="Malgun Gothic" w:cs="Malgun Gothic" w:eastAsia="맑은 고딕"/>
           <w:b/>
-          <w:color w:val="1F2A37"/>
           <w:sz w:val="26"/>
         </w:rPr>
-        <w:t>6. 발송 금지</w:t>
+        <w:t>5. 어드바이저 관점 전달 포인트</w:t>
       </w:r>
     </w:p>
     <w:p>
       <w:pPr>
-        <w:spacing w:after="60" w:before="0" w:line="276" w:lineRule="auto"/>
-        <w:ind w:left="425" w:hanging="227"/>
+        <w:pStyle w:val="ListBullet"/>
+        <w:spacing w:after="60" w:line="276" w:lineRule="auto"/>
       </w:pPr>
       <w:r>
         <w:rPr>
@@ -1028,13 +624,13 @@
           <w:b w:val="0"/>
           <w:sz w:val="22"/>
         </w:rPr>
-        <w:t>·  이 파일을 (주)도연시스템즈, NVH Korea, 그 밖 외부 수신자에게 보내지 않는다.</w:t>
+        <w:t>녹음 정리와 견적 질의는 한 트랙으로 진행한다. 녹음에 없는 대수·구성을 견적 전제로 올리지 않는다.</w:t>
       </w:r>
     </w:p>
     <w:p>
       <w:pPr>
-        <w:spacing w:after="60" w:before="0" w:line="276" w:lineRule="auto"/>
-        <w:ind w:left="425" w:hanging="227"/>
+        <w:pStyle w:val="ListBullet"/>
+        <w:spacing w:after="60" w:line="276" w:lineRule="auto"/>
       </w:pPr>
       <w:r>
         <w:rPr>
@@ -1042,13 +638,13 @@
           <w:b w:val="0"/>
           <w:sz w:val="22"/>
         </w:rPr>
-        <w:t>·  메일 회신, 전달, 읽음 처리를 하지 않는다.</w:t>
+        <w:t>상세 기술 논의는 고객 문장대로 추석 이후다. 오늘 필요한 정리 수준은 예산용 범위와 확인 질문이다.</w:t>
       </w:r>
     </w:p>
     <w:p>
       <w:pPr>
-        <w:spacing w:after="60" w:before="0" w:line="276" w:lineRule="auto"/>
-        <w:ind w:left="425" w:hanging="227"/>
+        <w:pStyle w:val="ListBullet"/>
+        <w:spacing w:after="60" w:line="276" w:lineRule="auto"/>
       </w:pPr>
       <w:r>
         <w:rPr>
@@ -1056,13 +652,13 @@
           <w:b w:val="0"/>
           <w:sz w:val="22"/>
         </w:rPr>
-        <w:t>·  (주)베를로는 견적을 작성하지 않고, (주)도연시스템즈와 NVH Korea에 직접 보내지 않는다.</w:t>
+        <w:t>품목은 EPP·NDR·aSEC·CDP, 설치와 안정화를 포함한 기술지원, 필요 시 추가 장비다. 불필요 품목은 빼기 전에 제외 사유가 필요하다.</w:t>
       </w:r>
     </w:p>
     <w:p>
       <w:pPr>
-        <w:spacing w:after="60" w:before="0" w:line="276" w:lineRule="auto"/>
-        <w:ind w:left="425" w:hanging="227"/>
+        <w:pStyle w:val="ListBullet"/>
+        <w:spacing w:after="60" w:line="276" w:lineRule="auto"/>
       </w:pPr>
       <w:r>
         <w:rPr>
@@ -1070,13 +666,13 @@
           <w:b w:val="0"/>
           <w:sz w:val="22"/>
         </w:rPr>
-        <w:t>·  CRM과 Notion에 쓰지 않는다.</w:t>
+        <w:t>EDR과 EPP의 제품명·SKU는 실행 주체가 가르기 전에는 고객면에 확정 명칭으로 쓰지 않는다.</w:t>
       </w:r>
     </w:p>
     <w:p>
       <w:pPr>
-        <w:spacing w:after="60" w:before="0" w:line="276" w:lineRule="auto"/>
-        <w:ind w:left="425" w:hanging="227"/>
+        <w:pStyle w:val="ListBullet"/>
+        <w:spacing w:after="60" w:line="276" w:lineRule="auto"/>
       </w:pPr>
       <w:r>
         <w:rPr>
@@ -1084,12 +680,40 @@
           <w:b w:val="0"/>
           <w:sz w:val="22"/>
         </w:rPr>
-        <w:t>·  단가, 대수, 스토리지 용량을 새로 만들지 않는다.</w:t>
+        <w:t>EPP/CDP의 「서버 1대 후 배수」는 고객 요청 형식이다. 대수는 UNKNOWN이라 이 문서에서 곱하지 않는다.</w:t>
       </w:r>
     </w:p>
     <w:p>
       <w:pPr>
-        <w:spacing w:before="280" w:after="120"/>
+        <w:pStyle w:val="ListBullet"/>
+        <w:spacing w:after="60" w:line="276" w:lineRule="auto"/>
+      </w:pPr>
+      <w:r>
+        <w:rPr>
+          <w:rFonts w:ascii="Malgun Gothic" w:hAnsi="Malgun Gothic" w:cs="Malgun Gothic" w:eastAsia="맑은 고딕"/>
+          <w:b w:val="0"/>
+          <w:sz w:val="22"/>
+        </w:rPr>
+        <w:t>범위에 외부 물리서버가 들어 있다. 라이선스·에이전트·설치가 VM과 같은지는 확인 전이다.</w:t>
+      </w:r>
+    </w:p>
+    <w:p>
+      <w:pPr>
+        <w:pStyle w:val="ListBullet"/>
+        <w:spacing w:after="60" w:line="276" w:lineRule="auto"/>
+      </w:pPr>
+      <w:r>
+        <w:rPr>
+          <w:rFonts w:ascii="Malgun Gothic" w:hAnsi="Malgun Gothic" w:cs="Malgun Gothic" w:eastAsia="맑은 고딕"/>
+          <w:b w:val="0"/>
+          <w:sz w:val="22"/>
+        </w:rPr>
+        <w:t>(주)베를로는 어드바이저다. 견적 작성과 (주)도연시스템즈·NVH Korea 직송은 하지 않는다.</w:t>
+      </w:r>
+    </w:p>
+    <w:p>
+      <w:pPr>
+        <w:spacing w:after="120" w:before="240" w:line="276" w:lineRule="auto"/>
         <w:pBdr>
           <w:bottom w:val="single" w:sz="8" w:space="1" w:color="1F2A37"/>
         </w:pBdr>
@@ -1098,10 +722,136 @@
         <w:rPr>
           <w:rFonts w:ascii="Malgun Gothic" w:hAnsi="Malgun Gothic" w:cs="Malgun Gothic" w:eastAsia="맑은 고딕"/>
           <w:b/>
-          <w:color w:val="1F2A37"/>
           <w:sz w:val="26"/>
         </w:rPr>
-        <w:t>7. 결정</w:t>
+        <w:t>6. 견적 실행 쪽에 넘길 질문</w:t>
+      </w:r>
+    </w:p>
+    <w:p>
+      <w:pPr>
+        <w:spacing w:after="80" w:before="0" w:line="276" w:lineRule="auto"/>
+      </w:pPr>
+      <w:r>
+        <w:rPr>
+          <w:rFonts w:ascii="Malgun Gothic" w:hAnsi="Malgun Gothic" w:cs="Malgun Gothic" w:eastAsia="맑은 고딕"/>
+          <w:b w:val="0"/>
+          <w:sz w:val="22"/>
+        </w:rPr>
+        <w:t>내부 핸드오프용이다. 수신 상대는 7절의 실행 주체다. 고객면 문구에는 그 상호를 넣지 않는다. 이 목록으로 메일을 보내지 않는다. 단가 숫자는 비워 둔다.</w:t>
+      </w:r>
+    </w:p>
+    <w:p>
+      <w:pPr>
+        <w:spacing w:after="60" w:line="276" w:lineRule="auto"/>
+        <w:ind w:left="425" w:hanging="255"/>
+      </w:pPr>
+      <w:r>
+        <w:rPr>
+          <w:rFonts w:ascii="Malgun Gothic" w:hAnsi="Malgun Gothic" w:cs="Malgun Gothic" w:eastAsia="맑은 고딕"/>
+          <w:b w:val="0"/>
+          <w:sz w:val="22"/>
+        </w:rPr>
+        <w:t>1. EPP, NDR, aSEC, CDP 각각의 정식 제품명·SKU·라이선스 유형(영구/구독)을 확정할 수 있는가.</w:t>
+      </w:r>
+    </w:p>
+    <w:p>
+      <w:pPr>
+        <w:spacing w:after="60" w:line="276" w:lineRule="auto"/>
+        <w:ind w:left="425" w:hanging="255"/>
+      </w:pPr>
+      <w:r>
+        <w:rPr>
+          <w:rFonts w:ascii="Malgun Gothic" w:hAnsi="Malgun Gothic" w:cs="Malgun Gothic" w:eastAsia="맑은 고딕"/>
+          <w:b w:val="0"/>
+          <w:sz w:val="22"/>
+        </w:rPr>
+        <w:t>2. EPP·CDP를 서버 1대 단가로 주는 규칙과, 그 단위가 단말·용량과 다를 때의 처리. CDP 별도 스토리지 필요 여부와 고려사항. 용량 숫자는 고객 확인 전 확정하지 않는다.</w:t>
+      </w:r>
+    </w:p>
+    <w:p>
+      <w:pPr>
+        <w:spacing w:after="60" w:line="276" w:lineRule="auto"/>
+        <w:ind w:left="425" w:hanging="255"/>
+      </w:pPr>
+      <w:r>
+        <w:rPr>
+          <w:rFonts w:ascii="Malgun Gothic" w:hAnsi="Malgun Gothic" w:cs="Malgun Gothic" w:eastAsia="맑은 고딕"/>
+          <w:b w:val="0"/>
+          <w:sz w:val="22"/>
+        </w:rPr>
+        <w:t>3. 설치와 안정화를 포함한 기술지원의 포함 범위. 비용 산정 기준만 묻고, 금액은 이 문서에 없다.</w:t>
+      </w:r>
+    </w:p>
+    <w:p>
+      <w:pPr>
+        <w:spacing w:after="60" w:line="276" w:lineRule="auto"/>
+        <w:ind w:left="425" w:hanging="255"/>
+      </w:pPr>
+      <w:r>
+        <w:rPr>
+          <w:rFonts w:ascii="Malgun Gothic" w:hAnsi="Malgun Gothic" w:cs="Malgun Gothic" w:eastAsia="맑은 고딕"/>
+          <w:b w:val="0"/>
+          <w:sz w:val="22"/>
+        </w:rPr>
+        <w:t>4. 상포 VM과 외부 물리서버를 함께 넣을 때 라이선스·에이전트·설치 범위가 어떻게 달라지는가.</w:t>
+      </w:r>
+    </w:p>
+    <w:p>
+      <w:pPr>
+        <w:spacing w:after="60" w:line="276" w:lineRule="auto"/>
+        <w:ind w:left="425" w:hanging="255"/>
+      </w:pPr>
+      <w:r>
+        <w:rPr>
+          <w:rFonts w:ascii="Malgun Gothic" w:hAnsi="Malgun Gothic" w:cs="Malgun Gothic" w:eastAsia="맑은 고딕"/>
+          <w:b w:val="0"/>
+          <w:sz w:val="22"/>
+        </w:rPr>
+        <w:t>5. 네 품목 중 예산안 단계에서 제외를 권하는 것이 있으면, 그 사유.</w:t>
+      </w:r>
+    </w:p>
+    <w:p>
+      <w:pPr>
+        <w:spacing w:after="60" w:line="276" w:lineRule="auto"/>
+        <w:ind w:left="425" w:hanging="255"/>
+      </w:pPr>
+      <w:r>
+        <w:rPr>
+          <w:rFonts w:ascii="Malgun Gothic" w:hAnsi="Malgun Gothic" w:cs="Malgun Gothic" w:eastAsia="맑은 고딕"/>
+          <w:b w:val="0"/>
+          <w:sz w:val="22"/>
+        </w:rPr>
+        <w:t>6. 추가 장비·솔루션이 있으면 이름만. 금액 없음.</w:t>
+      </w:r>
+    </w:p>
+    <w:p>
+      <w:pPr>
+        <w:spacing w:after="60" w:line="276" w:lineRule="auto"/>
+        <w:ind w:left="425" w:hanging="255"/>
+      </w:pPr>
+      <w:r>
+        <w:rPr>
+          <w:rFonts w:ascii="Malgun Gothic" w:hAnsi="Malgun Gothic" w:cs="Malgun Gothic" w:eastAsia="맑은 고딕"/>
+          <w:b w:val="0"/>
+          <w:sz w:val="22"/>
+        </w:rPr>
+        <w:t>7. 9월 17일 EPP·aSEC 표준자료 원본을 다시 줄 수 있는가. 현재 첨부 폴더는 비어 있다.</w:t>
+      </w:r>
+    </w:p>
+    <w:p>
+      <w:pPr>
+        <w:spacing w:after="120" w:before="240" w:line="276" w:lineRule="auto"/>
+        <w:pBdr>
+          <w:bottom w:val="single" w:sz="8" w:space="1" w:color="1F2A37"/>
+        </w:pBdr>
+      </w:pPr>
+      <w:r>
+        <w:rPr>
+          <w:rFonts w:ascii="Malgun Gothic" w:hAnsi="Malgun Gothic" w:cs="Malgun Gothic" w:eastAsia="맑은 고딕"/>
+          <w:b/>
+          <w:sz w:val="26"/>
+        </w:rPr>
+        <w:t>7. 재민 확인 전 발송 금지</w:t>
       </w:r>
     </w:p>
     <w:p>
@@ -1114,13 +864,12 @@
           <w:b/>
           <w:sz w:val="22"/>
         </w:rPr>
-        <w:t>DEC-20260923-mail2-advisor · 재민 · 2026-09-23 15:01</w:t>
+        <w:t>외부 발송·회신·견적 직송·CRM 쓰기 금지.</w:t>
       </w:r>
     </w:p>
     <w:p>
       <w:pPr>
-        <w:spacing w:after="60" w:before="0" w:line="276" w:lineRule="auto"/>
-        <w:ind w:left="425" w:hanging="227"/>
+        <w:spacing w:after="80" w:before="0" w:line="276" w:lineRule="auto"/>
       </w:pPr>
       <w:r>
         <w:rPr>
@@ -1128,54 +877,13 @@
           <w:b w:val="0"/>
           <w:sz w:val="22"/>
         </w:rPr>
-        <w:t>·  미팅 녹음 정리와 견적 트랙은 묶음이다.</w:t>
-      </w:r>
-    </w:p>
-    <w:p>
-      <w:pPr>
-        <w:spacing w:after="60" w:before="0" w:line="276" w:lineRule="auto"/>
-        <w:ind w:left="425" w:hanging="227"/>
-      </w:pPr>
-      <w:r>
-        <w:rPr>
-          <w:rFonts w:ascii="Malgun Gothic" w:hAnsi="Malgun Gothic" w:cs="Malgun Gothic" w:eastAsia="맑은 고딕"/>
-          <w:b w:val="0"/>
-          <w:sz w:val="22"/>
-        </w:rPr>
-        <w:t>·  견적 실행 주체는 넥시아스다. (주)베를로는 어드바이저다.</w:t>
-      </w:r>
-    </w:p>
-    <w:p>
-      <w:pPr>
-        <w:spacing w:after="60" w:before="0" w:line="276" w:lineRule="auto"/>
-        <w:ind w:left="425" w:hanging="227"/>
-      </w:pPr>
-      <w:r>
-        <w:rPr>
-          <w:rFonts w:ascii="Malgun Gothic" w:hAnsi="Malgun Gothic" w:cs="Malgun Gothic" w:eastAsia="맑은 고딕"/>
-          <w:b w:val="0"/>
-          <w:sz w:val="22"/>
-        </w:rPr>
-        <w:t>·  (주)베를로의 견적 작성과 (주)도연시스템즈·NVH Korea 직송은 금지다.</w:t>
-      </w:r>
-    </w:p>
-    <w:p>
-      <w:pPr>
-        <w:spacing w:after="120" w:before="80" w:line="276" w:lineRule="auto"/>
-      </w:pPr>
-      <w:r>
-        <w:rPr>
-          <w:rFonts w:ascii="Malgun Gothic" w:hAnsi="Malgun Gothic" w:cs="Malgun Gothic" w:eastAsia="맑은 고딕"/>
-          <w:b w:val="0"/>
-          <w:sz w:val="22"/>
-        </w:rPr>
-        <w:t>실행 주체 상호는 이 결정 절에만 둔다. 고객면 문안으로 복사하지 않는다.</w:t>
+        <w:t>이 파일은 내부 어드바이저 핸드오프다. (주)도연시스템즈와 NVH Korea로 견적이나 회신을 보내지 않는다. 견적 실행은 넥시아스에 있고, (주)베를로는 범위·질문·시점만 정리한다. 첨부 실물이 UNKNOWN인 동안 견적 금액을 확정하지 않는다.</w:t>
       </w:r>
     </w:p>
     <w:sectPr>
       <w:footerReference w:type="default" r:id="rId9"/>
       <w:pgSz w:w="11906" w:h="16838"/>
-      <w:pgMar w:top="1020" w:right="1134" w:bottom="1020" w:left="1134" w:header="720" w:footer="720" w:gutter="0"/>
+      <w:pgMar w:top="964" w:right="1077" w:bottom="964" w:left="1077" w:header="720" w:footer="720" w:gutter="0"/>
       <w:cols w:space="720"/>
       <w:docGrid w:linePitch="360"/>
     </w:sectPr>
@@ -1188,7 +896,6 @@
   <w:p>
     <w:pPr>
       <w:pStyle w:val="Footer"/>
-      <w:jc w:val="left"/>
     </w:pPr>
     <w:r>
       <w:rPr>
@@ -1197,7 +904,7 @@
         <w:color w:val="555F6D"/>
         <w:sz w:val="18"/>
       </w:rPr>
-      <w:t>내부 문서 · 외부 발송 금지 · DEC-20260923-mail2-advisor · 고객면 파트너 상호 금지</w:t>
+      <w:t>내부 전달 · 외부 발송 금지 · DEC-20260923-mail2-advisor · 고객면 파트너 상호 금지</w:t>
     </w:r>
   </w:p>
 </w:ftr>
@@ -1567,7 +1274,7 @@
     <w:qFormat/>
     <w:rsid w:val="00FC693F"/>
     <w:pPr>
-      <w:spacing w:after="120" w:before="0" w:line="276" w:lineRule="auto"/>
+      <w:spacing w:after="80" w:before="0" w:line="276" w:lineRule="auto"/>
     </w:pPr>
     <w:rPr>
       <w:rFonts w:ascii="Malgun Gothic" w:hAnsi="Malgun Gothic" w:cs="Malgun Gothic" w:eastAsia="맑은 고딕"/>
@@ -2101,8 +1808,14 @@
       <w:numPr>
         <w:numId w:val="1"/>
       </w:numPr>
+      <w:spacing w:after="80" w:before="0" w:line="276" w:lineRule="auto"/>
       <w:contextualSpacing/>
     </w:pPr>
+    <w:rPr>
+      <w:rFonts w:ascii="Malgun Gothic" w:hAnsi="Malgun Gothic" w:cs="Malgun Gothic" w:eastAsia="맑은 고딕"/>
+      <w:color w:val="1F2A37"/>
+      <w:sz w:val="22"/>
+    </w:rPr>
   </w:style>
   <w:style w:type="paragraph" w:styleId="ListBullet2">
     <w:name w:val="List Bullet 2"/>
@@ -2140,8 +1853,14 @@
       <w:numPr>
         <w:numId w:val="5"/>
       </w:numPr>
+      <w:spacing w:after="80" w:before="0" w:line="276" w:lineRule="auto"/>
       <w:contextualSpacing/>
     </w:pPr>
+    <w:rPr>
+      <w:rFonts w:ascii="Malgun Gothic" w:hAnsi="Malgun Gothic" w:cs="Malgun Gothic" w:eastAsia="맑은 고딕"/>
+      <w:color w:val="1F2A37"/>
+      <w:sz w:val="22"/>
+    </w:rPr>
   </w:style>
   <w:style w:type="paragraph" w:styleId="ListNumber2">
     <w:name w:val="List Number 2"/>

</xml_diff>

<commit_message>
docs: refresh advisor briefs with the secured attachment summaries
Record the EPP and aSEC decks, leave NDR and CDP without files, and give Seyeon structure plus split criteria without assigning features.

Co-authored-by: whelp99-code <whelp99-code@users.noreply.github.com>
</commit_message>
<xml_diff>
--- a/docs/ops/mail-analysis/20260923-doyeon-nvh-advisor.docx
+++ b/docs/ops/mail-analysis/20260923-doyeon-nvh-advisor.docx
@@ -52,7 +52,7 @@
           <w:b w:val="0"/>
           <w:sz w:val="22"/>
         </w:rPr>
-        <w:t>작성일: 2026-09-23 (KST) ｜ 의사결정: DEC-20260923-mail2-advisor ｜ 역할: (주)베를로=어드바이저, 견적 실행=결정 절의 매입 파트너</w:t>
+        <w:t>작성일: 2026-09-23 (KST) ｜ 의사결정: DEC-20260923-mail2-advisor ｜ 역할: (주)베를로=자문, 견적 실행=넥시아스</w:t>
       </w:r>
     </w:p>
     <w:p>
@@ -78,7 +78,7 @@
           <w:b/>
           <w:sz w:val="22"/>
         </w:rPr>
-        <w:t>검토 보완</w:t>
+        <w:t>첨부 반영</w:t>
       </w:r>
     </w:p>
     <w:p>
@@ -91,7 +91,7 @@
           <w:b w:val="0"/>
           <w:sz w:val="22"/>
         </w:rPr>
-        <w:t>기안 초안을 제공된 메일 본문과 맞췄다. 첨부 폴더는 비어 있어 첨부 요지는 UNKNOWN이고, 아래는 본문만 반영했다. 본문에 없는 참조자 이름, 초안 삭제일의 특정 일자, 근거 없는 다른 파트너 상호는 넣지 않았다. 제목 대괄호의 상호는 고객면 문장에서 [파트너]로만 적고, 실명은 결정 절에만 둔다.</w:t>
+        <w:t>9월 17일 자료 중 EPP 슬라이드와 aSEC 소개 PDF는 요약만 반영했다. PDF 본문은 다시 풀지 않았다. 요청 4종 가운데 NDR과 CDP는 첨부 파일이 없어 UNKNOWN이다. 제목 대괄호의 상호는 고객면 문장에서 [파트너]로만 적고, 실행 주체 실명은 이 내부 문서의 결정에만 둔다.</w:t>
       </w:r>
     </w:p>
     <w:p>
@@ -326,7 +326,20 @@
           <w:b w:val="0"/>
           <w:sz w:val="22"/>
         </w:rPr>
-        <w:t>오늘의 Fw는 hasAttachments=false. 이 메일의 첨부 요지는 없다.</w:t>
+        <w:t>2026-09-23 14:43 전달 메일 자체는 hasAttachments=false다. 아래 두 PDF는 9월 17일 제언 쪽 표준자료로 확보된 파일이다.</w:t>
+      </w:r>
+    </w:p>
+    <w:p>
+      <w:pPr>
+        <w:spacing w:after="40" w:before="80" w:line="276" w:lineRule="auto"/>
+      </w:pPr>
+      <w:r>
+        <w:rPr>
+          <w:rFonts w:ascii="Malgun Gothic" w:hAnsi="Malgun Gothic" w:cs="Malgun Gothic" w:eastAsia="맑은 고딕"/>
+          <w:b/>
+          <w:sz w:val="22"/>
+        </w:rPr>
+        <w:t>EPP</w:t>
       </w:r>
     </w:p>
     <w:p>
@@ -339,7 +352,20 @@
           <w:b w:val="0"/>
           <w:sz w:val="22"/>
         </w:rPr>
-        <w:t>로컬 첨부 폴더는 비어 있다. 파일 미도착. 첨부 실물 UNKNOWN.</w:t>
+        <w:t>파일: Athena+EPP+Main+Slide+0806.pdf. Athena EPP의 엔드포인트·랜섬웨어 포지셔닝 슬라이드이며 영문이다. 슬라이드 장수, SKU, 가격은 이 요약에 없다.</w:t>
+      </w:r>
+    </w:p>
+    <w:p>
+      <w:pPr>
+        <w:spacing w:after="40" w:before="80" w:line="276" w:lineRule="auto"/>
+      </w:pPr>
+      <w:r>
+        <w:rPr>
+          <w:rFonts w:ascii="Malgun Gothic" w:hAnsi="Malgun Gothic" w:cs="Malgun Gothic" w:eastAsia="맑은 고딕"/>
+          <w:b/>
+          <w:sz w:val="22"/>
+        </w:rPr>
+        <w:t>aSEC</w:t>
       </w:r>
     </w:p>
     <w:p>
@@ -352,7 +378,33 @@
           <w:b w:val="0"/>
           <w:sz w:val="22"/>
         </w:rPr>
-        <w:t>9월 17일 요지가 말한 EPP·aSEC 표준자료는 이번 Fw에 없다. 파일명·보존 위치 UNKNOWN. 이 문서는 그 파일을 반영하지 않았다.</w:t>
+        <w:t>파일: Sangfor+HCI+aSEC+Introduction+2025Q3.pdf. HCI 위 aSEC 소개다. 요약에 있는 범위 키워드는 인트라넷, 클라우드, 호스트, 플랫폼 보안, 랜섬웨어다. 구성도·라이선스 단위·가격은 이 요약에 없다.</w:t>
+      </w:r>
+    </w:p>
+    <w:p>
+      <w:pPr>
+        <w:spacing w:after="40" w:before="80" w:line="276" w:lineRule="auto"/>
+      </w:pPr>
+      <w:r>
+        <w:rPr>
+          <w:rFonts w:ascii="Malgun Gothic" w:hAnsi="Malgun Gothic" w:cs="Malgun Gothic" w:eastAsia="맑은 고딕"/>
+          <w:b/>
+          <w:sz w:val="22"/>
+        </w:rPr>
+        <w:t>NDR · CDP</w:t>
+      </w:r>
+    </w:p>
+    <w:p>
+      <w:pPr>
+        <w:spacing w:after="80" w:before="0" w:line="276" w:lineRule="auto"/>
+      </w:pPr>
+      <w:r>
+        <w:rPr>
+          <w:rFonts w:ascii="Malgun Gothic" w:hAnsi="Malgun Gothic" w:cs="Malgun Gothic" w:eastAsia="맑은 고딕"/>
+          <w:b w:val="0"/>
+          <w:sz w:val="22"/>
+        </w:rPr>
+        <w:t>요청 4종 중 첨부가 직접 덮는 것은 EPP와 aSEC다. NDR과 CDP는 메일 본문의 요청과 9월 17일 요지의 언급만 있고, 대응 첨부 파일이 없다. 두 품목의 제품 구성은 UNKNOWN이다.</w:t>
       </w:r>
     </w:p>
     <w:p>
@@ -410,7 +462,7 @@
           <w:b w:val="0"/>
           <w:sz w:val="22"/>
         </w:rPr>
-        <w:t>9월 17일 요지의 중심은 aSEC와 EDR/EPP다. 9월 23일 요청은 EPP·NDR·aSEC·CDP와 외부 물리서버다. EDR과 EPP가 같은 제품인지는 본문이 정하지 않는다.</w:t>
+        <w:t>9월 17일 요지의 중심은 aSEC와 EDR/EPP다. 확보된 EPP 자료는 엔드포인트·랜섬웨어 포지셔닝이고, aSEC 자료는 HCI 위 보안 소개다. 9월 23일 요청은 여기에 NDR·CDP와 외부 물리서버가 더해져 있다. EDR과 EPP가 같은 제품인지는 슬라이드 요약이 정하지 않는다.</w:t>
       </w:r>
     </w:p>
     <w:p>
@@ -424,7 +476,7 @@
           <w:b w:val="0"/>
           <w:sz w:val="22"/>
         </w:rPr>
-        <w:t>(주)베를로는 범위·질문·시점을 정리한다. 견적서 작성과 고객 회신은 실행 주체 일이다.</w:t>
+        <w:t>견적 실행은 넥시아스다. (주)베를로는 자문이다. 범위·질문·시점을 정리하고, 견적서 작성과 고객 회신은 하지 않는다.</w:t>
       </w:r>
     </w:p>
     <w:p>
@@ -496,7 +548,7 @@
           <w:b w:val="0"/>
           <w:sz w:val="22"/>
         </w:rPr>
-        <w:t>CDP 스토리지 용량·디스크 정책. 본문은 고려사항만 묻는다.</w:t>
+        <w:t>NDR 첨부 없음. 제품명·구성·과금 단위 UNKNOWN.</w:t>
       </w:r>
     </w:p>
     <w:p>
@@ -510,7 +562,21 @@
           <w:b w:val="0"/>
           <w:sz w:val="22"/>
         </w:rPr>
-        <w:t>9월 17일 EPP·aSEC 자료의 위치. 첨부 폴더는 비어 있다.</w:t>
+        <w:t>CDP 첨부 없음. 별도 스토리지 필요 여부, 용량, 디스크 정책 UNKNOWN. 본문은 고려사항만 묻는다.</w:t>
+      </w:r>
+    </w:p>
+    <w:p>
+      <w:pPr>
+        <w:pStyle w:val="ListBullet"/>
+        <w:spacing w:after="60" w:line="276" w:lineRule="auto"/>
+      </w:pPr>
+      <w:r>
+        <w:rPr>
+          <w:rFonts w:ascii="Malgun Gothic" w:hAnsi="Malgun Gothic" w:cs="Malgun Gothic" w:eastAsia="맑은 고딕"/>
+          <w:b w:val="0"/>
+          <w:sz w:val="22"/>
+        </w:rPr>
+        <w:t>EPP 슬라이드와 aSEC 소개 PDF의 장 구성·SKU·가격. 요약 밖의 내용은 적지 않았다.</w:t>
       </w:r>
     </w:p>
     <w:p>
@@ -666,7 +732,7 @@
           <w:b w:val="0"/>
           <w:sz w:val="22"/>
         </w:rPr>
-        <w:t>EDR과 EPP의 제품명·SKU는 실행 주체가 가르기 전에는 고객면에 확정 명칭으로 쓰지 않는다.</w:t>
+        <w:t>EPP 자료는 엔드포인트 포지셔닝이다. 고객은 EPP를 서버 1대 단가로 달라고 했다. 두 단위가 같은지는 자료가 말해주지 않는다. 고객면에는 확정 SKU를 쓰지 않는다.</w:t>
       </w:r>
     </w:p>
     <w:p>
@@ -680,7 +746,7 @@
           <w:b w:val="0"/>
           <w:sz w:val="22"/>
         </w:rPr>
-        <w:t>EPP/CDP의 「서버 1대 후 배수」는 고객 요청 형식이다. 대수는 UNKNOWN이라 이 문서에서 곱하지 않는다.</w:t>
+        <w:t>NDR·CDP는 자료 없이 견적 항목으로만 남아 있다. 첨부 없는 품목의 단가와 용량을 채우지 않는다.</w:t>
       </w:r>
     </w:p>
     <w:p>
@@ -708,7 +774,7 @@
           <w:b w:val="0"/>
           <w:sz w:val="22"/>
         </w:rPr>
-        <w:t>(주)베를로는 어드바이저다. 견적 작성과 (주)도연시스템즈·NVH Korea 직송은 하지 않는다.</w:t>
+        <w:t>(주)베를로는 자문만 한다. 견적 실행은 넥시아스다. (주)도연시스템즈·NVH Korea 직송은 하지 않는다. 고객면 문장에는 실행 주체 상호를 넣지 않는다.</w:t>
       </w:r>
     </w:p>
     <w:p>
@@ -835,7 +901,7 @@
           <w:b w:val="0"/>
           <w:sz w:val="22"/>
         </w:rPr>
-        <w:t>7. 9월 17일 EPP·aSEC 표준자료 원본을 다시 줄 수 있는가. 현재 첨부 폴더는 비어 있다.</w:t>
+        <w:t>7. EPP 슬라이드와 aSEC 소개 PDF는 요약 수준으로 있다. NDR과 CDP의 표준자료가 따로 있는가. 없으면 두 품목은 자료 없는 견적 요청으로 남긴다.</w:t>
       </w:r>
     </w:p>
     <w:p>
@@ -877,7 +943,7 @@
           <w:b w:val="0"/>
           <w:sz w:val="22"/>
         </w:rPr>
-        <w:t>이 파일은 내부 어드바이저 핸드오프다. (주)도연시스템즈와 NVH Korea로 견적이나 회신을 보내지 않는다. 견적 실행은 넥시아스에 있고, (주)베를로는 범위·질문·시점만 정리한다. 첨부 실물이 UNKNOWN인 동안 견적 금액을 확정하지 않는다.</w:t>
+        <w:t>이 파일은 내부 어드바이저 핸드오프다. (주)도연시스템즈와 NVH Korea로 견적이나 회신을 보내지 않는다. 견적 실행은 넥시아스에 있고, (주)베를로는 자문이다. EPP·aSEC는 요약만 있고 NDR·CDP는 첨부가 없다. 이 상태에서 견적 금액을 확정하지 않는다.</w:t>
       </w:r>
     </w:p>
     <w:sectPr>

</xml_diff>

<commit_message>
docs: commit the latest attachment-aware advisor Word drafts
Replace the two English-named briefs with the drafter copies that name the EPP and aSEC files and the HCI feature list.

Co-authored-by: whelp99-code <whelp99-code@users.noreply.github.com>
</commit_message>
<xml_diff>
--- a/docs/ops/mail-analysis/20260923-doyeon-nvh-advisor.docx
+++ b/docs/ops/mail-analysis/20260923-doyeon-nvh-advisor.docx
@@ -4,39 +4,38 @@
   <w:body>
     <w:p>
       <w:pPr>
-        <w:spacing w:after="40" w:before="0" w:line="276" w:lineRule="auto"/>
+        <w:spacing w:before="0" w:after="200" w:line="276" w:lineRule="auto"/>
       </w:pPr>
       <w:r>
         <w:rPr>
-          <w:rFonts w:ascii="Malgun Gothic" w:hAnsi="Malgun Gothic" w:cs="Malgun Gothic" w:eastAsia="맑은 고딕"/>
+          <w:rFonts w:ascii="맑은고딕" w:hAnsi="맑은고딕" w:eastAsia="맑은고딕" w:cs="맑은고딕"/>
           <w:b/>
           <w:sz w:val="22"/>
         </w:rPr>
-        <w:t>【재민 확인 전 발송·회신 금지】 DEC-20260923-mail2-advisor</w:t>
+        <w:t>【재민 확인 전 발송·회신·견적 직송 금지】 DEC-20260923-mail2-advisor</w:t>
       </w:r>
     </w:p>
     <w:p>
       <w:pPr>
-        <w:spacing w:after="40" w:before="40" w:line="276" w:lineRule="auto"/>
+        <w:spacing w:before="0" w:after="120" w:line="276" w:lineRule="auto"/>
       </w:pPr>
       <w:r>
         <w:rPr>
-          <w:rFonts w:ascii="Malgun Gothic" w:hAnsi="Malgun Gothic" w:cs="Malgun Gothic" w:eastAsia="맑은 고딕"/>
+          <w:rFonts w:ascii="맑은고딕" w:hAnsi="맑은고딕" w:eastAsia="맑은고딕" w:cs="맑은고딕"/>
           <w:b/>
-          <w:sz w:val="32"/>
+          <w:sz w:val="22"/>
         </w:rPr>
         <w:t>BLRO 어드바이저 핸드오프 — (주)도연시스템즈 / NVH Korea · Sangfor 보안</w:t>
       </w:r>
     </w:p>
     <w:p>
       <w:pPr>
-        <w:spacing w:after="20" w:before="0" w:line="276" w:lineRule="auto"/>
+        <w:spacing w:before="0" w:after="120" w:line="276" w:lineRule="auto"/>
       </w:pPr>
       <w:r>
         <w:rPr>
-          <w:rFonts w:ascii="Malgun Gothic" w:hAnsi="Malgun Gothic" w:cs="Malgun Gothic" w:eastAsia="맑은 고딕"/>
+          <w:rFonts w:ascii="맑은고딕" w:hAnsi="맑은고딕" w:eastAsia="맑은고딕" w:cs="맑은고딕"/>
           <w:b w:val="0"/>
-          <w:color w:val="555F6D"/>
           <w:sz w:val="22"/>
         </w:rPr>
         <w:t>문서번호: 20260923-분석전달-도연NVH-Sangfor보안-어드바이저</w:t>
@@ -44,936 +43,864 @@
     </w:p>
     <w:p>
       <w:pPr>
-        <w:spacing w:after="20" w:before="0" w:line="276" w:lineRule="auto"/>
+        <w:spacing w:before="0" w:after="120" w:line="276" w:lineRule="auto"/>
       </w:pPr>
       <w:r>
         <w:rPr>
-          <w:rFonts w:ascii="Malgun Gothic" w:hAnsi="Malgun Gothic" w:cs="Malgun Gothic" w:eastAsia="맑은 고딕"/>
+          <w:rFonts w:ascii="맑은고딕" w:hAnsi="맑은고딕" w:eastAsia="맑은고딕" w:cs="맑은고딕"/>
           <w:b w:val="0"/>
           <w:sz w:val="22"/>
         </w:rPr>
-        <w:t>작성일: 2026-09-23 (KST) ｜ 의사결정: DEC-20260923-mail2-advisor ｜ 역할: (주)베를로=자문, 견적 실행=넥시아스</w:t>
+        <w:t>작성일: 2026-09-23 (KST) ｜ 의사결정: DEC-20260923-mail2-advisor ｜ 역할: BLRO=어드바이저, 실행=매입 파트너</w:t>
       </w:r>
     </w:p>
     <w:p>
       <w:pPr>
-        <w:spacing w:after="120" w:before="0" w:line="276" w:lineRule="auto"/>
+        <w:spacing w:before="0" w:after="240" w:line="276" w:lineRule="auto"/>
       </w:pPr>
       <w:r>
         <w:rPr>
-          <w:rFonts w:ascii="Malgun Gothic" w:hAnsi="Malgun Gothic" w:cs="Malgun Gothic" w:eastAsia="맑은 고딕"/>
+          <w:rFonts w:ascii="맑은고딕" w:hAnsi="맑은고딕" w:eastAsia="맑은고딕" w:cs="맑은고딕"/>
           <w:b w:val="0"/>
           <w:sz w:val="22"/>
         </w:rPr>
-        <w:t>용도: 재민 내부 전달. 녹음 정리와 견적 트랙은 묶음. 드라이브 업로드·메일 발송·CRM 수정 없음.</w:t>
+        <w:t>용도: 재민 내부 전달 · 녹음정리+견적 트랙 묶음 참고용. Drive 업로드·메일 발송·CRM 수정 없음.</w:t>
       </w:r>
     </w:p>
     <w:p>
       <w:pPr>
-        <w:spacing w:after="40" w:before="0" w:line="276" w:lineRule="auto"/>
+        <w:spacing w:before="0" w:after="160" w:line="276" w:lineRule="auto"/>
       </w:pPr>
       <w:r>
         <w:rPr>
-          <w:rFonts w:ascii="Malgun Gothic" w:hAnsi="Malgun Gothic" w:cs="Malgun Gothic" w:eastAsia="맑은 고딕"/>
+          <w:rFonts w:ascii="맑은고딕" w:hAnsi="맑은고딕" w:eastAsia="맑은고딕" w:cs="맑은고딕"/>
           <w:b/>
           <w:sz w:val="22"/>
-        </w:rPr>
-        <w:t>첨부 반영</w:t>
-      </w:r>
-    </w:p>
-    <w:p>
-      <w:pPr>
-        <w:spacing w:after="80" w:before="0" w:line="276" w:lineRule="auto"/>
-      </w:pPr>
-      <w:r>
-        <w:rPr>
-          <w:rFonts w:ascii="Malgun Gothic" w:hAnsi="Malgun Gothic" w:cs="Malgun Gothic" w:eastAsia="맑은 고딕"/>
-          <w:b w:val="0"/>
-          <w:sz w:val="22"/>
-        </w:rPr>
-        <w:t>9월 17일 자료 중 EPP 슬라이드와 aSEC 소개 PDF는 요약만 반영했다. PDF 본문은 다시 풀지 않았다. 요청 4종 가운데 NDR과 CDP는 첨부 파일이 없어 UNKNOWN이다. 제목 대괄호의 상호는 고객면 문장에서 [파트너]로만 적고, 실행 주체 실명은 이 내부 문서의 결정에만 둔다.</w:t>
-      </w:r>
-    </w:p>
-    <w:p>
-      <w:pPr>
-        <w:spacing w:after="120" w:before="240" w:line="276" w:lineRule="auto"/>
-        <w:pBdr>
-          <w:bottom w:val="single" w:sz="8" w:space="1" w:color="1F2A37"/>
-        </w:pBdr>
-      </w:pPr>
-      <w:r>
-        <w:rPr>
-          <w:rFonts w:ascii="Malgun Gothic" w:hAnsi="Malgun Gothic" w:cs="Malgun Gothic" w:eastAsia="맑은 고딕"/>
-          <w:b/>
-          <w:sz w:val="26"/>
         </w:rPr>
         <w:t>1. 원문 요약 (FACT)</w:t>
       </w:r>
     </w:p>
     <w:p>
       <w:pPr>
-        <w:spacing w:after="80" w:before="0" w:line="276" w:lineRule="auto"/>
+        <w:spacing w:before="0" w:after="120" w:line="276" w:lineRule="auto"/>
       </w:pPr>
       <w:r>
         <w:rPr>
-          <w:rFonts w:ascii="Malgun Gothic" w:hAnsi="Malgun Gothic" w:cs="Malgun Gothic" w:eastAsia="맑은 고딕"/>
+          <w:rFonts w:ascii="맑은고딕" w:hAnsi="맑은고딕" w:eastAsia="맑은고딕" w:cs="맑은고딕"/>
           <w:b w:val="0"/>
           <w:sz w:val="22"/>
         </w:rPr>
-        <w:t>수신: 2026-09-23 14:43:59 KST. 수신함 jm.park@blro.co.kr. 미읽음. 분류 패킷상 WORK / NEW. From: 양해광. CC 2명은 파트너 측이며 주소는 고객면 문서에 적지 않는다. hasAttachments=false.</w:t>
+        <w:t>수신: 2026-09-23 14:43:59 KST ｜ From: 양해광 → jm.park@blro.co.kr (CC: 파트너 측 참조자) ｜ hasAttachments=false</w:t>
       </w:r>
     </w:p>
     <w:p>
       <w:pPr>
-        <w:spacing w:after="80" w:before="0" w:line="276" w:lineRule="auto"/>
+        <w:spacing w:before="0" w:after="120" w:line="276" w:lineRule="auto"/>
       </w:pPr>
       <w:r>
         <w:rPr>
-          <w:rFonts w:ascii="Malgun Gothic" w:hAnsi="Malgun Gothic" w:cs="Malgun Gothic" w:eastAsia="맑은 고딕"/>
+          <w:rFonts w:ascii="맑은고딕" w:hAnsi="맑은고딕" w:eastAsia="맑은고딕" w:cs="맑은고딕"/>
           <w:b w:val="0"/>
           <w:sz w:val="22"/>
         </w:rPr>
-        <w:t>제목(고객면 치환): Fw: RE: [파트너] (주)도연시스템즈 - NVH Korea Sangfor 보안 솔루션 제언관련. 원문 대괄호의 상호는 7절 실행 주체와 같다.</w:t>
+        <w:t>제목: Fw: RE: [파트너] (주)도연시스템즈 - NVH Korea Sangfor 보안 솔루션 제언관련</w:t>
       </w:r>
     </w:p>
     <w:p>
       <w:pPr>
-        <w:spacing w:after="40" w:before="80" w:line="276" w:lineRule="auto"/>
+        <w:spacing w:before="0" w:after="120" w:line="276" w:lineRule="auto"/>
       </w:pPr>
       <w:r>
         <w:rPr>
-          <w:rFonts w:ascii="Malgun Gothic" w:hAnsi="Malgun Gothic" w:cs="Malgun Gothic" w:eastAsia="맑은 고딕"/>
-          <w:b/>
+          <w:rFonts w:ascii="맑은고딕" w:hAnsi="맑은고딕" w:eastAsia="맑은고딕" w:cs="맑은고딕"/>
+          <w:b w:val="0"/>
           <w:sz w:val="22"/>
         </w:rPr>
-        <w:t>본문에 있는 스레드</w:t>
+        <w:t>스레드 구조:</w:t>
       </w:r>
     </w:p>
     <w:p>
       <w:pPr>
-        <w:pStyle w:val="ListBullet"/>
-        <w:spacing w:after="60" w:line="276" w:lineRule="auto"/>
+        <w:spacing w:before="0" w:after="80" w:line="276" w:lineRule="auto"/>
+        <w:ind w:left="240"/>
       </w:pPr>
       <w:r>
         <w:rPr>
-          <w:rFonts w:ascii="Malgun Gothic" w:hAnsi="Malgun Gothic" w:cs="Malgun Gothic" w:eastAsia="맑은 고딕"/>
+          <w:rFonts w:ascii="맑은고딕" w:hAnsi="맑은고딕" w:eastAsia="맑은고딕" w:cs="맑은고딕"/>
           <w:b w:val="0"/>
           <w:sz w:val="22"/>
         </w:rPr>
-        <w:t>2026-09-17 제언 요지: NVH Korea가 Sangfor HCI+SCP를 쓰는 전제에서 aSEC(인프라)와 EDR/EPP(단말)를 제언. NGFW·NDR·IAG·SDWAN·vAD·CDP를 언급. EPP·aSEC 표준자료 첨부 언급. 이 문장은 요지이며, 이번 Fw의 첨부는 아니다. 시각 19:26과 전문은 제공 본문에 없다.</w:t>
+        <w:t>· 2026-09-17: 양해광 → 라성주(sjra@dysys.co.kr) 등. NVH Korea가 Sangfor HCI+SCP 사용 중 → 보안확장으로 aSEC(인프라)+EDR/EPP(단말) 제언. NGFW·NDR·IAG·SDWAN·vAD·CDP/DR 등 Full Lineup 언급. EPP·aSEC 표준 제안자료 첨부 언급.</w:t>
       </w:r>
     </w:p>
     <w:p>
       <w:pPr>
-        <w:pStyle w:val="ListBullet"/>
-        <w:spacing w:after="60" w:line="276" w:lineRule="auto"/>
+        <w:spacing w:before="0" w:after="80" w:line="276" w:lineRule="auto"/>
+        <w:ind w:left="240"/>
       </w:pPr>
       <w:r>
         <w:rPr>
-          <w:rFonts w:ascii="Malgun Gothic" w:hAnsi="Malgun Gothic" w:cs="Malgun Gothic" w:eastAsia="맑은 고딕"/>
+          <w:rFonts w:ascii="맑은고딕" w:hAnsi="맑은고딕" w:eastAsia="맑은고딕" w:cs="맑은고딕"/>
           <w:b w:val="0"/>
           <w:sz w:val="22"/>
         </w:rPr>
-        <w:t>2026-09-23 12:36 라성주: 내년 사업계획이라 랜섬웨어 예산 작업을 우선하고, 상세 기술은 추석 이후. 견적 4항은 아래. 원문 표기는 랜썸웨어, 사업계획떄. 제공 본문에는 이 시각의 참조자 이름이 없다.</w:t>
+        <w:t>· 2026-09-23 12:36: 라성주 → 양해광 (CC 방성혁). 내년 사업계획으로 랜섬웨어 예산 우선, 상세 기술은 추석 이후. 견적 4항 요청(아래).</w:t>
       </w:r>
     </w:p>
     <w:p>
       <w:pPr>
-        <w:pStyle w:val="ListBullet"/>
-        <w:spacing w:after="60" w:line="276" w:lineRule="auto"/>
+        <w:spacing w:before="0" w:after="80" w:line="276" w:lineRule="auto"/>
+        <w:ind w:left="240"/>
       </w:pPr>
       <w:r>
         <w:rPr>
-          <w:rFonts w:ascii="Malgun Gothic" w:hAnsi="Malgun Gothic" w:cs="Malgun Gothic" w:eastAsia="맑은 고딕"/>
+          <w:rFonts w:ascii="맑은고딕" w:hAnsi="맑은고딕" w:eastAsia="맑은고딕" w:cs="맑은고딕"/>
           <w:b w:val="0"/>
           <w:sz w:val="22"/>
         </w:rPr>
-        <w:t>2026-09-23 13:40 라성주: 「상포내 VM뿐만 아니라, 외부 물리서버도 포함하여 랜썸웨어 대응하는 방안을 제안하려는 것입니다.」</w:t>
+        <w:t>· 2026-09-23 13:40: 라성주 추가. 범위 명확화 — 상포 내 VM뿐 아니라 외부 물리서버 포함 랜섬웨어 대응 방안.</w:t>
       </w:r>
     </w:p>
     <w:p>
       <w:pPr>
-        <w:pStyle w:val="ListBullet"/>
-        <w:spacing w:after="60" w:line="276" w:lineRule="auto"/>
+        <w:spacing w:before="0" w:after="80" w:line="276" w:lineRule="auto"/>
+        <w:ind w:left="240"/>
       </w:pPr>
       <w:r>
         <w:rPr>
-          <w:rFonts w:ascii="Malgun Gothic" w:hAnsi="Malgun Gothic" w:cs="Malgun Gothic" w:eastAsia="맑은 고딕"/>
+          <w:rFonts w:ascii="맑은고딕" w:hAnsi="맑은고딕" w:eastAsia="맑은고딕" w:cs="맑은고딕"/>
           <w:b w:val="0"/>
           <w:sz w:val="22"/>
         </w:rPr>
-        <w:t>2026-09-23 14:43 양해광 → 재민: 「도연시스템즈 라성주이사 메일 전달드리오니 참조부탁드립니다.」 그 외 지시 문장은 본문에 없다.</w:t>
+        <w:t>· 2026-09-23 14:43: 양해광 → 재민 Fw. 「라성주이사 메일 전달·참조」만. 별도 지시 없음.</w:t>
       </w:r>
     </w:p>
     <w:p>
       <w:pPr>
-        <w:spacing w:after="40" w:before="80" w:line="276" w:lineRule="auto"/>
+        <w:spacing w:before="0" w:after="120" w:line="276" w:lineRule="auto"/>
       </w:pPr>
       <w:r>
         <w:rPr>
-          <w:rFonts w:ascii="Malgun Gothic" w:hAnsi="Malgun Gothic" w:cs="Malgun Gothic" w:eastAsia="맑은 고딕"/>
-          <w:b/>
+          <w:rFonts w:ascii="맑은고딕" w:hAnsi="맑은고딕" w:eastAsia="맑은고딕" w:cs="맑은고딕"/>
+          <w:b w:val="0"/>
           <w:sz w:val="22"/>
         </w:rPr>
-        <w:t>라성주 견적 요청 (본문)</w:t>
+        <w:t>라성주 견적 요청 항목 (FACT):</w:t>
       </w:r>
     </w:p>
     <w:p>
       <w:pPr>
-        <w:spacing w:after="60" w:line="276" w:lineRule="auto"/>
-        <w:ind w:left="425" w:hanging="255"/>
+        <w:spacing w:before="0" w:after="80" w:line="276" w:lineRule="auto"/>
+        <w:ind w:left="240"/>
       </w:pPr>
       <w:r>
         <w:rPr>
-          <w:rFonts w:ascii="Malgun Gothic" w:hAnsi="Malgun Gothic" w:cs="Malgun Gothic" w:eastAsia="맑은 고딕"/>
+          <w:rFonts w:ascii="맑은고딕" w:hAnsi="맑은고딕" w:eastAsia="맑은고딕" w:cs="맑은고딕"/>
           <w:b w:val="0"/>
           <w:sz w:val="22"/>
         </w:rPr>
-        <w:t>1. EPP, NDR, aSEC, CDP 견적. 필요 없는 것도 견적은 주되, 빼야 하는 사유를 적는다.</w:t>
+        <w:t>· EPP, NDR, aSEC, CDP 견적 — 본인이 찾은 기준이라 불필요 품목도 견적은 주되, 빼야 할 사유 요청.</w:t>
       </w:r>
     </w:p>
     <w:p>
       <w:pPr>
-        <w:spacing w:after="60" w:line="276" w:lineRule="auto"/>
-        <w:ind w:left="425" w:hanging="255"/>
+        <w:spacing w:before="0" w:after="80" w:line="276" w:lineRule="auto"/>
+        <w:ind w:left="240"/>
       </w:pPr>
       <w:r>
         <w:rPr>
-          <w:rFonts w:ascii="Malgun Gothic" w:hAnsi="Malgun Gothic" w:cs="Malgun Gothic" w:eastAsia="맑은 고딕"/>
+          <w:rFonts w:ascii="맑은고딕" w:hAnsi="맑은고딕" w:eastAsia="맑은고딕" w:cs="맑은고딕"/>
           <w:b w:val="0"/>
           <w:sz w:val="22"/>
         </w:rPr>
-        <w:t>2. EPP/CDP는 서버 1대 기준 단가 후 대수에 곱한다. CDP는 별도 스토리지 고려사항.</w:t>
+        <w:t>· EPP/CDP 단가 — 서버 1대 기준 단가 → 이후 *n 적용. CDP는 별도 스토리지 필요 여부·고려사항.</w:t>
       </w:r>
     </w:p>
     <w:p>
       <w:pPr>
-        <w:spacing w:after="60" w:line="276" w:lineRule="auto"/>
-        <w:ind w:left="425" w:hanging="255"/>
+        <w:spacing w:before="0" w:after="80" w:line="276" w:lineRule="auto"/>
+        <w:ind w:left="240"/>
       </w:pPr>
       <w:r>
         <w:rPr>
-          <w:rFonts w:ascii="Malgun Gothic" w:hAnsi="Malgun Gothic" w:cs="Malgun Gothic" w:eastAsia="맑은 고딕"/>
+          <w:rFonts w:ascii="맑은고딕" w:hAnsi="맑은고딕" w:eastAsia="맑은고딕" w:cs="맑은고딕"/>
           <w:b w:val="0"/>
           <w:sz w:val="22"/>
         </w:rPr>
-        <w:t>3. 설치·기술지원 비용. 안정화 포함.</w:t>
+        <w:t>· 기술지원 비용 — 설치 + 안정화 단계 포함.</w:t>
       </w:r>
     </w:p>
     <w:p>
       <w:pPr>
-        <w:spacing w:after="60" w:line="276" w:lineRule="auto"/>
-        <w:ind w:left="425" w:hanging="255"/>
+        <w:spacing w:before="0" w:after="80" w:line="276" w:lineRule="auto"/>
+        <w:ind w:left="240"/>
       </w:pPr>
       <w:r>
         <w:rPr>
-          <w:rFonts w:ascii="Malgun Gothic" w:hAnsi="Malgun Gothic" w:cs="Malgun Gothic" w:eastAsia="맑은 고딕"/>
+          <w:rFonts w:ascii="맑은고딕" w:hAnsi="맑은고딕" w:eastAsia="맑은고딕" w:cs="맑은고딕"/>
           <w:b w:val="0"/>
           <w:sz w:val="22"/>
         </w:rPr>
-        <w:t>4. 추가 장비·솔루션이 필요하면 함께.</w:t>
+        <w:t>· 추가 장비·솔루션 — 필요 시 함께 제안.</w:t>
       </w:r>
     </w:p>
     <w:p>
       <w:pPr>
-        <w:spacing w:after="80" w:before="0" w:line="276" w:lineRule="auto"/>
+        <w:spacing w:before="0" w:after="120" w:line="276" w:lineRule="auto"/>
       </w:pPr>
       <w:r>
         <w:rPr>
-          <w:rFonts w:ascii="Malgun Gothic" w:hAnsi="Malgun Gothic" w:cs="Malgun Gothic" w:eastAsia="맑은 고딕"/>
+          <w:rFonts w:ascii="맑은고딕" w:hAnsi="맑은고딕" w:eastAsia="맑은고딕" w:cs="맑은고딕"/>
           <w:b w:val="0"/>
           <w:sz w:val="22"/>
         </w:rPr>
-        <w:t>범위: Sangfor(상포) 안 VM + 외부 물리서버. 분류 패킷의 고객 측 주소는 라성주 sjra@dysys.co.kr.</w:t>
+        <w:t>범위 보정: Sangfor VM + 외부 물리서버.</w:t>
       </w:r>
     </w:p>
     <w:p>
       <w:pPr>
-        <w:spacing w:after="80" w:before="80" w:line="276" w:lineRule="auto"/>
+        <w:spacing w:before="0" w:after="240" w:line="276" w:lineRule="auto"/>
       </w:pPr>
       <w:r>
         <w:rPr>
-          <w:rFonts w:ascii="Malgun Gothic" w:hAnsi="Malgun Gothic" w:cs="Malgun Gothic" w:eastAsia="맑은 고딕"/>
+          <w:rFonts w:ascii="맑은고딕" w:hAnsi="맑은고딕" w:eastAsia="맑은고딕" w:cs="맑은고딕"/>
           <w:b w:val="0"/>
           <w:sz w:val="22"/>
         </w:rPr>
-        <w:t>결정(DEC-20260923-mail2-advisor, 재민, 2026-09-23 15:01): 미팅 녹음 정리와 견적 트랙은 묶음. 견적 실행 주체는 넥시아스. (주)베를로는 어드바이저. (주)베를로의 견적 작성과 (주)도연시스템즈·NVH Korea 직송은 금지.</w:t>
+        <w:t>의사결정(DEC-20260923-mail2-advisor): 도연·NVH는 미팅 녹음정리 + 견적 트랙 묶음. 견적 실행은 매입 파트너. BLRO는 어드바이저만. BLRO가 고객 견적을 직접 작성하거나 (주)도연시스템즈/NVH Korea에 직송하는 것은 금지.</w:t>
       </w:r>
     </w:p>
     <w:p>
       <w:pPr>
-        <w:spacing w:after="120" w:before="240" w:line="276" w:lineRule="auto"/>
-        <w:pBdr>
-          <w:bottom w:val="single" w:sz="8" w:space="1" w:color="1F2A37"/>
-        </w:pBdr>
+        <w:spacing w:before="0" w:after="160" w:line="276" w:lineRule="auto"/>
       </w:pPr>
       <w:r>
         <w:rPr>
-          <w:rFonts w:ascii="Malgun Gothic" w:hAnsi="Malgun Gothic" w:cs="Malgun Gothic" w:eastAsia="맑은 고딕"/>
+          <w:rFonts w:ascii="맑은고딕" w:hAnsi="맑은고딕" w:eastAsia="맑은고딕" w:cs="맑은고딕"/>
           <w:b/>
-          <w:sz w:val="26"/>
+          <w:sz w:val="22"/>
         </w:rPr>
         <w:t>2. 첨부 요지</w:t>
       </w:r>
     </w:p>
     <w:p>
       <w:pPr>
-        <w:spacing w:after="80" w:before="0" w:line="276" w:lineRule="auto"/>
+        <w:spacing w:before="0" w:after="120" w:line="276" w:lineRule="auto"/>
       </w:pPr>
       <w:r>
         <w:rPr>
-          <w:rFonts w:ascii="Malgun Gothic" w:hAnsi="Malgun Gothic" w:cs="Malgun Gothic" w:eastAsia="맑은 고딕"/>
+          <w:rFonts w:ascii="맑은고딕" w:hAnsi="맑은고딕" w:eastAsia="맑은고딕" w:cs="맑은고딕"/>
           <w:b w:val="0"/>
           <w:sz w:val="22"/>
         </w:rPr>
-        <w:t>2026-09-23 14:43 전달 메일 자체는 hasAttachments=false다. 아래 두 PDF는 9월 17일 제언 쪽 표준자료로 확보된 파일이다.</w:t>
+        <w:t>오늘의 Fw(hasAttachments=false): 메일 자체에는 첨부 없음. 다만 로컬 attach-doyeon/에 9/17 제언 계열 표준자료 2건이 보존되어 확인했습니다.</w:t>
       </w:r>
     </w:p>
     <w:p>
       <w:pPr>
-        <w:spacing w:after="40" w:before="80" w:line="276" w:lineRule="auto"/>
+        <w:spacing w:before="0" w:after="120" w:line="276" w:lineRule="auto"/>
       </w:pPr>
       <w:r>
         <w:rPr>
-          <w:rFonts w:ascii="Malgun Gothic" w:hAnsi="Malgun Gothic" w:cs="Malgun Gothic" w:eastAsia="맑은 고딕"/>
-          <w:b/>
+          <w:rFonts w:ascii="맑은고딕" w:hAnsi="맑은고딕" w:eastAsia="맑은고딕" w:cs="맑은고딕"/>
+          <w:b w:val="0"/>
           <w:sz w:val="22"/>
         </w:rPr>
-        <w:t>EPP</w:t>
+        <w:t>확인된 첨부 (FACT):</w:t>
       </w:r>
     </w:p>
     <w:p>
       <w:pPr>
-        <w:spacing w:after="80" w:before="0" w:line="276" w:lineRule="auto"/>
+        <w:spacing w:before="0" w:after="80" w:line="276" w:lineRule="auto"/>
+        <w:ind w:left="240"/>
       </w:pPr>
       <w:r>
         <w:rPr>
-          <w:rFonts w:ascii="Malgun Gothic" w:hAnsi="Malgun Gothic" w:cs="Malgun Gothic" w:eastAsia="맑은 고딕"/>
+          <w:rFonts w:ascii="맑은고딕" w:hAnsi="맑은고딕" w:eastAsia="맑은고딕" w:cs="맑은고딕"/>
           <w:b w:val="0"/>
           <w:sz w:val="22"/>
         </w:rPr>
-        <w:t>파일: Athena+EPP+Main+Slide+0806.pdf. Athena EPP의 엔드포인트·랜섬웨어 포지셔닝 슬라이드이며 영문이다. 슬라이드 장수, SKU, 가격은 이 요약에 없다.</w:t>
+        <w:t>· Athena+EPP+Main+Slide+0806.pdf — Athena EPP 엔드포인트·랜섬웨어 포지셔닝 덱(영문). Pre-caution 슬라이드에 시장 포지셔닝·핵심 역량 정리.</w:t>
       </w:r>
     </w:p>
     <w:p>
       <w:pPr>
-        <w:spacing w:after="40" w:before="80" w:line="276" w:lineRule="auto"/>
+        <w:spacing w:before="0" w:after="80" w:line="276" w:lineRule="auto"/>
+        <w:ind w:left="240"/>
       </w:pPr>
       <w:r>
         <w:rPr>
-          <w:rFonts w:ascii="Malgun Gothic" w:hAnsi="Malgun Gothic" w:cs="Malgun Gothic" w:eastAsia="맑은 고딕"/>
-          <w:b/>
+          <w:rFonts w:ascii="맑은고딕" w:hAnsi="맑은고딕" w:eastAsia="맑은고딕" w:cs="맑은고딕"/>
+          <w:b w:val="0"/>
           <w:sz w:val="22"/>
         </w:rPr>
-        <w:t>aSEC</w:t>
+        <w:t>· Sangfor+HCI+aSEC+Introduction+2025Q3.pdf — HCI 상 aSEC 소개(인트라넷·호스트·클라우드·플랫폼 보안, 랜섬웨어).</w:t>
       </w:r>
     </w:p>
     <w:p>
       <w:pPr>
-        <w:spacing w:after="80" w:before="0" w:line="276" w:lineRule="auto"/>
+        <w:spacing w:before="0" w:after="120" w:line="276" w:lineRule="auto"/>
       </w:pPr>
       <w:r>
         <w:rPr>
-          <w:rFonts w:ascii="Malgun Gothic" w:hAnsi="Malgun Gothic" w:cs="Malgun Gothic" w:eastAsia="맑은 고딕"/>
-          <w:b w:val="0"/>
+          <w:rFonts w:ascii="맑은고딕" w:hAnsi="맑은고딕" w:eastAsia="맑은고딕" w:cs="맑은고딕"/>
+          <w:b/>
           <w:sz w:val="22"/>
         </w:rPr>
-        <w:t>파일: Sangfor+HCI+aSEC+Introduction+2025Q3.pdf. HCI 위 aSEC 소개다. 요약에 있는 범위 키워드는 인트라넷, 클라우드, 호스트, 플랫폼 보안, 랜섬웨어다. 구성도·라이선스 단위·가격은 이 요약에 없다.</w:t>
+        <w:t>커버리지: EPP·aSEC 덱은 존재. 메일 요청 4종(EPP·NDR·aSEC·CDP) 중 NDR·CDP 첨부는 없음 → UNKNOWN.</w:t>
       </w:r>
     </w:p>
     <w:p>
       <w:pPr>
-        <w:spacing w:after="40" w:before="80" w:line="276" w:lineRule="auto"/>
+        <w:spacing w:before="0" w:after="240" w:line="276" w:lineRule="auto"/>
       </w:pPr>
       <w:r>
         <w:rPr>
-          <w:rFonts w:ascii="Malgun Gothic" w:hAnsi="Malgun Gothic" w:cs="Malgun Gothic" w:eastAsia="맑은 고딕"/>
-          <w:b/>
+          <w:rFonts w:ascii="맑은고딕" w:hAnsi="맑은고딕" w:eastAsia="맑은고딕" w:cs="맑은고딕"/>
+          <w:b w:val="0"/>
           <w:sz w:val="22"/>
         </w:rPr>
-        <w:t>NDR · CDP</w:t>
+        <w:t>본문 요청은 여전히 EPP·NDR·aSEC·CDP(+서버 1대 단가, CDP 스토리지, 설치·안정화, 추가장비)이며, 범위는 VM+외부 물리서버, 예산 우선·상세는 추석 이후입니다.</w:t>
       </w:r>
     </w:p>
     <w:p>
       <w:pPr>
-        <w:spacing w:after="80" w:before="0" w:line="276" w:lineRule="auto"/>
+        <w:spacing w:before="0" w:after="160" w:line="276" w:lineRule="auto"/>
       </w:pPr>
       <w:r>
         <w:rPr>
-          <w:rFonts w:ascii="Malgun Gothic" w:hAnsi="Malgun Gothic" w:cs="Malgun Gothic" w:eastAsia="맑은 고딕"/>
-          <w:b w:val="0"/>
+          <w:rFonts w:ascii="맑은고딕" w:hAnsi="맑은고딕" w:eastAsia="맑은고딕" w:cs="맑은고딕"/>
+          <w:b/>
           <w:sz w:val="22"/>
-        </w:rPr>
-        <w:t>요청 4종 중 첨부가 직접 덮는 것은 EPP와 aSEC다. NDR과 CDP는 메일 본문의 요청과 9월 17일 요지의 언급만 있고, 대응 첨부 파일이 없다. 두 품목의 제품 구성은 UNKNOWN이다.</w:t>
-      </w:r>
-    </w:p>
-    <w:p>
-      <w:pPr>
-        <w:spacing w:after="120" w:before="240" w:line="276" w:lineRule="auto"/>
-        <w:pBdr>
-          <w:bottom w:val="single" w:sz="8" w:space="1" w:color="1F2A37"/>
-        </w:pBdr>
-      </w:pPr>
-      <w:r>
-        <w:rPr>
-          <w:rFonts w:ascii="Malgun Gothic" w:hAnsi="Malgun Gothic" w:cs="Malgun Gothic" w:eastAsia="맑은 고딕"/>
-          <w:b/>
-          <w:sz w:val="26"/>
         </w:rPr>
         <w:t>3. 해석</w:t>
       </w:r>
     </w:p>
     <w:p>
       <w:pPr>
-        <w:pStyle w:val="ListBullet"/>
-        <w:spacing w:after="60" w:line="276" w:lineRule="auto"/>
+        <w:spacing w:before="0" w:after="80" w:line="276" w:lineRule="auto"/>
+        <w:ind w:left="240"/>
       </w:pPr>
       <w:r>
         <w:rPr>
-          <w:rFonts w:ascii="Malgun Gothic" w:hAnsi="Malgun Gothic" w:cs="Malgun Gothic" w:eastAsia="맑은 고딕"/>
+          <w:rFonts w:ascii="맑은고딕" w:hAnsi="맑은고딕" w:eastAsia="맑은고딕" w:cs="맑은고딕"/>
           <w:b w:val="0"/>
           <w:sz w:val="22"/>
         </w:rPr>
-        <w:t>예산과 상세 기술은 고객 문장에서 이미 나뉘어 있다. 예산은 내년 사업계획용으로 지금 필요하고, 상세 기술은 추석 이후다. 달력상 추석 당일은 2026-09-25, 법정 연휴는 9월 24일부터 26일까지다. 이 날짜는 메일에 없다.</w:t>
+        <w:t>· 고객((주)도연시스템즈 → NVH Korea) 타이밍: 예산안용 견적 우선. PoC·상세 기술 논의는 추석 이후.</w:t>
       </w:r>
     </w:p>
     <w:p>
       <w:pPr>
-        <w:pStyle w:val="ListBullet"/>
-        <w:spacing w:after="60" w:line="276" w:lineRule="auto"/>
+        <w:spacing w:before="0" w:after="80" w:line="276" w:lineRule="auto"/>
+        <w:ind w:left="240"/>
       </w:pPr>
       <w:r>
         <w:rPr>
-          <w:rFonts w:ascii="Malgun Gothic" w:hAnsi="Malgun Gothic" w:cs="Malgun Gothic" w:eastAsia="맑은 고딕"/>
+          <w:rFonts w:ascii="맑은고딕" w:hAnsi="맑은고딕" w:eastAsia="맑은고딕" w:cs="맑은고딕"/>
           <w:b w:val="0"/>
           <w:sz w:val="22"/>
         </w:rPr>
-        <w:t>녹음 정리와 견적 트랙을 묶는 결정은, 상세 기술을 추석 이후로 미룬 고객 문장과 다른 축이다. 묶음은 (주)베를로 내부 작업 순서이고, 추석 이후는 고객이 말한 기술 논의 시점이다.</w:t>
+        <w:t>· 최초 제언은 aSEC+EDR 중심이었으나, 라성주 회신은 EPP·NDR·aSEC·CDP로 확장. EDR vs EPP 용어 혼용 → 견적 전 제품명·SKU 정리 선행.</w:t>
       </w:r>
     </w:p>
     <w:p>
       <w:pPr>
-        <w:pStyle w:val="ListBullet"/>
-        <w:spacing w:after="60" w:line="276" w:lineRule="auto"/>
+        <w:spacing w:before="0" w:after="80" w:line="276" w:lineRule="auto"/>
+        <w:ind w:left="240"/>
       </w:pPr>
       <w:r>
         <w:rPr>
-          <w:rFonts w:ascii="Malgun Gothic" w:hAnsi="Malgun Gothic" w:cs="Malgun Gothic" w:eastAsia="맑은 고딕"/>
+          <w:rFonts w:ascii="맑은고딕" w:hAnsi="맑은고딕" w:eastAsia="맑은고딕" w:cs="맑은고딕"/>
           <w:b w:val="0"/>
           <w:sz w:val="22"/>
         </w:rPr>
-        <w:t>9월 17일 요지의 중심은 aSEC와 EDR/EPP다. 확보된 EPP 자료는 엔드포인트·랜섬웨어 포지셔닝이고, aSEC 자료는 HCI 위 보안 소개다. 9월 23일 요청은 여기에 NDR·CDP와 외부 물리서버가 더해져 있다. EDR과 EPP가 같은 제품인지는 슬라이드 요약이 정하지 않는다.</w:t>
+        <w:t>· 첨부 보강 후: EPP·aSEC는 표준 자료로 포지셔닝 설명 가능. NDR·CDP는 본문 요청만 있고 첨부 근거 없음 → 파트너 질의로 보완.</w:t>
       </w:r>
     </w:p>
     <w:p>
       <w:pPr>
-        <w:pStyle w:val="ListBullet"/>
-        <w:spacing w:after="60" w:line="276" w:lineRule="auto"/>
+        <w:spacing w:before="0" w:after="80" w:line="276" w:lineRule="auto"/>
+        <w:ind w:left="240"/>
       </w:pPr>
       <w:r>
         <w:rPr>
-          <w:rFonts w:ascii="Malgun Gothic" w:hAnsi="Malgun Gothic" w:cs="Malgun Gothic" w:eastAsia="맑은 고딕"/>
+          <w:rFonts w:ascii="맑은고딕" w:hAnsi="맑은고딕" w:eastAsia="맑은고딕" w:cs="맑은고딕"/>
           <w:b w:val="0"/>
           <w:sz w:val="22"/>
         </w:rPr>
-        <w:t>견적 실행은 넥시아스다. (주)베를로는 자문이다. 범위·질문·시점을 정리하고, 견적서 작성과 고객 회신은 하지 않는다.</w:t>
+        <w:t>· BLRO 역할: 어드바이저. 범위·질문·타이밍 정리 후 견적 작성·고객 면 회신은 매입 파트너에 넘김. BLRO 견적서 작성·(주)도연/NVH 직송 없음.</w:t>
       </w:r>
     </w:p>
     <w:p>
       <w:pPr>
-        <w:pStyle w:val="ListBullet"/>
-        <w:spacing w:after="60" w:line="276" w:lineRule="auto"/>
+        <w:spacing w:before="0" w:after="80" w:line="276" w:lineRule="auto"/>
+        <w:ind w:left="240"/>
       </w:pPr>
       <w:r>
         <w:rPr>
-          <w:rFonts w:ascii="Malgun Gothic" w:hAnsi="Malgun Gothic" w:cs="Malgun Gothic" w:eastAsia="맑은 고딕"/>
+          <w:rFonts w:ascii="맑은고딕" w:hAnsi="맑은고딕" w:eastAsia="맑은고딕" w:cs="맑은고딕"/>
           <w:b w:val="0"/>
           <w:sz w:val="22"/>
         </w:rPr>
-        <w:t>고객에게 나가는 문장에는 실행 주체 상호를 넣지 않는다. 이 파일은 내부 핸드오프다.</w:t>
+        <w:t>· 고객 전달면에는 파트너명(넥시아스·이루인포 등) 비노출. 내부 핸드오프·파트너 질의 구간에서만 수신 상대로서 넥시아스 호칭 가능.</w:t>
       </w:r>
     </w:p>
     <w:p>
       <w:pPr>
-        <w:pStyle w:val="ListBullet"/>
-        <w:spacing w:after="60" w:line="276" w:lineRule="auto"/>
+        <w:spacing w:before="0" w:after="80" w:line="276" w:lineRule="auto"/>
+        <w:ind w:left="240"/>
       </w:pPr>
       <w:r>
         <w:rPr>
-          <w:rFonts w:ascii="Malgun Gothic" w:hAnsi="Malgun Gothic" w:cs="Malgun Gothic" w:eastAsia="맑은 고딕"/>
+          <w:rFonts w:ascii="맑은고딕" w:hAnsi="맑은고딕" w:eastAsia="맑은고딕" w:cs="맑은고딕"/>
           <w:b w:val="0"/>
           <w:sz w:val="22"/>
         </w:rPr>
-        <w:t>삭제된 메일 초안(DEC-20260922-a16-drop-3)은 다시 쓰지 않는다. 오늘 14:43은 견적 요청이 붙은 NEW WORK라, 9월 18일 「참고용·회신 불필요」 후보와 같은 결정으로 닫지 않는다.</w:t>
+        <w:t>· 과거 삭제 초안(a16-drop 등)은 발송·부활 금지. 오늘은 라성주 견적요청으로 NEW WORK.</w:t>
       </w:r>
     </w:p>
     <w:p>
       <w:pPr>
-        <w:spacing w:after="120" w:before="240" w:line="276" w:lineRule="auto"/>
-        <w:pBdr>
-          <w:bottom w:val="single" w:sz="8" w:space="1" w:color="1F2A37"/>
-        </w:pBdr>
+        <w:spacing w:before="0" w:after="120" w:line="276" w:lineRule="auto"/>
       </w:pPr>
       <w:r>
         <w:rPr>
-          <w:rFonts w:ascii="Malgun Gothic" w:hAnsi="Malgun Gothic" w:cs="Malgun Gothic" w:eastAsia="맑은 고딕"/>
+          <w:rFonts w:ascii="맑은고딕" w:hAnsi="맑은고딕" w:eastAsia="맑은고딕" w:cs="맑은고딕"/>
+          <w:b w:val="0"/>
+          <w:sz w:val="22"/>
+        </w:rPr>
+      </w:r>
+    </w:p>
+    <w:p>
+      <w:pPr>
+        <w:spacing w:before="0" w:after="160" w:line="276" w:lineRule="auto"/>
+      </w:pPr>
+      <w:r>
+        <w:rPr>
+          <w:rFonts w:ascii="맑은고딕" w:hAnsi="맑은고딕" w:eastAsia="맑은고딕" w:cs="맑은고딕"/>
           <w:b/>
-          <w:sz w:val="26"/>
+          <w:sz w:val="22"/>
         </w:rPr>
         <w:t>4. UNKNOWN</w:t>
       </w:r>
     </w:p>
     <w:p>
       <w:pPr>
-        <w:pStyle w:val="ListBullet"/>
-        <w:spacing w:after="60" w:line="276" w:lineRule="auto"/>
+        <w:spacing w:before="0" w:after="80" w:line="276" w:lineRule="auto"/>
+        <w:ind w:left="240"/>
       </w:pPr>
       <w:r>
         <w:rPr>
-          <w:rFonts w:ascii="Malgun Gothic" w:hAnsi="Malgun Gothic" w:cs="Malgun Gothic" w:eastAsia="맑은 고딕"/>
+          <w:rFonts w:ascii="맑은고딕" w:hAnsi="맑은고딕" w:eastAsia="맑은고딕" w:cs="맑은고딕"/>
           <w:b w:val="0"/>
           <w:sz w:val="22"/>
         </w:rPr>
-        <w:t>NVH Korea 서버 대수(VM과 물리의 분리)와 기존 HCI 노드 규모.</w:t>
+        <w:t>· NDR·CDP 표준 제안자료·스펙 시트(첨부 없음).</w:t>
       </w:r>
     </w:p>
     <w:p>
       <w:pPr>
-        <w:pStyle w:val="ListBullet"/>
-        <w:spacing w:after="60" w:line="276" w:lineRule="auto"/>
+        <w:spacing w:before="0" w:after="80" w:line="276" w:lineRule="auto"/>
+        <w:ind w:left="240"/>
       </w:pPr>
       <w:r>
         <w:rPr>
-          <w:rFonts w:ascii="Malgun Gothic" w:hAnsi="Malgun Gothic" w:cs="Malgun Gothic" w:eastAsia="맑은 고딕"/>
+          <w:rFonts w:ascii="맑은고딕" w:hAnsi="맑은고딕" w:eastAsia="맑은고딕" w:cs="맑은고딕"/>
           <w:b w:val="0"/>
           <w:sz w:val="22"/>
         </w:rPr>
-        <w:t>NDR 첨부 없음. 제품명·구성·과금 단위 UNKNOWN.</w:t>
+        <w:t>· NVH Korea 서버 대수(VM/물리 분리) 및 기존 HCI 노드 규모.</w:t>
       </w:r>
     </w:p>
     <w:p>
       <w:pPr>
-        <w:pStyle w:val="ListBullet"/>
-        <w:spacing w:after="60" w:line="276" w:lineRule="auto"/>
+        <w:spacing w:before="0" w:after="80" w:line="276" w:lineRule="auto"/>
+        <w:ind w:left="240"/>
       </w:pPr>
       <w:r>
         <w:rPr>
-          <w:rFonts w:ascii="Malgun Gothic" w:hAnsi="Malgun Gothic" w:cs="Malgun Gothic" w:eastAsia="맑은 고딕"/>
+          <w:rFonts w:ascii="맑은고딕" w:hAnsi="맑은고딕" w:eastAsia="맑은고딕" w:cs="맑은고딕"/>
           <w:b w:val="0"/>
           <w:sz w:val="22"/>
         </w:rPr>
-        <w:t>CDP 첨부 없음. 별도 스토리지 필요 여부, 용량, 디스크 정책 UNKNOWN. 본문은 고려사항만 묻는다.</w:t>
+        <w:t>· CDP 스토리지 용량·디스크 정책.</w:t>
       </w:r>
     </w:p>
     <w:p>
       <w:pPr>
-        <w:pStyle w:val="ListBullet"/>
-        <w:spacing w:after="60" w:line="276" w:lineRule="auto"/>
+        <w:spacing w:before="0" w:after="80" w:line="276" w:lineRule="auto"/>
+        <w:ind w:left="240"/>
       </w:pPr>
       <w:r>
         <w:rPr>
-          <w:rFonts w:ascii="Malgun Gothic" w:hAnsi="Malgun Gothic" w:cs="Malgun Gothic" w:eastAsia="맑은 고딕"/>
+          <w:rFonts w:ascii="맑은고딕" w:hAnsi="맑은고딕" w:eastAsia="맑은고딕" w:cs="맑은고딕"/>
           <w:b w:val="0"/>
           <w:sz w:val="22"/>
         </w:rPr>
-        <w:t>EPP 슬라이드와 aSEC 소개 PDF의 장 구성·SKU·가격. 요약 밖의 내용은 적지 않았다.</w:t>
+        <w:t>· CRM 프로젝트 페이지 존재·ID.</w:t>
       </w:r>
     </w:p>
     <w:p>
       <w:pPr>
-        <w:pStyle w:val="ListBullet"/>
-        <w:spacing w:after="60" w:line="276" w:lineRule="auto"/>
+        <w:spacing w:before="0" w:after="80" w:line="276" w:lineRule="auto"/>
+        <w:ind w:left="240"/>
       </w:pPr>
       <w:r>
         <w:rPr>
-          <w:rFonts w:ascii="Malgun Gothic" w:hAnsi="Malgun Gothic" w:cs="Malgun Gothic" w:eastAsia="맑은 고딕"/>
+          <w:rFonts w:ascii="맑은고딕" w:hAnsi="맑은고딕" w:eastAsia="맑은고딕" w:cs="맑은고딕"/>
           <w:b w:val="0"/>
           <w:sz w:val="22"/>
         </w:rPr>
-        <w:t>미팅 녹음의 내용. 묶음 트랙의 재료이나 이 메일에는 없다.</w:t>
+        <w:t>· 과거 (주)도연시스템즈·NVH 관련 발주/견적 이력.</w:t>
       </w:r>
     </w:p>
     <w:p>
       <w:pPr>
-        <w:pStyle w:val="ListBullet"/>
-        <w:spacing w:after="60" w:line="276" w:lineRule="auto"/>
+        <w:spacing w:before="0" w:after="80" w:line="276" w:lineRule="auto"/>
+        <w:ind w:left="240"/>
       </w:pPr>
       <w:r>
         <w:rPr>
-          <w:rFonts w:ascii="Malgun Gothic" w:hAnsi="Malgun Gothic" w:cs="Malgun Gothic" w:eastAsia="맑은 고딕"/>
+          <w:rFonts w:ascii="맑은고딕" w:hAnsi="맑은고딕" w:eastAsia="맑은고딕" w:cs="맑은고딕"/>
           <w:b w:val="0"/>
           <w:sz w:val="22"/>
         </w:rPr>
-        <w:t>청구·견적 수신 법인이 (주)도연시스템즈인지 NVH Korea인지.</w:t>
+        <w:t>· 매입 파트너 SKU·정식 단가표(미확인). 출처 없는 단가 기재 금지.</w:t>
       </w:r>
     </w:p>
     <w:p>
       <w:pPr>
-        <w:pStyle w:val="ListBullet"/>
-        <w:spacing w:after="60" w:line="276" w:lineRule="auto"/>
+        <w:spacing w:before="0" w:after="120" w:line="276" w:lineRule="auto"/>
       </w:pPr>
       <w:r>
         <w:rPr>
-          <w:rFonts w:ascii="Malgun Gothic" w:hAnsi="Malgun Gothic" w:cs="Malgun Gothic" w:eastAsia="맑은 고딕"/>
+          <w:rFonts w:ascii="맑은고딕" w:hAnsi="맑은고딕" w:eastAsia="맑은고딕" w:cs="맑은고딕"/>
           <w:b w:val="0"/>
           <w:sz w:val="22"/>
         </w:rPr>
-        <w:t>EPP·NDR·aSEC·CDP 각각의 수량 단위. 서버 1대 단가 요청이 과금 단위의 확정은 아니다.</w:t>
       </w:r>
     </w:p>
     <w:p>
       <w:pPr>
-        <w:pStyle w:val="ListBullet"/>
-        <w:spacing w:after="60" w:line="276" w:lineRule="auto"/>
+        <w:spacing w:before="0" w:after="160" w:line="276" w:lineRule="auto"/>
       </w:pPr>
       <w:r>
         <w:rPr>
-          <w:rFonts w:ascii="Malgun Gothic" w:hAnsi="Malgun Gothic" w:cs="Malgun Gothic" w:eastAsia="맑은 고딕"/>
-          <w:b w:val="0"/>
+          <w:rFonts w:ascii="맑은고딕" w:hAnsi="맑은고딕" w:eastAsia="맑은고딕" w:cs="맑은고딕"/>
+          <w:b/>
           <w:sz w:val="22"/>
-        </w:rPr>
-        <w:t>CRM 페이지 존재. 이 작업에서 CRM에 쓰지 않는다.</w:t>
-      </w:r>
-    </w:p>
-    <w:p>
-      <w:pPr>
-        <w:pStyle w:val="ListBullet"/>
-        <w:spacing w:after="60" w:line="276" w:lineRule="auto"/>
-      </w:pPr>
-      <w:r>
-        <w:rPr>
-          <w:rFonts w:ascii="Malgun Gothic" w:hAnsi="Malgun Gothic" w:cs="Malgun Gothic" w:eastAsia="맑은 고딕"/>
-          <w:b w:val="0"/>
-          <w:sz w:val="22"/>
-        </w:rPr>
-        <w:t>과거 발주·성사 견적. 삭제된 초안과 녹음 보유는 별개 기록이다.</w:t>
-      </w:r>
-    </w:p>
-    <w:p>
-      <w:pPr>
-        <w:pStyle w:val="ListBullet"/>
-        <w:spacing w:after="60" w:line="276" w:lineRule="auto"/>
-      </w:pPr>
-      <w:r>
-        <w:rPr>
-          <w:rFonts w:ascii="Malgun Gothic" w:hAnsi="Malgun Gothic" w:cs="Malgun Gothic" w:eastAsia="맑은 고딕"/>
-          <w:b w:val="0"/>
-          <w:sz w:val="22"/>
-        </w:rPr>
-        <w:t>실행 주체의 SKU·정식 단가표. 이 문서에 금액을 적지 않았다.</w:t>
-      </w:r>
-    </w:p>
-    <w:p>
-      <w:pPr>
-        <w:spacing w:after="120" w:before="240" w:line="276" w:lineRule="auto"/>
-        <w:pBdr>
-          <w:bottom w:val="single" w:sz="8" w:space="1" w:color="1F2A37"/>
-        </w:pBdr>
-      </w:pPr>
-      <w:r>
-        <w:rPr>
-          <w:rFonts w:ascii="Malgun Gothic" w:hAnsi="Malgun Gothic" w:cs="Malgun Gothic" w:eastAsia="맑은 고딕"/>
-          <w:b/>
-          <w:sz w:val="26"/>
         </w:rPr>
         <w:t>5. 어드바이저 관점 전달 포인트</w:t>
       </w:r>
     </w:p>
     <w:p>
       <w:pPr>
-        <w:pStyle w:val="ListBullet"/>
-        <w:spacing w:after="60" w:line="276" w:lineRule="auto"/>
+        <w:spacing w:before="0" w:after="80" w:line="276" w:lineRule="auto"/>
+        <w:ind w:left="240"/>
       </w:pPr>
       <w:r>
         <w:rPr>
-          <w:rFonts w:ascii="Malgun Gothic" w:hAnsi="Malgun Gothic" w:cs="Malgun Gothic" w:eastAsia="맑은 고딕"/>
+          <w:rFonts w:ascii="맑은고딕" w:hAnsi="맑은고딕" w:eastAsia="맑은고딕" w:cs="맑은고딕"/>
           <w:b w:val="0"/>
           <w:sz w:val="22"/>
         </w:rPr>
-        <w:t>녹음 정리와 견적 질의는 한 트랙으로 진행한다. 녹음에 없는 대수·구성을 견적 전제로 올리지 않는다.</w:t>
+        <w:t>· 타이밍: 예산(내년 사업계획) 우선 → 견적 트랙과 상세 기술(추석 후)을 분리해 전달.</w:t>
       </w:r>
     </w:p>
     <w:p>
       <w:pPr>
-        <w:pStyle w:val="ListBullet"/>
-        <w:spacing w:after="60" w:line="276" w:lineRule="auto"/>
+        <w:spacing w:before="0" w:after="80" w:line="276" w:lineRule="auto"/>
+        <w:ind w:left="240"/>
       </w:pPr>
       <w:r>
         <w:rPr>
-          <w:rFonts w:ascii="Malgun Gothic" w:hAnsi="Malgun Gothic" w:cs="Malgun Gothic" w:eastAsia="맑은 고딕"/>
+          <w:rFonts w:ascii="맑은고딕" w:hAnsi="맑은고딕" w:eastAsia="맑은고딕" w:cs="맑은고딕"/>
           <w:b w:val="0"/>
           <w:sz w:val="22"/>
         </w:rPr>
-        <w:t>상세 기술 논의는 고객 문장대로 추석 이후다. 오늘 필요한 정리 수준은 예산용 범위와 확인 질문이다.</w:t>
+        <w:t>· 품목: EPP·NDR·aSEC·CDP(+설치·안정화 기술지원, 추가장비). 불필요 품목은 견적에 넣되 「제외 사유」를 함께.</w:t>
       </w:r>
     </w:p>
     <w:p>
       <w:pPr>
-        <w:pStyle w:val="ListBullet"/>
-        <w:spacing w:after="60" w:line="276" w:lineRule="auto"/>
+        <w:spacing w:before="0" w:after="80" w:line="276" w:lineRule="auto"/>
+        <w:ind w:left="240"/>
       </w:pPr>
       <w:r>
         <w:rPr>
-          <w:rFonts w:ascii="Malgun Gothic" w:hAnsi="Malgun Gothic" w:cs="Malgun Gothic" w:eastAsia="맑은 고딕"/>
+          <w:rFonts w:ascii="맑은고딕" w:hAnsi="맑은고딕" w:eastAsia="맑은고딕" w:cs="맑은고딕"/>
           <w:b w:val="0"/>
           <w:sz w:val="22"/>
         </w:rPr>
-        <w:t>품목은 EPP·NDR·aSEC·CDP, 설치와 안정화를 포함한 기술지원, 필요 시 추가 장비다. 불필요 품목은 빼기 전에 제외 사유가 필요하다.</w:t>
+        <w:t>· 첨부 활용: EPP·aSEC 덱은 포지셔닝·역량 설명용. NDR·CDP는 첨부 부재를 명시하고 파트너에 자료·SKU 요청.</w:t>
       </w:r>
     </w:p>
     <w:p>
       <w:pPr>
-        <w:pStyle w:val="ListBullet"/>
-        <w:spacing w:after="60" w:line="276" w:lineRule="auto"/>
+        <w:spacing w:before="0" w:after="80" w:line="276" w:lineRule="auto"/>
+        <w:ind w:left="240"/>
       </w:pPr>
       <w:r>
         <w:rPr>
-          <w:rFonts w:ascii="Malgun Gothic" w:hAnsi="Malgun Gothic" w:cs="Malgun Gothic" w:eastAsia="맑은 고딕"/>
+          <w:rFonts w:ascii="맑은고딕" w:hAnsi="맑은고딕" w:eastAsia="맑은고딕" w:cs="맑은고딕"/>
           <w:b w:val="0"/>
           <w:sz w:val="22"/>
         </w:rPr>
-        <w:t>EPP 자료는 엔드포인트 포지셔닝이다. 고객은 EPP를 서버 1대 단가로 달라고 했다. 두 단위가 같은지는 자료가 말해주지 않는다. 고객면에는 확정 SKU를 쓰지 않는다.</w:t>
+        <w:t>· EDR vs EPP 용어 정리: 파트너에 SKU·제품명 정리를 요청. 고객면에는 확정된 제품명만.</w:t>
       </w:r>
     </w:p>
     <w:p>
       <w:pPr>
-        <w:pStyle w:val="ListBullet"/>
-        <w:spacing w:after="60" w:line="276" w:lineRule="auto"/>
+        <w:spacing w:before="0" w:after="80" w:line="276" w:lineRule="auto"/>
+        <w:ind w:left="240"/>
       </w:pPr>
       <w:r>
         <w:rPr>
-          <w:rFonts w:ascii="Malgun Gothic" w:hAnsi="Malgun Gothic" w:cs="Malgun Gothic" w:eastAsia="맑은 고딕"/>
+          <w:rFonts w:ascii="맑은고딕" w:hAnsi="맑은고딕" w:eastAsia="맑은고딕" w:cs="맑은고딕"/>
           <w:b w:val="0"/>
           <w:sz w:val="22"/>
         </w:rPr>
-        <w:t>NDR·CDP는 자료 없이 견적 항목으로만 남아 있다. 첨부 없는 품목의 단가와 용량을 채우지 않는다.</w:t>
+        <w:t>· 단가 구조: EPP/CDP는 서버 1대 기준 → *n. CDP 별도 스토리지 필요 여부 명시. 출처 없는 숫자 금지.</w:t>
       </w:r>
     </w:p>
     <w:p>
       <w:pPr>
-        <w:pStyle w:val="ListBullet"/>
-        <w:spacing w:after="60" w:line="276" w:lineRule="auto"/>
+        <w:spacing w:before="0" w:after="80" w:line="276" w:lineRule="auto"/>
+        <w:ind w:left="240"/>
       </w:pPr>
       <w:r>
         <w:rPr>
-          <w:rFonts w:ascii="Malgun Gothic" w:hAnsi="Malgun Gothic" w:cs="Malgun Gothic" w:eastAsia="맑은 고딕"/>
+          <w:rFonts w:ascii="맑은고딕" w:hAnsi="맑은고딕" w:eastAsia="맑은고딕" w:cs="맑은고딕"/>
           <w:b w:val="0"/>
           <w:sz w:val="22"/>
         </w:rPr>
-        <w:t>범위에 외부 물리서버가 들어 있다. 라이선스·에이전트·설치가 VM과 같은지는 확인 전이다.</w:t>
+        <w:t>· 범위: Sangfor VM + 외부 물리서버. 물리서버 포함 시 라이선스·에이전트·설치비 차이 확인.</w:t>
       </w:r>
     </w:p>
     <w:p>
       <w:pPr>
-        <w:pStyle w:val="ListBullet"/>
-        <w:spacing w:after="60" w:line="276" w:lineRule="auto"/>
+        <w:spacing w:before="0" w:after="80" w:line="276" w:lineRule="auto"/>
+        <w:ind w:left="240"/>
       </w:pPr>
       <w:r>
         <w:rPr>
-          <w:rFonts w:ascii="Malgun Gothic" w:hAnsi="Malgun Gothic" w:cs="Malgun Gothic" w:eastAsia="맑은 고딕"/>
+          <w:rFonts w:ascii="맑은고딕" w:hAnsi="맑은고딕" w:eastAsia="맑은고딕" w:cs="맑은고딕"/>
           <w:b w:val="0"/>
           <w:sz w:val="22"/>
         </w:rPr>
-        <w:t>(주)베를로는 자문만 한다. 견적 실행은 넥시아스다. (주)도연시스템즈·NVH Korea 직송은 하지 않는다. 고객면 문장에는 실행 주체 상호를 넣지 않는다.</w:t>
+        <w:t>· BLRO: 어드바이저만. 견적 작성·고객 직송 금지. 고객면 파트너명 비노출.</w:t>
       </w:r>
     </w:p>
     <w:p>
       <w:pPr>
-        <w:spacing w:after="120" w:before="240" w:line="276" w:lineRule="auto"/>
-        <w:pBdr>
-          <w:bottom w:val="single" w:sz="8" w:space="1" w:color="1F2A37"/>
-        </w:pBdr>
+        <w:spacing w:before="0" w:after="80" w:line="276" w:lineRule="auto"/>
+        <w:ind w:left="240"/>
       </w:pPr>
       <w:r>
         <w:rPr>
-          <w:rFonts w:ascii="Malgun Gothic" w:hAnsi="Malgun Gothic" w:cs="Malgun Gothic" w:eastAsia="맑은 고딕"/>
-          <w:b/>
-          <w:sz w:val="26"/>
+          <w:rFonts w:ascii="맑은고딕" w:hAnsi="맑은고딕" w:eastAsia="맑은고딕" w:cs="맑은고딕"/>
+          <w:b w:val="0"/>
+          <w:sz w:val="22"/>
         </w:rPr>
-        <w:t>6. 견적 실행 쪽에 넘길 질문</w:t>
+        <w:t>· 묶음 트랙: 미팅 녹음정리 + 견적 질의 묶음으로 진행(DEC).</w:t>
       </w:r>
     </w:p>
     <w:p>
       <w:pPr>
-        <w:spacing w:after="80" w:before="0" w:line="276" w:lineRule="auto"/>
+        <w:spacing w:before="0" w:after="120" w:line="276" w:lineRule="auto"/>
       </w:pPr>
       <w:r>
         <w:rPr>
-          <w:rFonts w:ascii="Malgun Gothic" w:hAnsi="Malgun Gothic" w:cs="Malgun Gothic" w:eastAsia="맑은 고딕"/>
+          <w:rFonts w:ascii="맑은고딕" w:hAnsi="맑은고딕" w:eastAsia="맑은고딕" w:cs="맑은고딕"/>
           <w:b w:val="0"/>
           <w:sz w:val="22"/>
         </w:rPr>
-        <w:t>내부 핸드오프용이다. 수신 상대는 7절의 실행 주체다. 고객면 문구에는 그 상호를 넣지 않는다. 이 목록으로 메일을 보내지 않는다. 단가 숫자는 비워 둔다.</w:t>
       </w:r>
     </w:p>
     <w:p>
       <w:pPr>
-        <w:spacing w:after="60" w:line="276" w:lineRule="auto"/>
-        <w:ind w:left="425" w:hanging="255"/>
+        <w:spacing w:before="0" w:after="160" w:line="276" w:lineRule="auto"/>
       </w:pPr>
       <w:r>
         <w:rPr>
-          <w:rFonts w:ascii="Malgun Gothic" w:hAnsi="Malgun Gothic" w:cs="Malgun Gothic" w:eastAsia="맑은 고딕"/>
-          <w:b w:val="0"/>
+          <w:rFonts w:ascii="맑은고딕" w:hAnsi="맑은고딕" w:eastAsia="맑은고딕" w:cs="맑은고딕"/>
+          <w:b/>
           <w:sz w:val="22"/>
         </w:rPr>
-        <w:t>1. EPP, NDR, aSEC, CDP 각각의 정식 제품명·SKU·라이선스 유형(영구/구독)을 확정할 수 있는가.</w:t>
+        <w:t>6. 상대(넥시아스)에 넘길 질문</w:t>
       </w:r>
     </w:p>
     <w:p>
       <w:pPr>
-        <w:spacing w:after="60" w:line="276" w:lineRule="auto"/>
-        <w:ind w:left="425" w:hanging="255"/>
+        <w:spacing w:before="0" w:after="120" w:line="276" w:lineRule="auto"/>
       </w:pPr>
       <w:r>
         <w:rPr>
-          <w:rFonts w:ascii="Malgun Gothic" w:hAnsi="Malgun Gothic" w:cs="Malgun Gothic" w:eastAsia="맑은 고딕"/>
+          <w:rFonts w:ascii="맑은고딕" w:hAnsi="맑은고딕" w:eastAsia="맑은고딕" w:cs="맑은고딕"/>
           <w:b w:val="0"/>
           <w:sz w:val="22"/>
         </w:rPr>
-        <w:t>2. EPP·CDP를 서버 1대 단가로 주는 규칙과, 그 단위가 단말·용량과 다를 때의 처리. CDP 별도 스토리지 필요 여부와 고려사항. 용량 숫자는 고객 확인 전 확정하지 않는다.</w:t>
+        <w:t>※ 아래는 내부 핸드오프용으로, 질의 수신 상대로서 넥시아스에만 전달하는 항목입니다. 고객면 문구에는 파트너명을 넣지 않습니다.</w:t>
       </w:r>
     </w:p>
     <w:p>
       <w:pPr>
-        <w:spacing w:after="60" w:line="276" w:lineRule="auto"/>
-        <w:ind w:left="425" w:hanging="255"/>
+        <w:spacing w:before="0" w:after="80" w:line="276" w:lineRule="auto"/>
+        <w:ind w:left="240"/>
       </w:pPr>
       <w:r>
         <w:rPr>
-          <w:rFonts w:ascii="Malgun Gothic" w:hAnsi="Malgun Gothic" w:cs="Malgun Gothic" w:eastAsia="맑은 고딕"/>
+          <w:rFonts w:ascii="맑은고딕" w:hAnsi="맑은고딕" w:eastAsia="맑은고딕" w:cs="맑은고딕"/>
           <w:b w:val="0"/>
           <w:sz w:val="22"/>
         </w:rPr>
-        <w:t>3. 설치와 안정화를 포함한 기술지원의 포함 범위. 비용 산정 기준만 묻고, 금액은 이 문서에 없다.</w:t>
+        <w:t>· EPP / NDR / aSEC / CDP 각각의 정식 제품명·SKU·라이선스 유형(영구/구독)을 확정해 주실 수 있는지.</w:t>
       </w:r>
     </w:p>
     <w:p>
       <w:pPr>
-        <w:spacing w:after="60" w:line="276" w:lineRule="auto"/>
-        <w:ind w:left="425" w:hanging="255"/>
+        <w:spacing w:before="0" w:after="80" w:line="276" w:lineRule="auto"/>
+        <w:ind w:left="240"/>
       </w:pPr>
       <w:r>
         <w:rPr>
-          <w:rFonts w:ascii="Malgun Gothic" w:hAnsi="Malgun Gothic" w:cs="Malgun Gothic" w:eastAsia="맑은 고딕"/>
+          <w:rFonts w:ascii="맑은고딕" w:hAnsi="맑은고딕" w:eastAsia="맑은고딕" w:cs="맑은고딕"/>
           <w:b w:val="0"/>
           <w:sz w:val="22"/>
         </w:rPr>
-        <w:t>4. 상포 VM과 외부 물리서버를 함께 넣을 때 라이선스·에이전트·설치 범위가 어떻게 달라지는가.</w:t>
+        <w:t>· EPP·CDP 서버 1대 기준 단가(및 *n 산정 규칙). CDP는 별도 스토리지 필요 여부·권장 용량·고려사항.</w:t>
       </w:r>
     </w:p>
     <w:p>
       <w:pPr>
-        <w:spacing w:after="60" w:line="276" w:lineRule="auto"/>
-        <w:ind w:left="425" w:hanging="255"/>
+        <w:spacing w:before="0" w:after="80" w:line="276" w:lineRule="auto"/>
+        <w:ind w:left="240"/>
       </w:pPr>
       <w:r>
         <w:rPr>
-          <w:rFonts w:ascii="Malgun Gothic" w:hAnsi="Malgun Gothic" w:cs="Malgun Gothic" w:eastAsia="맑은 고딕"/>
+          <w:rFonts w:ascii="맑은고딕" w:hAnsi="맑은고딕" w:eastAsia="맑은고딕" w:cs="맑은고딕"/>
           <w:b w:val="0"/>
           <w:sz w:val="22"/>
         </w:rPr>
-        <w:t>5. 네 품목 중 예산안 단계에서 제외를 권하는 것이 있으면, 그 사유.</w:t>
+        <w:t>· 설치 + 안정화 단계 포함 기술지원 패키지 구성·비용 산정 기준.</w:t>
       </w:r>
     </w:p>
     <w:p>
       <w:pPr>
-        <w:spacing w:after="60" w:line="276" w:lineRule="auto"/>
-        <w:ind w:left="425" w:hanging="255"/>
+        <w:spacing w:before="0" w:after="80" w:line="276" w:lineRule="auto"/>
+        <w:ind w:left="240"/>
       </w:pPr>
       <w:r>
         <w:rPr>
-          <w:rFonts w:ascii="Malgun Gothic" w:hAnsi="Malgun Gothic" w:cs="Malgun Gothic" w:eastAsia="맑은 고딕"/>
+          <w:rFonts w:ascii="맑은고딕" w:hAnsi="맑은고딕" w:eastAsia="맑은고딕" w:cs="맑은고딕"/>
           <w:b w:val="0"/>
           <w:sz w:val="22"/>
         </w:rPr>
-        <w:t>6. 추가 장비·솔루션이 있으면 이름만. 금액 없음.</w:t>
+        <w:t>· 상포 VM뿐 아니라 외부 물리서버를 포함할 때 라이선스·에이전트·설치 범위 차이.</w:t>
       </w:r>
     </w:p>
     <w:p>
       <w:pPr>
-        <w:spacing w:after="60" w:line="276" w:lineRule="auto"/>
-        <w:ind w:left="425" w:hanging="255"/>
+        <w:spacing w:before="0" w:after="80" w:line="276" w:lineRule="auto"/>
+        <w:ind w:left="240"/>
       </w:pPr>
       <w:r>
         <w:rPr>
-          <w:rFonts w:ascii="Malgun Gothic" w:hAnsi="Malgun Gothic" w:cs="Malgun Gothic" w:eastAsia="맑은 고딕"/>
+          <w:rFonts w:ascii="맑은고딕" w:hAnsi="맑은고딕" w:eastAsia="맑은고딕" w:cs="맑은고딕"/>
           <w:b w:val="0"/>
           <w:sz w:val="22"/>
         </w:rPr>
-        <w:t>7. EPP 슬라이드와 aSEC 소개 PDF는 요약 수준으로 있다. NDR과 CDP의 표준자료가 따로 있는가. 없으면 두 품목은 자료 없는 견적 요청으로 남긴다.</w:t>
+        <w:t>· 라성주가 요청한 4종 중 예산안 단계에서 축소·제외를 권고할 품목이 있다면 제외 사유.</w:t>
       </w:r>
     </w:p>
     <w:p>
       <w:pPr>
-        <w:spacing w:after="120" w:before="240" w:line="276" w:lineRule="auto"/>
-        <w:pBdr>
-          <w:bottom w:val="single" w:sz="8" w:space="1" w:color="1F2A37"/>
-        </w:pBdr>
+        <w:spacing w:before="0" w:after="80" w:line="276" w:lineRule="auto"/>
+        <w:ind w:left="240"/>
       </w:pPr>
       <w:r>
         <w:rPr>
-          <w:rFonts w:ascii="Malgun Gothic" w:hAnsi="Malgun Gothic" w:cs="Malgun Gothic" w:eastAsia="맑은 고딕"/>
-          <w:b/>
-          <w:sz w:val="26"/>
+          <w:rFonts w:ascii="맑은고딕" w:hAnsi="맑은고딕" w:eastAsia="맑은고딕" w:cs="맑은고딕"/>
+          <w:b w:val="0"/>
+          <w:sz w:val="22"/>
         </w:rPr>
-        <w:t>7. 재민 확인 전 발송 금지</w:t>
+        <w:t>· 필요 시 추가 장비·솔루션 제안 목록(있으면).</w:t>
       </w:r>
     </w:p>
     <w:p>
       <w:pPr>
-        <w:spacing w:after="80" w:before="0" w:line="276" w:lineRule="auto"/>
+        <w:spacing w:before="0" w:after="80" w:line="276" w:lineRule="auto"/>
+        <w:ind w:left="240"/>
       </w:pPr>
       <w:r>
         <w:rPr>
-          <w:rFonts w:ascii="Malgun Gothic" w:hAnsi="Malgun Gothic" w:cs="Malgun Gothic" w:eastAsia="맑은 고딕"/>
-          <w:b/>
+          <w:rFonts w:ascii="맑은고딕" w:hAnsi="맑은고딕" w:eastAsia="맑은고딕" w:cs="맑은고딕"/>
+          <w:b w:val="0"/>
           <w:sz w:val="22"/>
         </w:rPr>
-        <w:t>외부 발송·회신·견적 직송·CRM 쓰기 금지.</w:t>
+        <w:t>· NDR·CDP 표준 제안자료(스펙·포지셔닝) 재전달 가능 여부. (현재 로컬에는 EPP·aSEC 덱만 확인됨)</w:t>
       </w:r>
     </w:p>
     <w:p>
       <w:pPr>
-        <w:spacing w:after="80" w:before="0" w:line="276" w:lineRule="auto"/>
+        <w:spacing w:before="0" w:after="120" w:line="276" w:lineRule="auto"/>
       </w:pPr>
       <w:r>
         <w:rPr>
-          <w:rFonts w:ascii="Malgun Gothic" w:hAnsi="Malgun Gothic" w:cs="Malgun Gothic" w:eastAsia="맑은 고딕"/>
+          <w:rFonts w:ascii="맑은고딕" w:hAnsi="맑은고딕" w:eastAsia="맑은고딕" w:cs="맑은고딕"/>
           <w:b w:val="0"/>
           <w:sz w:val="22"/>
         </w:rPr>
-        <w:t>이 파일은 내부 어드바이저 핸드오프다. (주)도연시스템즈와 NVH Korea로 견적이나 회신을 보내지 않는다. 견적 실행은 넥시아스에 있고, (주)베를로는 자문이다. EPP·aSEC는 요약만 있고 NDR·CDP는 첨부가 없다. 이 상태에서 견적 금액을 확정하지 않는다.</w:t>
+      </w:r>
+    </w:p>
+    <w:p>
+      <w:pPr>
+        <w:spacing w:before="0" w:after="160" w:line="276" w:lineRule="auto"/>
+      </w:pPr>
+      <w:r>
+        <w:rPr>
+          <w:rFonts w:ascii="맑은고딕" w:hAnsi="맑은고딕" w:eastAsia="맑은고딕" w:cs="맑은고딕"/>
+          <w:b/>
+          <w:sz w:val="22"/>
+        </w:rPr>
+        <w:t>7. 재민 확인 전 발송금지</w:t>
+      </w:r>
+    </w:p>
+    <w:p>
+      <w:pPr>
+        <w:spacing w:before="0" w:after="120" w:line="276" w:lineRule="auto"/>
+      </w:pPr>
+      <w:r>
+        <w:rPr>
+          <w:rFonts w:ascii="맑은고딕" w:hAnsi="맑은고딕" w:eastAsia="맑은고딕" w:cs="맑은고딕"/>
+          <w:b/>
+          <w:sz w:val="22"/>
+        </w:rPr>
+        <w:t>재민 최종 확인 전 — 외부 발송·회신·견적 직송·CRM 쓰기 금지</w:t>
+      </w:r>
+    </w:p>
+    <w:p>
+      <w:pPr>
+        <w:spacing w:before="0" w:after="120" w:line="276" w:lineRule="auto"/>
+      </w:pPr>
+      <w:r>
+        <w:rPr>
+          <w:rFonts w:ascii="맑은고딕" w:hAnsi="맑은고딕" w:eastAsia="맑은고딕" w:cs="맑은고딕"/>
+          <w:b w:val="0"/>
+          <w:sz w:val="22"/>
+        </w:rPr>
+        <w:t>본 문서는 내부 어드바이저 핸드오프입니다. (주)도연시스템즈·NVH Korea 앞으로의 견적·회신 초안 작성 및 직송은 하지 않습니다. 견적 실행은 넥시아스에 위임하며, BLRO는 범위·질문·타이밍 정리만 수행합니다. NDR·CDP 첨부 UNKNOWN 상태에서 단가·범위 확정 금지.</w:t>
       </w:r>
     </w:p>
     <w:sectPr>
-      <w:footerReference w:type="default" r:id="rId9"/>
-      <w:pgSz w:w="11906" w:h="16838"/>
-      <w:pgMar w:top="964" w:right="1077" w:bottom="964" w:left="1077" w:header="720" w:footer="720" w:gutter="0"/>
+      <w:pgSz w:w="12240" w:h="15840"/>
+      <w:pgMar w:top="720" w:right="720" w:bottom="720" w:left="720" w:header="720" w:footer="720" w:gutter="0"/>
       <w:cols w:space="720"/>
       <w:docGrid w:linePitch="360"/>
     </w:sectPr>
   </w:body>
 </w:document>
-</file>
-
-<file path=word/footer1.xml><?xml version="1.0" encoding="utf-8"?>
-<w:ftr xmlns:m="http://schemas.openxmlformats.org/officeDocument/2006/math" xmlns:mc="http://schemas.openxmlformats.org/markup-compatibility/2006" xmlns:mo="http://schemas.microsoft.com/office/mac/office/2008/main" xmlns:mv="urn:schemas-microsoft-com:mac:vml" xmlns:o="urn:schemas-microsoft-com:office:office" xmlns:r="http://schemas.openxmlformats.org/officeDocument/2006/relationships" xmlns:v="urn:schemas-microsoft-com:vml" xmlns:w10="urn:schemas-microsoft-com:office:word" xmlns:w14="http://schemas.microsoft.com/office/word/2010/wordml" xmlns:w="http://schemas.openxmlformats.org/wordprocessingml/2006/main" xmlns:wne="http://schemas.microsoft.com/office/word/2006/wordml" xmlns:wp14="http://schemas.microsoft.com/office/word/2010/wordprocessingDrawing" xmlns:wp="http://schemas.openxmlformats.org/drawingml/2006/wordprocessingDrawing" xmlns:wpc="http://schemas.microsoft.com/office/word/2010/wordprocessingCanvas" xmlns:wpg="http://schemas.microsoft.com/office/word/2010/wordprocessingGroup" xmlns:wpi="http://schemas.microsoft.com/office/word/2010/wordprocessingInk" xmlns:wps="http://schemas.microsoft.com/office/word/2010/wordprocessingShape" mc:Ignorable="w14 wp14">
-  <w:p>
-    <w:pPr>
-      <w:pStyle w:val="Footer"/>
-    </w:pPr>
-    <w:r>
-      <w:rPr>
-        <w:rFonts w:ascii="Malgun Gothic" w:hAnsi="Malgun Gothic" w:cs="Malgun Gothic" w:eastAsia="맑은 고딕"/>
-        <w:b w:val="0"/>
-        <w:color w:val="555F6D"/>
-        <w:sz w:val="18"/>
-      </w:rPr>
-      <w:t>내부 전달 · 외부 발송 금지 · DEC-20260923-mail2-advisor · 고객면 파트너 상호 금지</w:t>
-    </w:r>
-  </w:p>
-</w:ftr>
 </file>
 
 <file path=word/numbering.xml><?xml version="1.0" encoding="utf-8"?>
@@ -1339,12 +1266,8 @@
     <w:name w:val="Normal"/>
     <w:qFormat/>
     <w:rsid w:val="00FC693F"/>
-    <w:pPr>
-      <w:spacing w:after="80" w:before="0" w:line="276" w:lineRule="auto"/>
-    </w:pPr>
-    <w:rPr>
-      <w:rFonts w:ascii="Malgun Gothic" w:hAnsi="Malgun Gothic" w:cs="Malgun Gothic" w:eastAsia="맑은 고딕"/>
-      <w:color w:val="1F2A37"/>
+    <w:rPr>
+      <w:rFonts w:ascii="맑은고딕" w:hAnsi="맑은고딕" w:eastAsia="맑은고딕" w:cs="맑은고딕"/>
       <w:sz w:val="22"/>
     </w:rPr>
   </w:style>
@@ -1362,6 +1285,10 @@
       </w:tabs>
       <w:spacing w:after="0" w:line="240" w:lineRule="auto"/>
     </w:pPr>
+    <w:rPr>
+      <w:rFonts w:ascii="맑은고딕" w:hAnsi="맑은고딕" w:eastAsia="맑은고딕" w:cs="맑은고딕"/>
+      <w:sz w:val="22"/>
+    </w:rPr>
   </w:style>
   <w:style w:type="character" w:customStyle="1" w:styleId="HeaderChar">
     <w:name w:val="Header Char"/>
@@ -1369,6 +1296,10 @@
     <w:link w:val="Header"/>
     <w:uiPriority w:val="99"/>
     <w:rsid w:val="00E618BF"/>
+    <w:rPr>
+      <w:rFonts w:ascii="맑은고딕" w:hAnsi="맑은고딕" w:eastAsia="맑은고딕" w:cs="맑은고딕"/>
+      <w:sz w:val="22"/>
+    </w:rPr>
   </w:style>
   <w:style w:type="paragraph" w:styleId="Footer">
     <w:name w:val="footer"/>
@@ -1384,6 +1315,10 @@
       </w:tabs>
       <w:spacing w:after="0" w:line="240" w:lineRule="auto"/>
     </w:pPr>
+    <w:rPr>
+      <w:rFonts w:ascii="맑은고딕" w:hAnsi="맑은고딕" w:eastAsia="맑은고딕" w:cs="맑은고딕"/>
+      <w:sz w:val="22"/>
+    </w:rPr>
   </w:style>
   <w:style w:type="character" w:customStyle="1" w:styleId="FooterChar">
     <w:name w:val="Footer Char"/>
@@ -1391,6 +1326,10 @@
     <w:link w:val="Footer"/>
     <w:uiPriority w:val="99"/>
     <w:rsid w:val="00E618BF"/>
+    <w:rPr>
+      <w:rFonts w:ascii="맑은고딕" w:hAnsi="맑은고딕" w:eastAsia="맑은고딕" w:cs="맑은고딕"/>
+      <w:sz w:val="22"/>
+    </w:rPr>
   </w:style>
   <w:style w:type="paragraph" w:styleId="Heading1">
     <w:name w:val="heading 1"/>
@@ -1407,11 +1346,11 @@
       <w:outlineLvl w:val="0"/>
     </w:pPr>
     <w:rPr>
-      <w:rFonts w:asciiTheme="majorHAnsi" w:eastAsiaTheme="majorEastAsia" w:hAnsiTheme="majorHAnsi" w:cstheme="majorBidi"/>
+      <w:rFonts w:asciiTheme="majorHAnsi" w:eastAsiaTheme="majorEastAsia" w:hAnsiTheme="majorHAnsi" w:cstheme="majorBidi" w:ascii="맑은고딕" w:hAnsi="맑은고딕" w:eastAsia="맑은고딕" w:cs="맑은고딕"/>
       <w:b/>
       <w:bCs/>
       <w:color w:val="365F91" w:themeColor="accent1" w:themeShade="BF"/>
-      <w:sz w:val="28"/>
+      <w:sz w:val="22"/>
       <w:szCs w:val="28"/>
     </w:rPr>
   </w:style>
@@ -1431,11 +1370,11 @@
       <w:outlineLvl w:val="1"/>
     </w:pPr>
     <w:rPr>
-      <w:rFonts w:asciiTheme="majorHAnsi" w:eastAsiaTheme="majorEastAsia" w:hAnsiTheme="majorHAnsi" w:cstheme="majorBidi"/>
+      <w:rFonts w:asciiTheme="majorHAnsi" w:eastAsiaTheme="majorEastAsia" w:hAnsiTheme="majorHAnsi" w:cstheme="majorBidi" w:ascii="맑은고딕" w:hAnsi="맑은고딕" w:eastAsia="맑은고딕" w:cs="맑은고딕"/>
       <w:b/>
       <w:bCs/>
       <w:color w:val="4F81BD" w:themeColor="accent1"/>
-      <w:sz w:val="26"/>
+      <w:sz w:val="22"/>
       <w:szCs w:val="26"/>
     </w:rPr>
   </w:style>
@@ -1455,10 +1394,11 @@
       <w:outlineLvl w:val="2"/>
     </w:pPr>
     <w:rPr>
-      <w:rFonts w:asciiTheme="majorHAnsi" w:eastAsiaTheme="majorEastAsia" w:hAnsiTheme="majorHAnsi" w:cstheme="majorBidi"/>
+      <w:rFonts w:asciiTheme="majorHAnsi" w:eastAsiaTheme="majorEastAsia" w:hAnsiTheme="majorHAnsi" w:cstheme="majorBidi" w:ascii="맑은고딕" w:hAnsi="맑은고딕" w:eastAsia="맑은고딕" w:cs="맑은고딕"/>
       <w:b/>
       <w:bCs/>
       <w:color w:val="4F81BD" w:themeColor="accent1"/>
+      <w:sz w:val="22"/>
     </w:rPr>
   </w:style>
   <w:style w:type="paragraph" w:styleId="Heading4">
@@ -1478,12 +1418,13 @@
       <w:outlineLvl w:val="3"/>
     </w:pPr>
     <w:rPr>
-      <w:rFonts w:asciiTheme="majorHAnsi" w:eastAsiaTheme="majorEastAsia" w:hAnsiTheme="majorHAnsi" w:cstheme="majorBidi"/>
+      <w:rFonts w:asciiTheme="majorHAnsi" w:eastAsiaTheme="majorEastAsia" w:hAnsiTheme="majorHAnsi" w:cstheme="majorBidi" w:ascii="맑은고딕" w:hAnsi="맑은고딕" w:eastAsia="맑은고딕" w:cs="맑은고딕"/>
       <w:b/>
       <w:bCs/>
       <w:i/>
       <w:iCs/>
       <w:color w:val="4F81BD" w:themeColor="accent1"/>
+      <w:sz w:val="22"/>
     </w:rPr>
   </w:style>
   <w:style w:type="paragraph" w:styleId="Heading5">
@@ -1503,8 +1444,9 @@
       <w:outlineLvl w:val="4"/>
     </w:pPr>
     <w:rPr>
-      <w:rFonts w:asciiTheme="majorHAnsi" w:eastAsiaTheme="majorEastAsia" w:hAnsiTheme="majorHAnsi" w:cstheme="majorBidi"/>
+      <w:rFonts w:asciiTheme="majorHAnsi" w:eastAsiaTheme="majorEastAsia" w:hAnsiTheme="majorHAnsi" w:cstheme="majorBidi" w:ascii="맑은고딕" w:hAnsi="맑은고딕" w:eastAsia="맑은고딕" w:cs="맑은고딕"/>
       <w:color w:val="243F60" w:themeColor="accent1" w:themeShade="7F"/>
+      <w:sz w:val="22"/>
     </w:rPr>
   </w:style>
   <w:style w:type="paragraph" w:styleId="Heading6">
@@ -1524,10 +1466,11 @@
       <w:outlineLvl w:val="5"/>
     </w:pPr>
     <w:rPr>
-      <w:rFonts w:asciiTheme="majorHAnsi" w:eastAsiaTheme="majorEastAsia" w:hAnsiTheme="majorHAnsi" w:cstheme="majorBidi"/>
+      <w:rFonts w:asciiTheme="majorHAnsi" w:eastAsiaTheme="majorEastAsia" w:hAnsiTheme="majorHAnsi" w:cstheme="majorBidi" w:ascii="맑은고딕" w:hAnsi="맑은고딕" w:eastAsia="맑은고딕" w:cs="맑은고딕"/>
       <w:i/>
       <w:iCs/>
       <w:color w:val="243F60" w:themeColor="accent1" w:themeShade="7F"/>
+      <w:sz w:val="22"/>
     </w:rPr>
   </w:style>
   <w:style w:type="paragraph" w:styleId="Heading7">
@@ -1547,10 +1490,11 @@
       <w:outlineLvl w:val="6"/>
     </w:pPr>
     <w:rPr>
-      <w:rFonts w:asciiTheme="majorHAnsi" w:eastAsiaTheme="majorEastAsia" w:hAnsiTheme="majorHAnsi" w:cstheme="majorBidi"/>
+      <w:rFonts w:asciiTheme="majorHAnsi" w:eastAsiaTheme="majorEastAsia" w:hAnsiTheme="majorHAnsi" w:cstheme="majorBidi" w:ascii="맑은고딕" w:hAnsi="맑은고딕" w:eastAsia="맑은고딕" w:cs="맑은고딕"/>
       <w:i/>
       <w:iCs/>
       <w:color w:val="404040" w:themeColor="text1" w:themeTint="BF"/>
+      <w:sz w:val="22"/>
     </w:rPr>
   </w:style>
   <w:style w:type="paragraph" w:styleId="Heading8">
@@ -1570,9 +1514,9 @@
       <w:outlineLvl w:val="7"/>
     </w:pPr>
     <w:rPr>
-      <w:rFonts w:asciiTheme="majorHAnsi" w:eastAsiaTheme="majorEastAsia" w:hAnsiTheme="majorHAnsi" w:cstheme="majorBidi"/>
+      <w:rFonts w:asciiTheme="majorHAnsi" w:eastAsiaTheme="majorEastAsia" w:hAnsiTheme="majorHAnsi" w:cstheme="majorBidi" w:ascii="맑은고딕" w:hAnsi="맑은고딕" w:eastAsia="맑은고딕" w:cs="맑은고딕"/>
       <w:color w:val="4F81BD" w:themeColor="accent1"/>
-      <w:sz w:val="20"/>
+      <w:sz w:val="22"/>
       <w:szCs w:val="20"/>
     </w:rPr>
   </w:style>
@@ -1593,11 +1537,11 @@
       <w:outlineLvl w:val="8"/>
     </w:pPr>
     <w:rPr>
-      <w:rFonts w:asciiTheme="majorHAnsi" w:eastAsiaTheme="majorEastAsia" w:hAnsiTheme="majorHAnsi" w:cstheme="majorBidi"/>
+      <w:rFonts w:asciiTheme="majorHAnsi" w:eastAsiaTheme="majorEastAsia" w:hAnsiTheme="majorHAnsi" w:cstheme="majorBidi" w:ascii="맑은고딕" w:hAnsi="맑은고딕" w:eastAsia="맑은고딕" w:cs="맑은고딕"/>
       <w:i/>
       <w:iCs/>
       <w:color w:val="404040" w:themeColor="text1" w:themeTint="BF"/>
-      <w:sz w:val="20"/>
+      <w:sz w:val="22"/>
       <w:szCs w:val="20"/>
     </w:rPr>
   </w:style>
@@ -1606,12 +1550,20 @@
     <w:uiPriority w:val="1"/>
     <w:semiHidden/>
     <w:unhideWhenUsed/>
+    <w:rPr>
+      <w:rFonts w:ascii="맑은고딕" w:hAnsi="맑은고딕" w:eastAsia="맑은고딕" w:cs="맑은고딕"/>
+      <w:sz w:val="22"/>
+    </w:rPr>
   </w:style>
   <w:style w:type="table" w:default="1" w:styleId="TableNormal">
     <w:name w:val="Normal Table"/>
     <w:uiPriority w:val="99"/>
     <w:semiHidden/>
     <w:unhideWhenUsed/>
+    <w:rPr>
+      <w:rFonts w:ascii="맑은고딕" w:hAnsi="맑은고딕" w:eastAsia="맑은고딕" w:cs="맑은고딕"/>
+      <w:sz w:val="22"/>
+    </w:rPr>
     <w:tblPr>
       <w:tblInd w:w="0" w:type="dxa"/>
       <w:tblCellMar>
@@ -1636,6 +1588,10 @@
     <w:pPr>
       <w:spacing w:after="0" w:line="240" w:lineRule="auto"/>
     </w:pPr>
+    <w:rPr>
+      <w:rFonts w:ascii="맑은고딕" w:hAnsi="맑은고딕" w:eastAsia="맑은고딕" w:cs="맑은고딕"/>
+      <w:sz w:val="22"/>
+    </w:rPr>
   </w:style>
   <w:style w:type="character" w:customStyle="1" w:styleId="Heading1Char">
     <w:name w:val="Heading 1 Char"/>
@@ -1644,11 +1600,11 @@
     <w:uiPriority w:val="9"/>
     <w:rsid w:val="00FC693F"/>
     <w:rPr>
-      <w:rFonts w:asciiTheme="majorHAnsi" w:eastAsiaTheme="majorEastAsia" w:hAnsiTheme="majorHAnsi" w:cstheme="majorBidi"/>
+      <w:rFonts w:asciiTheme="majorHAnsi" w:eastAsiaTheme="majorEastAsia" w:hAnsiTheme="majorHAnsi" w:cstheme="majorBidi" w:ascii="맑은고딕" w:hAnsi="맑은고딕" w:eastAsia="맑은고딕" w:cs="맑은고딕"/>
       <w:b/>
       <w:bCs/>
       <w:color w:val="365F91" w:themeColor="accent1" w:themeShade="BF"/>
-      <w:sz w:val="28"/>
+      <w:sz w:val="22"/>
       <w:szCs w:val="28"/>
     </w:rPr>
   </w:style>
@@ -1659,11 +1615,11 @@
     <w:uiPriority w:val="9"/>
     <w:rsid w:val="00FC693F"/>
     <w:rPr>
-      <w:rFonts w:asciiTheme="majorHAnsi" w:eastAsiaTheme="majorEastAsia" w:hAnsiTheme="majorHAnsi" w:cstheme="majorBidi"/>
+      <w:rFonts w:asciiTheme="majorHAnsi" w:eastAsiaTheme="majorEastAsia" w:hAnsiTheme="majorHAnsi" w:cstheme="majorBidi" w:ascii="맑은고딕" w:hAnsi="맑은고딕" w:eastAsia="맑은고딕" w:cs="맑은고딕"/>
       <w:b/>
       <w:bCs/>
       <w:color w:val="4F81BD" w:themeColor="accent1"/>
-      <w:sz w:val="26"/>
+      <w:sz w:val="22"/>
       <w:szCs w:val="26"/>
     </w:rPr>
   </w:style>
@@ -1674,10 +1630,11 @@
     <w:uiPriority w:val="9"/>
     <w:rsid w:val="00FC693F"/>
     <w:rPr>
-      <w:rFonts w:asciiTheme="majorHAnsi" w:eastAsiaTheme="majorEastAsia" w:hAnsiTheme="majorHAnsi" w:cstheme="majorBidi"/>
+      <w:rFonts w:asciiTheme="majorHAnsi" w:eastAsiaTheme="majorEastAsia" w:hAnsiTheme="majorHAnsi" w:cstheme="majorBidi" w:ascii="맑은고딕" w:hAnsi="맑은고딕" w:eastAsia="맑은고딕" w:cs="맑은고딕"/>
       <w:b/>
       <w:bCs/>
       <w:color w:val="4F81BD" w:themeColor="accent1"/>
+      <w:sz w:val="22"/>
     </w:rPr>
   </w:style>
   <w:style w:type="paragraph" w:styleId="Title">
@@ -1696,11 +1653,11 @@
       <w:contextualSpacing/>
     </w:pPr>
     <w:rPr>
-      <w:rFonts w:asciiTheme="majorHAnsi" w:eastAsiaTheme="majorEastAsia" w:hAnsiTheme="majorHAnsi" w:cstheme="majorBidi"/>
+      <w:rFonts w:asciiTheme="majorHAnsi" w:eastAsiaTheme="majorEastAsia" w:hAnsiTheme="majorHAnsi" w:cstheme="majorBidi" w:ascii="맑은고딕" w:hAnsi="맑은고딕" w:eastAsia="맑은고딕" w:cs="맑은고딕"/>
       <w:color w:val="17365D" w:themeColor="text2" w:themeShade="BF"/>
       <w:spacing w:val="5"/>
       <w:kern w:val="28"/>
-      <w:sz w:val="52"/>
+      <w:sz w:val="22"/>
       <w:szCs w:val="52"/>
     </w:rPr>
   </w:style>
@@ -1711,11 +1668,11 @@
     <w:uiPriority w:val="10"/>
     <w:rsid w:val="00FC693F"/>
     <w:rPr>
-      <w:rFonts w:asciiTheme="majorHAnsi" w:eastAsiaTheme="majorEastAsia" w:hAnsiTheme="majorHAnsi" w:cstheme="majorBidi"/>
+      <w:rFonts w:asciiTheme="majorHAnsi" w:eastAsiaTheme="majorEastAsia" w:hAnsiTheme="majorHAnsi" w:cstheme="majorBidi" w:ascii="맑은고딕" w:hAnsi="맑은고딕" w:eastAsia="맑은고딕" w:cs="맑은고딕"/>
       <w:color w:val="17365D" w:themeColor="text2" w:themeShade="BF"/>
       <w:spacing w:val="5"/>
       <w:kern w:val="28"/>
-      <w:sz w:val="52"/>
+      <w:sz w:val="22"/>
       <w:szCs w:val="52"/>
     </w:rPr>
   </w:style>
@@ -1733,12 +1690,12 @@
       </w:numPr>
     </w:pPr>
     <w:rPr>
-      <w:rFonts w:asciiTheme="majorHAnsi" w:eastAsiaTheme="majorEastAsia" w:hAnsiTheme="majorHAnsi" w:cstheme="majorBidi"/>
+      <w:rFonts w:asciiTheme="majorHAnsi" w:eastAsiaTheme="majorEastAsia" w:hAnsiTheme="majorHAnsi" w:cstheme="majorBidi" w:ascii="맑은고딕" w:hAnsi="맑은고딕" w:eastAsia="맑은고딕" w:cs="맑은고딕"/>
       <w:i/>
       <w:iCs/>
       <w:color w:val="4F81BD" w:themeColor="accent1"/>
       <w:spacing w:val="15"/>
-      <w:sz w:val="24"/>
+      <w:sz w:val="22"/>
       <w:szCs w:val="24"/>
     </w:rPr>
   </w:style>
@@ -1749,12 +1706,12 @@
     <w:uiPriority w:val="11"/>
     <w:rsid w:val="00FC693F"/>
     <w:rPr>
-      <w:rFonts w:asciiTheme="majorHAnsi" w:eastAsiaTheme="majorEastAsia" w:hAnsiTheme="majorHAnsi" w:cstheme="majorBidi"/>
+      <w:rFonts w:asciiTheme="majorHAnsi" w:eastAsiaTheme="majorEastAsia" w:hAnsiTheme="majorHAnsi" w:cstheme="majorBidi" w:ascii="맑은고딕" w:hAnsi="맑은고딕" w:eastAsia="맑은고딕" w:cs="맑은고딕"/>
       <w:i/>
       <w:iCs/>
       <w:color w:val="4F81BD" w:themeColor="accent1"/>
       <w:spacing w:val="15"/>
-      <w:sz w:val="24"/>
+      <w:sz w:val="22"/>
       <w:szCs w:val="24"/>
     </w:rPr>
   </w:style>
@@ -1768,6 +1725,10 @@
       <w:ind w:left="720"/>
       <w:contextualSpacing/>
     </w:pPr>
+    <w:rPr>
+      <w:rFonts w:ascii="맑은고딕" w:hAnsi="맑은고딕" w:eastAsia="맑은고딕" w:cs="맑은고딕"/>
+      <w:sz w:val="22"/>
+    </w:rPr>
   </w:style>
   <w:style w:type="paragraph" w:styleId="BodyText">
     <w:name w:val="Body Text"/>
@@ -1779,6 +1740,10 @@
     <w:pPr>
       <w:spacing w:after="120"/>
     </w:pPr>
+    <w:rPr>
+      <w:rFonts w:ascii="맑은고딕" w:hAnsi="맑은고딕" w:eastAsia="맑은고딕" w:cs="맑은고딕"/>
+      <w:sz w:val="22"/>
+    </w:rPr>
   </w:style>
   <w:style w:type="character" w:customStyle="1" w:styleId="BodyTextChar">
     <w:name w:val="Body Text Char"/>
@@ -1786,6 +1751,10 @@
     <w:link w:val="BodyText"/>
     <w:uiPriority w:val="99"/>
     <w:rsid w:val="00AA1D8D"/>
+    <w:rPr>
+      <w:rFonts w:ascii="맑은고딕" w:hAnsi="맑은고딕" w:eastAsia="맑은고딕" w:cs="맑은고딕"/>
+      <w:sz w:val="22"/>
+    </w:rPr>
   </w:style>
   <w:style w:type="paragraph" w:styleId="BodyText2">
     <w:name w:val="Body Text 2"/>
@@ -1797,6 +1766,10 @@
     <w:pPr>
       <w:spacing w:after="120" w:line="480" w:lineRule="auto"/>
     </w:pPr>
+    <w:rPr>
+      <w:rFonts w:ascii="맑은고딕" w:hAnsi="맑은고딕" w:eastAsia="맑은고딕" w:cs="맑은고딕"/>
+      <w:sz w:val="22"/>
+    </w:rPr>
   </w:style>
   <w:style w:type="character" w:customStyle="1" w:styleId="BodyText2Char">
     <w:name w:val="Body Text 2 Char"/>
@@ -1804,6 +1777,10 @@
     <w:link w:val="BodyText2"/>
     <w:uiPriority w:val="99"/>
     <w:rsid w:val="00AA1D8D"/>
+    <w:rPr>
+      <w:rFonts w:ascii="맑은고딕" w:hAnsi="맑은고딕" w:eastAsia="맑은고딕" w:cs="맑은고딕"/>
+      <w:sz w:val="22"/>
+    </w:rPr>
   </w:style>
   <w:style w:type="paragraph" w:styleId="BodyText3">
     <w:name w:val="Body Text 3"/>
@@ -1816,7 +1793,8 @@
       <w:spacing w:after="120"/>
     </w:pPr>
     <w:rPr>
-      <w:sz w:val="16"/>
+      <w:rFonts w:ascii="맑은고딕" w:hAnsi="맑은고딕" w:eastAsia="맑은고딕" w:cs="맑은고딕"/>
+      <w:sz w:val="22"/>
       <w:szCs w:val="16"/>
     </w:rPr>
   </w:style>
@@ -1827,7 +1805,8 @@
     <w:uiPriority w:val="99"/>
     <w:rsid w:val="00AA1D8D"/>
     <w:rPr>
-      <w:sz w:val="16"/>
+      <w:rFonts w:ascii="맑은고딕" w:hAnsi="맑은고딕" w:eastAsia="맑은고딕" w:cs="맑은고딕"/>
+      <w:sz w:val="22"/>
       <w:szCs w:val="16"/>
     </w:rPr>
   </w:style>
@@ -1841,6 +1820,10 @@
       <w:ind w:left="360" w:hanging="360"/>
       <w:contextualSpacing/>
     </w:pPr>
+    <w:rPr>
+      <w:rFonts w:ascii="맑은고딕" w:hAnsi="맑은고딕" w:eastAsia="맑은고딕" w:cs="맑은고딕"/>
+      <w:sz w:val="22"/>
+    </w:rPr>
   </w:style>
   <w:style w:type="paragraph" w:styleId="List2">
     <w:name w:val="List 2"/>
@@ -1852,6 +1835,10 @@
       <w:ind w:left="720" w:hanging="360"/>
       <w:contextualSpacing/>
     </w:pPr>
+    <w:rPr>
+      <w:rFonts w:ascii="맑은고딕" w:hAnsi="맑은고딕" w:eastAsia="맑은고딕" w:cs="맑은고딕"/>
+      <w:sz w:val="22"/>
+    </w:rPr>
   </w:style>
   <w:style w:type="paragraph" w:styleId="List3">
     <w:name w:val="List 3"/>
@@ -1863,6 +1850,10 @@
       <w:ind w:left="1080" w:hanging="360"/>
       <w:contextualSpacing/>
     </w:pPr>
+    <w:rPr>
+      <w:rFonts w:ascii="맑은고딕" w:hAnsi="맑은고딕" w:eastAsia="맑은고딕" w:cs="맑은고딕"/>
+      <w:sz w:val="22"/>
+    </w:rPr>
   </w:style>
   <w:style w:type="paragraph" w:styleId="ListBullet">
     <w:name w:val="List Bullet"/>
@@ -1874,12 +1865,10 @@
       <w:numPr>
         <w:numId w:val="1"/>
       </w:numPr>
-      <w:spacing w:after="80" w:before="0" w:line="276" w:lineRule="auto"/>
       <w:contextualSpacing/>
     </w:pPr>
     <w:rPr>
-      <w:rFonts w:ascii="Malgun Gothic" w:hAnsi="Malgun Gothic" w:cs="Malgun Gothic" w:eastAsia="맑은 고딕"/>
-      <w:color w:val="1F2A37"/>
+      <w:rFonts w:ascii="맑은고딕" w:hAnsi="맑은고딕" w:eastAsia="맑은고딕" w:cs="맑은고딕"/>
       <w:sz w:val="22"/>
     </w:rPr>
   </w:style>
@@ -1895,6 +1884,10 @@
       </w:numPr>
       <w:contextualSpacing/>
     </w:pPr>
+    <w:rPr>
+      <w:rFonts w:ascii="맑은고딕" w:hAnsi="맑은고딕" w:eastAsia="맑은고딕" w:cs="맑은고딕"/>
+      <w:sz w:val="22"/>
+    </w:rPr>
   </w:style>
   <w:style w:type="paragraph" w:styleId="ListBullet3">
     <w:name w:val="List Bullet 3"/>
@@ -1908,6 +1901,10 @@
       </w:numPr>
       <w:contextualSpacing/>
     </w:pPr>
+    <w:rPr>
+      <w:rFonts w:ascii="맑은고딕" w:hAnsi="맑은고딕" w:eastAsia="맑은고딕" w:cs="맑은고딕"/>
+      <w:sz w:val="22"/>
+    </w:rPr>
   </w:style>
   <w:style w:type="paragraph" w:styleId="ListNumber">
     <w:name w:val="List Number"/>
@@ -1919,12 +1916,10 @@
       <w:numPr>
         <w:numId w:val="5"/>
       </w:numPr>
-      <w:spacing w:after="80" w:before="0" w:line="276" w:lineRule="auto"/>
       <w:contextualSpacing/>
     </w:pPr>
     <w:rPr>
-      <w:rFonts w:ascii="Malgun Gothic" w:hAnsi="Malgun Gothic" w:cs="Malgun Gothic" w:eastAsia="맑은 고딕"/>
-      <w:color w:val="1F2A37"/>
+      <w:rFonts w:ascii="맑은고딕" w:hAnsi="맑은고딕" w:eastAsia="맑은고딕" w:cs="맑은고딕"/>
       <w:sz w:val="22"/>
     </w:rPr>
   </w:style>
@@ -1940,6 +1935,10 @@
       </w:numPr>
       <w:contextualSpacing/>
     </w:pPr>
+    <w:rPr>
+      <w:rFonts w:ascii="맑은고딕" w:hAnsi="맑은고딕" w:eastAsia="맑은고딕" w:cs="맑은고딕"/>
+      <w:sz w:val="22"/>
+    </w:rPr>
   </w:style>
   <w:style w:type="paragraph" w:styleId="ListNumber3">
     <w:name w:val="List Number 3"/>
@@ -1953,6 +1952,10 @@
       </w:numPr>
       <w:contextualSpacing/>
     </w:pPr>
+    <w:rPr>
+      <w:rFonts w:ascii="맑은고딕" w:hAnsi="맑은고딕" w:eastAsia="맑은고딕" w:cs="맑은고딕"/>
+      <w:sz w:val="22"/>
+    </w:rPr>
   </w:style>
   <w:style w:type="paragraph" w:styleId="ListContinue">
     <w:name w:val="List Continue"/>
@@ -1965,6 +1968,10 @@
       <w:ind w:left="360"/>
       <w:contextualSpacing/>
     </w:pPr>
+    <w:rPr>
+      <w:rFonts w:ascii="맑은고딕" w:hAnsi="맑은고딕" w:eastAsia="맑은고딕" w:cs="맑은고딕"/>
+      <w:sz w:val="22"/>
+    </w:rPr>
   </w:style>
   <w:style w:type="paragraph" w:styleId="ListContinue2">
     <w:name w:val="List Continue 2"/>
@@ -1977,6 +1984,10 @@
       <w:ind w:left="720"/>
       <w:contextualSpacing/>
     </w:pPr>
+    <w:rPr>
+      <w:rFonts w:ascii="맑은고딕" w:hAnsi="맑은고딕" w:eastAsia="맑은고딕" w:cs="맑은고딕"/>
+      <w:sz w:val="22"/>
+    </w:rPr>
   </w:style>
   <w:style w:type="paragraph" w:styleId="ListContinue3">
     <w:name w:val="List Continue 3"/>
@@ -1989,6 +2000,10 @@
       <w:ind w:left="1080"/>
       <w:contextualSpacing/>
     </w:pPr>
+    <w:rPr>
+      <w:rFonts w:ascii="맑은고딕" w:hAnsi="맑은고딕" w:eastAsia="맑은고딕" w:cs="맑은고딕"/>
+      <w:sz w:val="22"/>
+    </w:rPr>
   </w:style>
   <w:style w:type="paragraph" w:styleId="MacroText">
     <w:name w:val="macro"/>
@@ -2008,8 +2023,8 @@
       </w:tabs>
     </w:pPr>
     <w:rPr>
-      <w:rFonts w:ascii="Courier" w:hAnsi="Courier"/>
-      <w:sz w:val="20"/>
+      <w:rFonts w:ascii="맑은고딕" w:hAnsi="맑은고딕" w:eastAsia="맑은고딕" w:cs="맑은고딕"/>
+      <w:sz w:val="22"/>
       <w:szCs w:val="20"/>
     </w:rPr>
   </w:style>
@@ -2020,8 +2035,8 @@
     <w:uiPriority w:val="99"/>
     <w:rsid w:val="0029639D"/>
     <w:rPr>
-      <w:rFonts w:ascii="Courier" w:hAnsi="Courier"/>
-      <w:sz w:val="20"/>
+      <w:rFonts w:ascii="맑은고딕" w:hAnsi="맑은고딕" w:eastAsia="맑은고딕" w:cs="맑은고딕"/>
+      <w:sz w:val="22"/>
       <w:szCs w:val="20"/>
     </w:rPr>
   </w:style>
@@ -2034,9 +2049,11 @@
     <w:qFormat/>
     <w:rsid w:val="00FC693F"/>
     <w:rPr>
+      <w:rFonts w:ascii="맑은고딕" w:hAnsi="맑은고딕" w:eastAsia="맑은고딕" w:cs="맑은고딕"/>
       <w:i/>
       <w:iCs/>
       <w:color w:val="000000" w:themeColor="text1"/>
+      <w:sz w:val="22"/>
     </w:rPr>
   </w:style>
   <w:style w:type="character" w:customStyle="1" w:styleId="QuoteChar">
@@ -2046,9 +2063,11 @@
     <w:uiPriority w:val="29"/>
     <w:rsid w:val="00FC693F"/>
     <w:rPr>
+      <w:rFonts w:ascii="맑은고딕" w:hAnsi="맑은고딕" w:eastAsia="맑은고딕" w:cs="맑은고딕"/>
       <w:i/>
       <w:iCs/>
       <w:color w:val="000000" w:themeColor="text1"/>
+      <w:sz w:val="22"/>
     </w:rPr>
   </w:style>
   <w:style w:type="character" w:customStyle="1" w:styleId="Heading4Char">
@@ -2059,12 +2078,13 @@
     <w:semiHidden/>
     <w:rsid w:val="00FC693F"/>
     <w:rPr>
-      <w:rFonts w:asciiTheme="majorHAnsi" w:eastAsiaTheme="majorEastAsia" w:hAnsiTheme="majorHAnsi" w:cstheme="majorBidi"/>
+      <w:rFonts w:asciiTheme="majorHAnsi" w:eastAsiaTheme="majorEastAsia" w:hAnsiTheme="majorHAnsi" w:cstheme="majorBidi" w:ascii="맑은고딕" w:hAnsi="맑은고딕" w:eastAsia="맑은고딕" w:cs="맑은고딕"/>
       <w:b/>
       <w:bCs/>
       <w:i/>
       <w:iCs/>
       <w:color w:val="4F81BD" w:themeColor="accent1"/>
+      <w:sz w:val="22"/>
     </w:rPr>
   </w:style>
   <w:style w:type="character" w:customStyle="1" w:styleId="Heading5Char">
@@ -2075,8 +2095,9 @@
     <w:semiHidden/>
     <w:rsid w:val="00FC693F"/>
     <w:rPr>
-      <w:rFonts w:asciiTheme="majorHAnsi" w:eastAsiaTheme="majorEastAsia" w:hAnsiTheme="majorHAnsi" w:cstheme="majorBidi"/>
+      <w:rFonts w:asciiTheme="majorHAnsi" w:eastAsiaTheme="majorEastAsia" w:hAnsiTheme="majorHAnsi" w:cstheme="majorBidi" w:ascii="맑은고딕" w:hAnsi="맑은고딕" w:eastAsia="맑은고딕" w:cs="맑은고딕"/>
       <w:color w:val="243F60" w:themeColor="accent1" w:themeShade="7F"/>
+      <w:sz w:val="22"/>
     </w:rPr>
   </w:style>
   <w:style w:type="character" w:customStyle="1" w:styleId="Heading6Char">
@@ -2087,10 +2108,11 @@
     <w:semiHidden/>
     <w:rsid w:val="00FC693F"/>
     <w:rPr>
-      <w:rFonts w:asciiTheme="majorHAnsi" w:eastAsiaTheme="majorEastAsia" w:hAnsiTheme="majorHAnsi" w:cstheme="majorBidi"/>
+      <w:rFonts w:asciiTheme="majorHAnsi" w:eastAsiaTheme="majorEastAsia" w:hAnsiTheme="majorHAnsi" w:cstheme="majorBidi" w:ascii="맑은고딕" w:hAnsi="맑은고딕" w:eastAsia="맑은고딕" w:cs="맑은고딕"/>
       <w:i/>
       <w:iCs/>
       <w:color w:val="243F60" w:themeColor="accent1" w:themeShade="7F"/>
+      <w:sz w:val="22"/>
     </w:rPr>
   </w:style>
   <w:style w:type="character" w:customStyle="1" w:styleId="Heading7Char">
@@ -2101,10 +2123,11 @@
     <w:semiHidden/>
     <w:rsid w:val="00FC693F"/>
     <w:rPr>
-      <w:rFonts w:asciiTheme="majorHAnsi" w:eastAsiaTheme="majorEastAsia" w:hAnsiTheme="majorHAnsi" w:cstheme="majorBidi"/>
+      <w:rFonts w:asciiTheme="majorHAnsi" w:eastAsiaTheme="majorEastAsia" w:hAnsiTheme="majorHAnsi" w:cstheme="majorBidi" w:ascii="맑은고딕" w:hAnsi="맑은고딕" w:eastAsia="맑은고딕" w:cs="맑은고딕"/>
       <w:i/>
       <w:iCs/>
       <w:color w:val="404040" w:themeColor="text1" w:themeTint="BF"/>
+      <w:sz w:val="22"/>
     </w:rPr>
   </w:style>
   <w:style w:type="character" w:customStyle="1" w:styleId="Heading8Char">
@@ -2115,9 +2138,9 @@
     <w:semiHidden/>
     <w:rsid w:val="00FC693F"/>
     <w:rPr>
-      <w:rFonts w:asciiTheme="majorHAnsi" w:eastAsiaTheme="majorEastAsia" w:hAnsiTheme="majorHAnsi" w:cstheme="majorBidi"/>
+      <w:rFonts w:asciiTheme="majorHAnsi" w:eastAsiaTheme="majorEastAsia" w:hAnsiTheme="majorHAnsi" w:cstheme="majorBidi" w:ascii="맑은고딕" w:hAnsi="맑은고딕" w:eastAsia="맑은고딕" w:cs="맑은고딕"/>
       <w:color w:val="4F81BD" w:themeColor="accent1"/>
-      <w:sz w:val="20"/>
+      <w:sz w:val="22"/>
       <w:szCs w:val="20"/>
     </w:rPr>
   </w:style>
@@ -2129,11 +2152,11 @@
     <w:semiHidden/>
     <w:rsid w:val="00FC693F"/>
     <w:rPr>
-      <w:rFonts w:asciiTheme="majorHAnsi" w:eastAsiaTheme="majorEastAsia" w:hAnsiTheme="majorHAnsi" w:cstheme="majorBidi"/>
+      <w:rFonts w:asciiTheme="majorHAnsi" w:eastAsiaTheme="majorEastAsia" w:hAnsiTheme="majorHAnsi" w:cstheme="majorBidi" w:ascii="맑은고딕" w:hAnsi="맑은고딕" w:eastAsia="맑은고딕" w:cs="맑은고딕"/>
       <w:i/>
       <w:iCs/>
       <w:color w:val="404040" w:themeColor="text1" w:themeTint="BF"/>
-      <w:sz w:val="20"/>
+      <w:sz w:val="22"/>
       <w:szCs w:val="20"/>
     </w:rPr>
   </w:style>
@@ -2150,10 +2173,11 @@
       <w:spacing w:line="240" w:lineRule="auto"/>
     </w:pPr>
     <w:rPr>
+      <w:rFonts w:ascii="맑은고딕" w:hAnsi="맑은고딕" w:eastAsia="맑은고딕" w:cs="맑은고딕"/>
       <w:b/>
       <w:bCs/>
       <w:color w:val="4F81BD" w:themeColor="accent1"/>
-      <w:sz w:val="18"/>
+      <w:sz w:val="22"/>
       <w:szCs w:val="18"/>
     </w:rPr>
   </w:style>
@@ -2164,8 +2188,10 @@
     <w:qFormat/>
     <w:rsid w:val="00FC693F"/>
     <w:rPr>
+      <w:rFonts w:ascii="맑은고딕" w:hAnsi="맑은고딕" w:eastAsia="맑은고딕" w:cs="맑은고딕"/>
       <w:b/>
       <w:bCs/>
+      <w:sz w:val="22"/>
     </w:rPr>
   </w:style>
   <w:style w:type="character" w:styleId="Emphasis">
@@ -2175,8 +2201,10 @@
     <w:qFormat/>
     <w:rsid w:val="00FC693F"/>
     <w:rPr>
+      <w:rFonts w:ascii="맑은고딕" w:hAnsi="맑은고딕" w:eastAsia="맑은고딕" w:cs="맑은고딕"/>
       <w:i/>
       <w:iCs/>
+      <w:sz w:val="22"/>
     </w:rPr>
   </w:style>
   <w:style w:type="paragraph" w:styleId="IntenseQuote">
@@ -2195,11 +2223,13 @@
       <w:ind w:left="936" w:right="936"/>
     </w:pPr>
     <w:rPr>
+      <w:rFonts w:ascii="맑은고딕" w:hAnsi="맑은고딕" w:eastAsia="맑은고딕" w:cs="맑은고딕"/>
       <w:b/>
       <w:bCs/>
       <w:i/>
       <w:iCs/>
       <w:color w:val="4F81BD" w:themeColor="accent1"/>
+      <w:sz w:val="22"/>
     </w:rPr>
   </w:style>
   <w:style w:type="character" w:customStyle="1" w:styleId="IntenseQuoteChar">
@@ -2209,11 +2239,13 @@
     <w:uiPriority w:val="30"/>
     <w:rsid w:val="00FC693F"/>
     <w:rPr>
+      <w:rFonts w:ascii="맑은고딕" w:hAnsi="맑은고딕" w:eastAsia="맑은고딕" w:cs="맑은고딕"/>
       <w:b/>
       <w:bCs/>
       <w:i/>
       <w:iCs/>
       <w:color w:val="4F81BD" w:themeColor="accent1"/>
+      <w:sz w:val="22"/>
     </w:rPr>
   </w:style>
   <w:style w:type="character" w:styleId="SubtleEmphasis">
@@ -2223,9 +2255,11 @@
     <w:qFormat/>
     <w:rsid w:val="00FC693F"/>
     <w:rPr>
+      <w:rFonts w:ascii="맑은고딕" w:hAnsi="맑은고딕" w:eastAsia="맑은고딕" w:cs="맑은고딕"/>
       <w:i/>
       <w:iCs/>
       <w:color w:val="808080" w:themeColor="text1" w:themeTint="7F"/>
+      <w:sz w:val="22"/>
     </w:rPr>
   </w:style>
   <w:style w:type="character" w:styleId="IntenseEmphasis">
@@ -2235,11 +2269,13 @@
     <w:qFormat/>
     <w:rsid w:val="00FC693F"/>
     <w:rPr>
+      <w:rFonts w:ascii="맑은고딕" w:hAnsi="맑은고딕" w:eastAsia="맑은고딕" w:cs="맑은고딕"/>
       <w:b/>
       <w:bCs/>
       <w:i/>
       <w:iCs/>
       <w:color w:val="4F81BD" w:themeColor="accent1"/>
+      <w:sz w:val="22"/>
     </w:rPr>
   </w:style>
   <w:style w:type="character" w:styleId="SubtleReference">
@@ -2249,8 +2285,10 @@
     <w:qFormat/>
     <w:rsid w:val="00FC693F"/>
     <w:rPr>
+      <w:rFonts w:ascii="맑은고딕" w:hAnsi="맑은고딕" w:eastAsia="맑은고딕" w:cs="맑은고딕"/>
       <w:smallCaps/>
       <w:color w:val="C0504D" w:themeColor="accent2"/>
+      <w:sz w:val="22"/>
       <w:u w:val="single"/>
     </w:rPr>
   </w:style>
@@ -2261,11 +2299,13 @@
     <w:qFormat/>
     <w:rsid w:val="00FC693F"/>
     <w:rPr>
+      <w:rFonts w:ascii="맑은고딕" w:hAnsi="맑은고딕" w:eastAsia="맑은고딕" w:cs="맑은고딕"/>
       <w:b/>
       <w:bCs/>
       <w:smallCaps/>
       <w:color w:val="C0504D" w:themeColor="accent2"/>
       <w:spacing w:val="5"/>
+      <w:sz w:val="22"/>
       <w:u w:val="single"/>
     </w:rPr>
   </w:style>
@@ -2276,10 +2316,12 @@
     <w:qFormat/>
     <w:rsid w:val="00FC693F"/>
     <w:rPr>
+      <w:rFonts w:ascii="맑은고딕" w:hAnsi="맑은고딕" w:eastAsia="맑은고딕" w:cs="맑은고딕"/>
       <w:b/>
       <w:bCs/>
       <w:smallCaps/>
       <w:spacing w:val="5"/>
+      <w:sz w:val="22"/>
     </w:rPr>
   </w:style>
   <w:style w:type="paragraph" w:styleId="TOCHeading">
@@ -2294,6 +2336,10 @@
     <w:pPr>
       <w:outlineLvl w:val="9"/>
     </w:pPr>
+    <w:rPr>
+      <w:rFonts w:ascii="맑은고딕" w:hAnsi="맑은고딕" w:eastAsia="맑은고딕" w:cs="맑은고딕"/>
+      <w:sz w:val="22"/>
+    </w:rPr>
   </w:style>
   <w:style w:type="table" w:styleId="TableGrid">
     <w:name w:val="Table Grid"/>
@@ -2303,6 +2349,10 @@
     <w:pPr>
       <w:spacing w:after="0" w:line="240" w:lineRule="auto"/>
     </w:pPr>
+    <w:rPr>
+      <w:rFonts w:ascii="맑은고딕" w:hAnsi="맑은고딕" w:eastAsia="맑은고딕" w:cs="맑은고딕"/>
+      <w:sz w:val="22"/>
+    </w:rPr>
     <w:tblPr>
       <w:tblInd w:w="0" w:type="dxa"/>
       <w:tblBorders>
@@ -2330,7 +2380,9 @@
       <w:spacing w:after="0" w:line="240" w:lineRule="auto"/>
     </w:pPr>
     <w:rPr>
+      <w:rFonts w:ascii="맑은고딕" w:hAnsi="맑은고딕" w:eastAsia="맑은고딕" w:cs="맑은고딕"/>
       <w:color w:val="000000" w:themeColor="text1" w:themeShade="BF"/>
+      <w:sz w:val="22"/>
     </w:rPr>
     <w:tblPr>
       <w:tblStyleRowBandSize w:val="1"/>
@@ -2433,7 +2485,9 @@
       <w:spacing w:after="0" w:line="240" w:lineRule="auto"/>
     </w:pPr>
     <w:rPr>
+      <w:rFonts w:ascii="맑은고딕" w:hAnsi="맑은고딕" w:eastAsia="맑은고딕" w:cs="맑은고딕"/>
       <w:color w:val="365F91" w:themeColor="accent1" w:themeShade="BF"/>
+      <w:sz w:val="22"/>
     </w:rPr>
     <w:tblPr>
       <w:tblStyleRowBandSize w:val="1"/>
@@ -2536,7 +2590,9 @@
       <w:spacing w:after="0" w:line="240" w:lineRule="auto"/>
     </w:pPr>
     <w:rPr>
+      <w:rFonts w:ascii="맑은고딕" w:hAnsi="맑은고딕" w:eastAsia="맑은고딕" w:cs="맑은고딕"/>
       <w:color w:val="943634" w:themeColor="accent2" w:themeShade="BF"/>
+      <w:sz w:val="22"/>
     </w:rPr>
     <w:tblPr>
       <w:tblStyleRowBandSize w:val="1"/>
@@ -2639,7 +2695,9 @@
       <w:spacing w:after="0" w:line="240" w:lineRule="auto"/>
     </w:pPr>
     <w:rPr>
+      <w:rFonts w:ascii="맑은고딕" w:hAnsi="맑은고딕" w:eastAsia="맑은고딕" w:cs="맑은고딕"/>
       <w:color w:val="76923C" w:themeColor="accent3" w:themeShade="BF"/>
+      <w:sz w:val="22"/>
     </w:rPr>
     <w:tblPr>
       <w:tblStyleRowBandSize w:val="1"/>
@@ -2742,7 +2800,9 @@
       <w:spacing w:after="0" w:line="240" w:lineRule="auto"/>
     </w:pPr>
     <w:rPr>
+      <w:rFonts w:ascii="맑은고딕" w:hAnsi="맑은고딕" w:eastAsia="맑은고딕" w:cs="맑은고딕"/>
       <w:color w:val="5F497A" w:themeColor="accent4" w:themeShade="BF"/>
+      <w:sz w:val="22"/>
     </w:rPr>
     <w:tblPr>
       <w:tblStyleRowBandSize w:val="1"/>
@@ -2845,7 +2905,9 @@
       <w:spacing w:after="0" w:line="240" w:lineRule="auto"/>
     </w:pPr>
     <w:rPr>
+      <w:rFonts w:ascii="맑은고딕" w:hAnsi="맑은고딕" w:eastAsia="맑은고딕" w:cs="맑은고딕"/>
       <w:color w:val="31849B" w:themeColor="accent5" w:themeShade="BF"/>
+      <w:sz w:val="22"/>
     </w:rPr>
     <w:tblPr>
       <w:tblStyleRowBandSize w:val="1"/>
@@ -2948,7 +3010,9 @@
       <w:spacing w:after="0" w:line="240" w:lineRule="auto"/>
     </w:pPr>
     <w:rPr>
+      <w:rFonts w:ascii="맑은고딕" w:hAnsi="맑은고딕" w:eastAsia="맑은고딕" w:cs="맑은고딕"/>
       <w:color w:val="E36C0A" w:themeColor="accent6" w:themeShade="BF"/>
+      <w:sz w:val="22"/>
     </w:rPr>
     <w:tblPr>
       <w:tblStyleRowBandSize w:val="1"/>
@@ -3050,6 +3114,10 @@
     <w:pPr>
       <w:spacing w:after="0" w:line="240" w:lineRule="auto"/>
     </w:pPr>
+    <w:rPr>
+      <w:rFonts w:ascii="맑은고딕" w:hAnsi="맑은고딕" w:eastAsia="맑은고딕" w:cs="맑은고딕"/>
+      <w:sz w:val="22"/>
+    </w:rPr>
     <w:tblPr>
       <w:tblStyleRowBandSize w:val="1"/>
       <w:tblStyleColBandSize w:val="1"/>
@@ -3142,6 +3210,10 @@
     <w:pPr>
       <w:spacing w:after="0" w:line="240" w:lineRule="auto"/>
     </w:pPr>
+    <w:rPr>
+      <w:rFonts w:ascii="맑은고딕" w:hAnsi="맑은고딕" w:eastAsia="맑은고딕" w:cs="맑은고딕"/>
+      <w:sz w:val="22"/>
+    </w:rPr>
     <w:tblPr>
       <w:tblStyleRowBandSize w:val="1"/>
       <w:tblStyleColBandSize w:val="1"/>
@@ -3234,6 +3306,10 @@
     <w:pPr>
       <w:spacing w:after="0" w:line="240" w:lineRule="auto"/>
     </w:pPr>
+    <w:rPr>
+      <w:rFonts w:ascii="맑은고딕" w:hAnsi="맑은고딕" w:eastAsia="맑은고딕" w:cs="맑은고딕"/>
+      <w:sz w:val="22"/>
+    </w:rPr>
     <w:tblPr>
       <w:tblStyleRowBandSize w:val="1"/>
       <w:tblStyleColBandSize w:val="1"/>
@@ -3326,6 +3402,10 @@
     <w:pPr>
       <w:spacing w:after="0" w:line="240" w:lineRule="auto"/>
     </w:pPr>
+    <w:rPr>
+      <w:rFonts w:ascii="맑은고딕" w:hAnsi="맑은고딕" w:eastAsia="맑은고딕" w:cs="맑은고딕"/>
+      <w:sz w:val="22"/>
+    </w:rPr>
     <w:tblPr>
       <w:tblStyleRowBandSize w:val="1"/>
       <w:tblStyleColBandSize w:val="1"/>
@@ -3418,6 +3498,10 @@
     <w:pPr>
       <w:spacing w:after="0" w:line="240" w:lineRule="auto"/>
     </w:pPr>
+    <w:rPr>
+      <w:rFonts w:ascii="맑은고딕" w:hAnsi="맑은고딕" w:eastAsia="맑은고딕" w:cs="맑은고딕"/>
+      <w:sz w:val="22"/>
+    </w:rPr>
     <w:tblPr>
       <w:tblStyleRowBandSize w:val="1"/>
       <w:tblStyleColBandSize w:val="1"/>
@@ -3510,6 +3594,10 @@
     <w:pPr>
       <w:spacing w:after="0" w:line="240" w:lineRule="auto"/>
     </w:pPr>
+    <w:rPr>
+      <w:rFonts w:ascii="맑은고딕" w:hAnsi="맑은고딕" w:eastAsia="맑은고딕" w:cs="맑은고딕"/>
+      <w:sz w:val="22"/>
+    </w:rPr>
     <w:tblPr>
       <w:tblStyleRowBandSize w:val="1"/>
       <w:tblStyleColBandSize w:val="1"/>
@@ -3602,6 +3690,10 @@
     <w:pPr>
       <w:spacing w:after="0" w:line="240" w:lineRule="auto"/>
     </w:pPr>
+    <w:rPr>
+      <w:rFonts w:ascii="맑은고딕" w:hAnsi="맑은고딕" w:eastAsia="맑은고딕" w:cs="맑은고딕"/>
+      <w:sz w:val="22"/>
+    </w:rPr>
     <w:tblPr>
       <w:tblStyleRowBandSize w:val="1"/>
       <w:tblStyleColBandSize w:val="1"/>
@@ -3694,6 +3786,10 @@
     <w:pPr>
       <w:spacing w:after="0" w:line="240" w:lineRule="auto"/>
     </w:pPr>
+    <w:rPr>
+      <w:rFonts w:ascii="맑은고딕" w:hAnsi="맑은고딕" w:eastAsia="맑은고딕" w:cs="맑은고딕"/>
+      <w:sz w:val="22"/>
+    </w:rPr>
     <w:tblPr>
       <w:tblStyleRowBandSize w:val="1"/>
       <w:tblStyleColBandSize w:val="1"/>
@@ -3824,6 +3920,10 @@
     <w:pPr>
       <w:spacing w:after="0" w:line="240" w:lineRule="auto"/>
     </w:pPr>
+    <w:rPr>
+      <w:rFonts w:ascii="맑은고딕" w:hAnsi="맑은고딕" w:eastAsia="맑은고딕" w:cs="맑은고딕"/>
+      <w:sz w:val="22"/>
+    </w:rPr>
     <w:tblPr>
       <w:tblStyleRowBandSize w:val="1"/>
       <w:tblStyleColBandSize w:val="1"/>
@@ -3954,6 +4054,10 @@
     <w:pPr>
       <w:spacing w:after="0" w:line="240" w:lineRule="auto"/>
     </w:pPr>
+    <w:rPr>
+      <w:rFonts w:ascii="맑은고딕" w:hAnsi="맑은고딕" w:eastAsia="맑은고딕" w:cs="맑은고딕"/>
+      <w:sz w:val="22"/>
+    </w:rPr>
     <w:tblPr>
       <w:tblStyleRowBandSize w:val="1"/>
       <w:tblStyleColBandSize w:val="1"/>
@@ -4084,6 +4188,10 @@
     <w:pPr>
       <w:spacing w:after="0" w:line="240" w:lineRule="auto"/>
     </w:pPr>
+    <w:rPr>
+      <w:rFonts w:ascii="맑은고딕" w:hAnsi="맑은고딕" w:eastAsia="맑은고딕" w:cs="맑은고딕"/>
+      <w:sz w:val="22"/>
+    </w:rPr>
     <w:tblPr>
       <w:tblStyleRowBandSize w:val="1"/>
       <w:tblStyleColBandSize w:val="1"/>
@@ -4214,6 +4322,10 @@
     <w:pPr>
       <w:spacing w:after="0" w:line="240" w:lineRule="auto"/>
     </w:pPr>
+    <w:rPr>
+      <w:rFonts w:ascii="맑은고딕" w:hAnsi="맑은고딕" w:eastAsia="맑은고딕" w:cs="맑은고딕"/>
+      <w:sz w:val="22"/>
+    </w:rPr>
     <w:tblPr>
       <w:tblStyleRowBandSize w:val="1"/>
       <w:tblStyleColBandSize w:val="1"/>
@@ -4344,6 +4456,10 @@
     <w:pPr>
       <w:spacing w:after="0" w:line="240" w:lineRule="auto"/>
     </w:pPr>
+    <w:rPr>
+      <w:rFonts w:ascii="맑은고딕" w:hAnsi="맑은고딕" w:eastAsia="맑은고딕" w:cs="맑은고딕"/>
+      <w:sz w:val="22"/>
+    </w:rPr>
     <w:tblPr>
       <w:tblStyleRowBandSize w:val="1"/>
       <w:tblStyleColBandSize w:val="1"/>
@@ -4474,6 +4590,10 @@
     <w:pPr>
       <w:spacing w:after="0" w:line="240" w:lineRule="auto"/>
     </w:pPr>
+    <w:rPr>
+      <w:rFonts w:ascii="맑은고딕" w:hAnsi="맑은고딕" w:eastAsia="맑은고딕" w:cs="맑은고딕"/>
+      <w:sz w:val="22"/>
+    </w:rPr>
     <w:tblPr>
       <w:tblStyleRowBandSize w:val="1"/>
       <w:tblStyleColBandSize w:val="1"/>
@@ -4604,6 +4724,10 @@
     <w:pPr>
       <w:spacing w:after="0" w:line="240" w:lineRule="auto"/>
     </w:pPr>
+    <w:rPr>
+      <w:rFonts w:ascii="맑은고딕" w:hAnsi="맑은고딕" w:eastAsia="맑은고딕" w:cs="맑은고딕"/>
+      <w:sz w:val="22"/>
+    </w:rPr>
     <w:tblPr>
       <w:tblStyleRowBandSize w:val="1"/>
       <w:tblStyleColBandSize w:val="1"/>
@@ -4710,6 +4834,10 @@
     <w:pPr>
       <w:spacing w:after="0" w:line="240" w:lineRule="auto"/>
     </w:pPr>
+    <w:rPr>
+      <w:rFonts w:ascii="맑은고딕" w:hAnsi="맑은고딕" w:eastAsia="맑은고딕" w:cs="맑은고딕"/>
+      <w:sz w:val="22"/>
+    </w:rPr>
     <w:tblPr>
       <w:tblStyleRowBandSize w:val="1"/>
       <w:tblStyleColBandSize w:val="1"/>
@@ -4816,6 +4944,10 @@
     <w:pPr>
       <w:spacing w:after="0" w:line="240" w:lineRule="auto"/>
     </w:pPr>
+    <w:rPr>
+      <w:rFonts w:ascii="맑은고딕" w:hAnsi="맑은고딕" w:eastAsia="맑은고딕" w:cs="맑은고딕"/>
+      <w:sz w:val="22"/>
+    </w:rPr>
     <w:tblPr>
       <w:tblStyleRowBandSize w:val="1"/>
       <w:tblStyleColBandSize w:val="1"/>
@@ -4922,6 +5054,10 @@
     <w:pPr>
       <w:spacing w:after="0" w:line="240" w:lineRule="auto"/>
     </w:pPr>
+    <w:rPr>
+      <w:rFonts w:ascii="맑은고딕" w:hAnsi="맑은고딕" w:eastAsia="맑은고딕" w:cs="맑은고딕"/>
+      <w:sz w:val="22"/>
+    </w:rPr>
     <w:tblPr>
       <w:tblStyleRowBandSize w:val="1"/>
       <w:tblStyleColBandSize w:val="1"/>
@@ -5028,6 +5164,10 @@
     <w:pPr>
       <w:spacing w:after="0" w:line="240" w:lineRule="auto"/>
     </w:pPr>
+    <w:rPr>
+      <w:rFonts w:ascii="맑은고딕" w:hAnsi="맑은고딕" w:eastAsia="맑은고딕" w:cs="맑은고딕"/>
+      <w:sz w:val="22"/>
+    </w:rPr>
     <w:tblPr>
       <w:tblStyleRowBandSize w:val="1"/>
       <w:tblStyleColBandSize w:val="1"/>
@@ -5134,6 +5274,10 @@
     <w:pPr>
       <w:spacing w:after="0" w:line="240" w:lineRule="auto"/>
     </w:pPr>
+    <w:rPr>
+      <w:rFonts w:ascii="맑은고딕" w:hAnsi="맑은고딕" w:eastAsia="맑은고딕" w:cs="맑은고딕"/>
+      <w:sz w:val="22"/>
+    </w:rPr>
     <w:tblPr>
       <w:tblStyleRowBandSize w:val="1"/>
       <w:tblStyleColBandSize w:val="1"/>
@@ -5240,6 +5384,10 @@
     <w:pPr>
       <w:spacing w:after="0" w:line="240" w:lineRule="auto"/>
     </w:pPr>
+    <w:rPr>
+      <w:rFonts w:ascii="맑은고딕" w:hAnsi="맑은고딕" w:eastAsia="맑은고딕" w:cs="맑은고딕"/>
+      <w:sz w:val="22"/>
+    </w:rPr>
     <w:tblPr>
       <w:tblStyleRowBandSize w:val="1"/>
       <w:tblStyleColBandSize w:val="1"/>
@@ -5346,6 +5494,10 @@
     <w:pPr>
       <w:spacing w:after="0" w:line="240" w:lineRule="auto"/>
     </w:pPr>
+    <w:rPr>
+      <w:rFonts w:ascii="맑은고딕" w:hAnsi="맑은고딕" w:eastAsia="맑은고딕" w:cs="맑은고딕"/>
+      <w:sz w:val="22"/>
+    </w:rPr>
     <w:tblPr>
       <w:tblStyleRowBandSize w:val="1"/>
       <w:tblStyleColBandSize w:val="1"/>
@@ -5495,6 +5647,10 @@
     <w:pPr>
       <w:spacing w:after="0" w:line="240" w:lineRule="auto"/>
     </w:pPr>
+    <w:rPr>
+      <w:rFonts w:ascii="맑은고딕" w:hAnsi="맑은고딕" w:eastAsia="맑은고딕" w:cs="맑은고딕"/>
+      <w:sz w:val="22"/>
+    </w:rPr>
     <w:tblPr>
       <w:tblStyleRowBandSize w:val="1"/>
       <w:tblStyleColBandSize w:val="1"/>
@@ -5644,6 +5800,10 @@
     <w:pPr>
       <w:spacing w:after="0" w:line="240" w:lineRule="auto"/>
     </w:pPr>
+    <w:rPr>
+      <w:rFonts w:ascii="맑은고딕" w:hAnsi="맑은고딕" w:eastAsia="맑은고딕" w:cs="맑은고딕"/>
+      <w:sz w:val="22"/>
+    </w:rPr>
     <w:tblPr>
       <w:tblStyleRowBandSize w:val="1"/>
       <w:tblStyleColBandSize w:val="1"/>
@@ -5793,6 +5953,10 @@
     <w:pPr>
       <w:spacing w:after="0" w:line="240" w:lineRule="auto"/>
     </w:pPr>
+    <w:rPr>
+      <w:rFonts w:ascii="맑은고딕" w:hAnsi="맑은고딕" w:eastAsia="맑은고딕" w:cs="맑은고딕"/>
+      <w:sz w:val="22"/>
+    </w:rPr>
     <w:tblPr>
       <w:tblStyleRowBandSize w:val="1"/>
       <w:tblStyleColBandSize w:val="1"/>
@@ -5942,6 +6106,10 @@
     <w:pPr>
       <w:spacing w:after="0" w:line="240" w:lineRule="auto"/>
     </w:pPr>
+    <w:rPr>
+      <w:rFonts w:ascii="맑은고딕" w:hAnsi="맑은고딕" w:eastAsia="맑은고딕" w:cs="맑은고딕"/>
+      <w:sz w:val="22"/>
+    </w:rPr>
     <w:tblPr>
       <w:tblStyleRowBandSize w:val="1"/>
       <w:tblStyleColBandSize w:val="1"/>
@@ -6091,6 +6259,10 @@
     <w:pPr>
       <w:spacing w:after="0" w:line="240" w:lineRule="auto"/>
     </w:pPr>
+    <w:rPr>
+      <w:rFonts w:ascii="맑은고딕" w:hAnsi="맑은고딕" w:eastAsia="맑은고딕" w:cs="맑은고딕"/>
+      <w:sz w:val="22"/>
+    </w:rPr>
     <w:tblPr>
       <w:tblStyleRowBandSize w:val="1"/>
       <w:tblStyleColBandSize w:val="1"/>
@@ -6240,6 +6412,10 @@
     <w:pPr>
       <w:spacing w:after="0" w:line="240" w:lineRule="auto"/>
     </w:pPr>
+    <w:rPr>
+      <w:rFonts w:ascii="맑은고딕" w:hAnsi="맑은고딕" w:eastAsia="맑은고딕" w:cs="맑은고딕"/>
+      <w:sz w:val="22"/>
+    </w:rPr>
     <w:tblPr>
       <w:tblStyleRowBandSize w:val="1"/>
       <w:tblStyleColBandSize w:val="1"/>
@@ -6390,7 +6566,9 @@
       <w:spacing w:after="0" w:line="240" w:lineRule="auto"/>
     </w:pPr>
     <w:rPr>
+      <w:rFonts w:ascii="맑은고딕" w:hAnsi="맑은고딕" w:eastAsia="맑은고딕" w:cs="맑은고딕"/>
       <w:color w:val="000000" w:themeColor="text1"/>
+      <w:sz w:val="22"/>
     </w:rPr>
     <w:tblPr>
       <w:tblStyleRowBandSize w:val="1"/>
@@ -6474,7 +6652,9 @@
       <w:spacing w:after="0" w:line="240" w:lineRule="auto"/>
     </w:pPr>
     <w:rPr>
+      <w:rFonts w:ascii="맑은고딕" w:hAnsi="맑은고딕" w:eastAsia="맑은고딕" w:cs="맑은고딕"/>
       <w:color w:val="000000" w:themeColor="text1"/>
+      <w:sz w:val="22"/>
     </w:rPr>
     <w:tblPr>
       <w:tblStyleRowBandSize w:val="1"/>
@@ -6558,7 +6738,9 @@
       <w:spacing w:after="0" w:line="240" w:lineRule="auto"/>
     </w:pPr>
     <w:rPr>
+      <w:rFonts w:ascii="맑은고딕" w:hAnsi="맑은고딕" w:eastAsia="맑은고딕" w:cs="맑은고딕"/>
       <w:color w:val="000000" w:themeColor="text1"/>
+      <w:sz w:val="22"/>
     </w:rPr>
     <w:tblPr>
       <w:tblStyleRowBandSize w:val="1"/>
@@ -6642,7 +6824,9 @@
       <w:spacing w:after="0" w:line="240" w:lineRule="auto"/>
     </w:pPr>
     <w:rPr>
+      <w:rFonts w:ascii="맑은고딕" w:hAnsi="맑은고딕" w:eastAsia="맑은고딕" w:cs="맑은고딕"/>
       <w:color w:val="000000" w:themeColor="text1"/>
+      <w:sz w:val="22"/>
     </w:rPr>
     <w:tblPr>
       <w:tblStyleRowBandSize w:val="1"/>
@@ -6726,7 +6910,9 @@
       <w:spacing w:after="0" w:line="240" w:lineRule="auto"/>
     </w:pPr>
     <w:rPr>
+      <w:rFonts w:ascii="맑은고딕" w:hAnsi="맑은고딕" w:eastAsia="맑은고딕" w:cs="맑은고딕"/>
       <w:color w:val="000000" w:themeColor="text1"/>
+      <w:sz w:val="22"/>
     </w:rPr>
     <w:tblPr>
       <w:tblStyleRowBandSize w:val="1"/>
@@ -6810,7 +6996,9 @@
       <w:spacing w:after="0" w:line="240" w:lineRule="auto"/>
     </w:pPr>
     <w:rPr>
+      <w:rFonts w:ascii="맑은고딕" w:hAnsi="맑은고딕" w:eastAsia="맑은고딕" w:cs="맑은고딕"/>
       <w:color w:val="000000" w:themeColor="text1"/>
+      <w:sz w:val="22"/>
     </w:rPr>
     <w:tblPr>
       <w:tblStyleRowBandSize w:val="1"/>
@@ -6894,7 +7082,9 @@
       <w:spacing w:after="0" w:line="240" w:lineRule="auto"/>
     </w:pPr>
     <w:rPr>
+      <w:rFonts w:ascii="맑은고딕" w:hAnsi="맑은고딕" w:eastAsia="맑은고딕" w:cs="맑은고딕"/>
       <w:color w:val="000000" w:themeColor="text1"/>
+      <w:sz w:val="22"/>
     </w:rPr>
     <w:tblPr>
       <w:tblStyleRowBandSize w:val="1"/>
@@ -6978,8 +7168,9 @@
       <w:spacing w:after="0" w:line="240" w:lineRule="auto"/>
     </w:pPr>
     <w:rPr>
-      <w:rFonts w:asciiTheme="majorHAnsi" w:eastAsiaTheme="majorEastAsia" w:hAnsiTheme="majorHAnsi" w:cstheme="majorBidi"/>
+      <w:rFonts w:asciiTheme="majorHAnsi" w:eastAsiaTheme="majorEastAsia" w:hAnsiTheme="majorHAnsi" w:cstheme="majorBidi" w:ascii="맑은고딕" w:hAnsi="맑은고딕" w:eastAsia="맑은고딕" w:cs="맑은고딕"/>
       <w:color w:val="000000" w:themeColor="text1"/>
+      <w:sz w:val="22"/>
     </w:rPr>
     <w:tblPr>
       <w:tblStyleRowBandSize w:val="1"/>
@@ -7106,8 +7297,9 @@
       <w:spacing w:after="0" w:line="240" w:lineRule="auto"/>
     </w:pPr>
     <w:rPr>
-      <w:rFonts w:asciiTheme="majorHAnsi" w:eastAsiaTheme="majorEastAsia" w:hAnsiTheme="majorHAnsi" w:cstheme="majorBidi"/>
+      <w:rFonts w:asciiTheme="majorHAnsi" w:eastAsiaTheme="majorEastAsia" w:hAnsiTheme="majorHAnsi" w:cstheme="majorBidi" w:ascii="맑은고딕" w:hAnsi="맑은고딕" w:eastAsia="맑은고딕" w:cs="맑은고딕"/>
       <w:color w:val="000000" w:themeColor="text1"/>
+      <w:sz w:val="22"/>
     </w:rPr>
     <w:tblPr>
       <w:tblStyleRowBandSize w:val="1"/>
@@ -7234,8 +7426,9 @@
       <w:spacing w:after="0" w:line="240" w:lineRule="auto"/>
     </w:pPr>
     <w:rPr>
-      <w:rFonts w:asciiTheme="majorHAnsi" w:eastAsiaTheme="majorEastAsia" w:hAnsiTheme="majorHAnsi" w:cstheme="majorBidi"/>
+      <w:rFonts w:asciiTheme="majorHAnsi" w:eastAsiaTheme="majorEastAsia" w:hAnsiTheme="majorHAnsi" w:cstheme="majorBidi" w:ascii="맑은고딕" w:hAnsi="맑은고딕" w:eastAsia="맑은고딕" w:cs="맑은고딕"/>
       <w:color w:val="000000" w:themeColor="text1"/>
+      <w:sz w:val="22"/>
     </w:rPr>
     <w:tblPr>
       <w:tblStyleRowBandSize w:val="1"/>
@@ -7362,8 +7555,9 @@
       <w:spacing w:after="0" w:line="240" w:lineRule="auto"/>
     </w:pPr>
     <w:rPr>
-      <w:rFonts w:asciiTheme="majorHAnsi" w:eastAsiaTheme="majorEastAsia" w:hAnsiTheme="majorHAnsi" w:cstheme="majorBidi"/>
+      <w:rFonts w:asciiTheme="majorHAnsi" w:eastAsiaTheme="majorEastAsia" w:hAnsiTheme="majorHAnsi" w:cstheme="majorBidi" w:ascii="맑은고딕" w:hAnsi="맑은고딕" w:eastAsia="맑은고딕" w:cs="맑은고딕"/>
       <w:color w:val="000000" w:themeColor="text1"/>
+      <w:sz w:val="22"/>
     </w:rPr>
     <w:tblPr>
       <w:tblStyleRowBandSize w:val="1"/>
@@ -7490,8 +7684,9 @@
       <w:spacing w:after="0" w:line="240" w:lineRule="auto"/>
     </w:pPr>
     <w:rPr>
-      <w:rFonts w:asciiTheme="majorHAnsi" w:eastAsiaTheme="majorEastAsia" w:hAnsiTheme="majorHAnsi" w:cstheme="majorBidi"/>
+      <w:rFonts w:asciiTheme="majorHAnsi" w:eastAsiaTheme="majorEastAsia" w:hAnsiTheme="majorHAnsi" w:cstheme="majorBidi" w:ascii="맑은고딕" w:hAnsi="맑은고딕" w:eastAsia="맑은고딕" w:cs="맑은고딕"/>
       <w:color w:val="000000" w:themeColor="text1"/>
+      <w:sz w:val="22"/>
     </w:rPr>
     <w:tblPr>
       <w:tblStyleRowBandSize w:val="1"/>
@@ -7618,8 +7813,9 @@
       <w:spacing w:after="0" w:line="240" w:lineRule="auto"/>
     </w:pPr>
     <w:rPr>
-      <w:rFonts w:asciiTheme="majorHAnsi" w:eastAsiaTheme="majorEastAsia" w:hAnsiTheme="majorHAnsi" w:cstheme="majorBidi"/>
+      <w:rFonts w:asciiTheme="majorHAnsi" w:eastAsiaTheme="majorEastAsia" w:hAnsiTheme="majorHAnsi" w:cstheme="majorBidi" w:ascii="맑은고딕" w:hAnsi="맑은고딕" w:eastAsia="맑은고딕" w:cs="맑은고딕"/>
       <w:color w:val="000000" w:themeColor="text1"/>
+      <w:sz w:val="22"/>
     </w:rPr>
     <w:tblPr>
       <w:tblStyleRowBandSize w:val="1"/>
@@ -7746,8 +7942,9 @@
       <w:spacing w:after="0" w:line="240" w:lineRule="auto"/>
     </w:pPr>
     <w:rPr>
-      <w:rFonts w:asciiTheme="majorHAnsi" w:eastAsiaTheme="majorEastAsia" w:hAnsiTheme="majorHAnsi" w:cstheme="majorBidi"/>
+      <w:rFonts w:asciiTheme="majorHAnsi" w:eastAsiaTheme="majorEastAsia" w:hAnsiTheme="majorHAnsi" w:cstheme="majorBidi" w:ascii="맑은고딕" w:hAnsi="맑은고딕" w:eastAsia="맑은고딕" w:cs="맑은고딕"/>
       <w:color w:val="000000" w:themeColor="text1"/>
+      <w:sz w:val="22"/>
     </w:rPr>
     <w:tblPr>
       <w:tblStyleRowBandSize w:val="1"/>
@@ -7873,6 +8070,10 @@
     <w:pPr>
       <w:spacing w:after="0" w:line="240" w:lineRule="auto"/>
     </w:pPr>
+    <w:rPr>
+      <w:rFonts w:ascii="맑은고딕" w:hAnsi="맑은고딕" w:eastAsia="맑은고딕" w:cs="맑은고딕"/>
+      <w:sz w:val="22"/>
+    </w:rPr>
     <w:tblPr>
       <w:tblStyleRowBandSize w:val="1"/>
       <w:tblStyleColBandSize w:val="1"/>
@@ -7946,6 +8147,10 @@
     <w:pPr>
       <w:spacing w:after="0" w:line="240" w:lineRule="auto"/>
     </w:pPr>
+    <w:rPr>
+      <w:rFonts w:ascii="맑은고딕" w:hAnsi="맑은고딕" w:eastAsia="맑은고딕" w:cs="맑은고딕"/>
+      <w:sz w:val="22"/>
+    </w:rPr>
     <w:tblPr>
       <w:tblStyleRowBandSize w:val="1"/>
       <w:tblStyleColBandSize w:val="1"/>
@@ -8019,6 +8224,10 @@
     <w:pPr>
       <w:spacing w:after="0" w:line="240" w:lineRule="auto"/>
     </w:pPr>
+    <w:rPr>
+      <w:rFonts w:ascii="맑은고딕" w:hAnsi="맑은고딕" w:eastAsia="맑은고딕" w:cs="맑은고딕"/>
+      <w:sz w:val="22"/>
+    </w:rPr>
     <w:tblPr>
       <w:tblStyleRowBandSize w:val="1"/>
       <w:tblStyleColBandSize w:val="1"/>
@@ -8092,6 +8301,10 @@
     <w:pPr>
       <w:spacing w:after="0" w:line="240" w:lineRule="auto"/>
     </w:pPr>
+    <w:rPr>
+      <w:rFonts w:ascii="맑은고딕" w:hAnsi="맑은고딕" w:eastAsia="맑은고딕" w:cs="맑은고딕"/>
+      <w:sz w:val="22"/>
+    </w:rPr>
     <w:tblPr>
       <w:tblStyleRowBandSize w:val="1"/>
       <w:tblStyleColBandSize w:val="1"/>
@@ -8165,6 +8378,10 @@
     <w:pPr>
       <w:spacing w:after="0" w:line="240" w:lineRule="auto"/>
     </w:pPr>
+    <w:rPr>
+      <w:rFonts w:ascii="맑은고딕" w:hAnsi="맑은고딕" w:eastAsia="맑은고딕" w:cs="맑은고딕"/>
+      <w:sz w:val="22"/>
+    </w:rPr>
     <w:tblPr>
       <w:tblStyleRowBandSize w:val="1"/>
       <w:tblStyleColBandSize w:val="1"/>
@@ -8238,6 +8455,10 @@
     <w:pPr>
       <w:spacing w:after="0" w:line="240" w:lineRule="auto"/>
     </w:pPr>
+    <w:rPr>
+      <w:rFonts w:ascii="맑은고딕" w:hAnsi="맑은고딕" w:eastAsia="맑은고딕" w:cs="맑은고딕"/>
+      <w:sz w:val="22"/>
+    </w:rPr>
     <w:tblPr>
       <w:tblStyleRowBandSize w:val="1"/>
       <w:tblStyleColBandSize w:val="1"/>
@@ -8311,6 +8532,10 @@
     <w:pPr>
       <w:spacing w:after="0" w:line="240" w:lineRule="auto"/>
     </w:pPr>
+    <w:rPr>
+      <w:rFonts w:ascii="맑은고딕" w:hAnsi="맑은고딕" w:eastAsia="맑은고딕" w:cs="맑은고딕"/>
+      <w:sz w:val="22"/>
+    </w:rPr>
     <w:tblPr>
       <w:tblStyleRowBandSize w:val="1"/>
       <w:tblStyleColBandSize w:val="1"/>
@@ -8385,8 +8610,9 @@
       <w:spacing w:after="0" w:line="240" w:lineRule="auto"/>
     </w:pPr>
     <w:rPr>
-      <w:rFonts w:asciiTheme="majorHAnsi" w:eastAsiaTheme="majorEastAsia" w:hAnsiTheme="majorHAnsi" w:cstheme="majorBidi"/>
+      <w:rFonts w:asciiTheme="majorHAnsi" w:eastAsiaTheme="majorEastAsia" w:hAnsiTheme="majorHAnsi" w:cstheme="majorBidi" w:ascii="맑은고딕" w:hAnsi="맑은고딕" w:eastAsia="맑은고딕" w:cs="맑은고딕"/>
       <w:color w:val="000000" w:themeColor="text1"/>
+      <w:sz w:val="22"/>
     </w:rPr>
     <w:tblPr>
       <w:tblStyleRowBandSize w:val="1"/>
@@ -8510,8 +8736,9 @@
       <w:spacing w:after="0" w:line="240" w:lineRule="auto"/>
     </w:pPr>
     <w:rPr>
-      <w:rFonts w:asciiTheme="majorHAnsi" w:eastAsiaTheme="majorEastAsia" w:hAnsiTheme="majorHAnsi" w:cstheme="majorBidi"/>
+      <w:rFonts w:asciiTheme="majorHAnsi" w:eastAsiaTheme="majorEastAsia" w:hAnsiTheme="majorHAnsi" w:cstheme="majorBidi" w:ascii="맑은고딕" w:hAnsi="맑은고딕" w:eastAsia="맑은고딕" w:cs="맑은고딕"/>
       <w:color w:val="000000" w:themeColor="text1"/>
+      <w:sz w:val="22"/>
     </w:rPr>
     <w:tblPr>
       <w:tblStyleRowBandSize w:val="1"/>
@@ -8635,8 +8862,9 @@
       <w:spacing w:after="0" w:line="240" w:lineRule="auto"/>
     </w:pPr>
     <w:rPr>
-      <w:rFonts w:asciiTheme="majorHAnsi" w:eastAsiaTheme="majorEastAsia" w:hAnsiTheme="majorHAnsi" w:cstheme="majorBidi"/>
+      <w:rFonts w:asciiTheme="majorHAnsi" w:eastAsiaTheme="majorEastAsia" w:hAnsiTheme="majorHAnsi" w:cstheme="majorBidi" w:ascii="맑은고딕" w:hAnsi="맑은고딕" w:eastAsia="맑은고딕" w:cs="맑은고딕"/>
       <w:color w:val="000000" w:themeColor="text1"/>
+      <w:sz w:val="22"/>
     </w:rPr>
     <w:tblPr>
       <w:tblStyleRowBandSize w:val="1"/>
@@ -8760,8 +8988,9 @@
       <w:spacing w:after="0" w:line="240" w:lineRule="auto"/>
     </w:pPr>
     <w:rPr>
-      <w:rFonts w:asciiTheme="majorHAnsi" w:eastAsiaTheme="majorEastAsia" w:hAnsiTheme="majorHAnsi" w:cstheme="majorBidi"/>
+      <w:rFonts w:asciiTheme="majorHAnsi" w:eastAsiaTheme="majorEastAsia" w:hAnsiTheme="majorHAnsi" w:cstheme="majorBidi" w:ascii="맑은고딕" w:hAnsi="맑은고딕" w:eastAsia="맑은고딕" w:cs="맑은고딕"/>
       <w:color w:val="000000" w:themeColor="text1"/>
+      <w:sz w:val="22"/>
     </w:rPr>
     <w:tblPr>
       <w:tblStyleRowBandSize w:val="1"/>
@@ -8885,8 +9114,9 @@
       <w:spacing w:after="0" w:line="240" w:lineRule="auto"/>
     </w:pPr>
     <w:rPr>
-      <w:rFonts w:asciiTheme="majorHAnsi" w:eastAsiaTheme="majorEastAsia" w:hAnsiTheme="majorHAnsi" w:cstheme="majorBidi"/>
+      <w:rFonts w:asciiTheme="majorHAnsi" w:eastAsiaTheme="majorEastAsia" w:hAnsiTheme="majorHAnsi" w:cstheme="majorBidi" w:ascii="맑은고딕" w:hAnsi="맑은고딕" w:eastAsia="맑은고딕" w:cs="맑은고딕"/>
       <w:color w:val="000000" w:themeColor="text1"/>
+      <w:sz w:val="22"/>
     </w:rPr>
     <w:tblPr>
       <w:tblStyleRowBandSize w:val="1"/>
@@ -9010,8 +9240,9 @@
       <w:spacing w:after="0" w:line="240" w:lineRule="auto"/>
     </w:pPr>
     <w:rPr>
-      <w:rFonts w:asciiTheme="majorHAnsi" w:eastAsiaTheme="majorEastAsia" w:hAnsiTheme="majorHAnsi" w:cstheme="majorBidi"/>
+      <w:rFonts w:asciiTheme="majorHAnsi" w:eastAsiaTheme="majorEastAsia" w:hAnsiTheme="majorHAnsi" w:cstheme="majorBidi" w:ascii="맑은고딕" w:hAnsi="맑은고딕" w:eastAsia="맑은고딕" w:cs="맑은고딕"/>
       <w:color w:val="000000" w:themeColor="text1"/>
+      <w:sz w:val="22"/>
     </w:rPr>
     <w:tblPr>
       <w:tblStyleRowBandSize w:val="1"/>
@@ -9135,8 +9366,9 @@
       <w:spacing w:after="0" w:line="240" w:lineRule="auto"/>
     </w:pPr>
     <w:rPr>
-      <w:rFonts w:asciiTheme="majorHAnsi" w:eastAsiaTheme="majorEastAsia" w:hAnsiTheme="majorHAnsi" w:cstheme="majorBidi"/>
+      <w:rFonts w:asciiTheme="majorHAnsi" w:eastAsiaTheme="majorEastAsia" w:hAnsiTheme="majorHAnsi" w:cstheme="majorBidi" w:ascii="맑은고딕" w:hAnsi="맑은고딕" w:eastAsia="맑은고딕" w:cs="맑은고딕"/>
       <w:color w:val="000000" w:themeColor="text1"/>
+      <w:sz w:val="22"/>
     </w:rPr>
     <w:tblPr>
       <w:tblStyleRowBandSize w:val="1"/>
@@ -9259,6 +9491,10 @@
     <w:pPr>
       <w:spacing w:after="0" w:line="240" w:lineRule="auto"/>
     </w:pPr>
+    <w:rPr>
+      <w:rFonts w:ascii="맑은고딕" w:hAnsi="맑은고딕" w:eastAsia="맑은고딕" w:cs="맑은고딕"/>
+      <w:sz w:val="22"/>
+    </w:rPr>
     <w:tblPr>
       <w:tblStyleRowBandSize w:val="1"/>
       <w:tblStyleColBandSize w:val="1"/>
@@ -9400,6 +9636,10 @@
     <w:pPr>
       <w:spacing w:after="0" w:line="240" w:lineRule="auto"/>
     </w:pPr>
+    <w:rPr>
+      <w:rFonts w:ascii="맑은고딕" w:hAnsi="맑은고딕" w:eastAsia="맑은고딕" w:cs="맑은고딕"/>
+      <w:sz w:val="22"/>
+    </w:rPr>
     <w:tblPr>
       <w:tblStyleRowBandSize w:val="1"/>
       <w:tblStyleColBandSize w:val="1"/>
@@ -9541,6 +9781,10 @@
     <w:pPr>
       <w:spacing w:after="0" w:line="240" w:lineRule="auto"/>
     </w:pPr>
+    <w:rPr>
+      <w:rFonts w:ascii="맑은고딕" w:hAnsi="맑은고딕" w:eastAsia="맑은고딕" w:cs="맑은고딕"/>
+      <w:sz w:val="22"/>
+    </w:rPr>
     <w:tblPr>
       <w:tblStyleRowBandSize w:val="1"/>
       <w:tblStyleColBandSize w:val="1"/>
@@ -9682,6 +9926,10 @@
     <w:pPr>
       <w:spacing w:after="0" w:line="240" w:lineRule="auto"/>
     </w:pPr>
+    <w:rPr>
+      <w:rFonts w:ascii="맑은고딕" w:hAnsi="맑은고딕" w:eastAsia="맑은고딕" w:cs="맑은고딕"/>
+      <w:sz w:val="22"/>
+    </w:rPr>
     <w:tblPr>
       <w:tblStyleRowBandSize w:val="1"/>
       <w:tblStyleColBandSize w:val="1"/>
@@ -9823,6 +10071,10 @@
     <w:pPr>
       <w:spacing w:after="0" w:line="240" w:lineRule="auto"/>
     </w:pPr>
+    <w:rPr>
+      <w:rFonts w:ascii="맑은고딕" w:hAnsi="맑은고딕" w:eastAsia="맑은고딕" w:cs="맑은고딕"/>
+      <w:sz w:val="22"/>
+    </w:rPr>
     <w:tblPr>
       <w:tblStyleRowBandSize w:val="1"/>
       <w:tblStyleColBandSize w:val="1"/>
@@ -9964,6 +10216,10 @@
     <w:pPr>
       <w:spacing w:after="0" w:line="240" w:lineRule="auto"/>
     </w:pPr>
+    <w:rPr>
+      <w:rFonts w:ascii="맑은고딕" w:hAnsi="맑은고딕" w:eastAsia="맑은고딕" w:cs="맑은고딕"/>
+      <w:sz w:val="22"/>
+    </w:rPr>
     <w:tblPr>
       <w:tblStyleRowBandSize w:val="1"/>
       <w:tblStyleColBandSize w:val="1"/>
@@ -10105,6 +10361,10 @@
     <w:pPr>
       <w:spacing w:after="0" w:line="240" w:lineRule="auto"/>
     </w:pPr>
+    <w:rPr>
+      <w:rFonts w:ascii="맑은고딕" w:hAnsi="맑은고딕" w:eastAsia="맑은고딕" w:cs="맑은고딕"/>
+      <w:sz w:val="22"/>
+    </w:rPr>
     <w:tblPr>
       <w:tblStyleRowBandSize w:val="1"/>
       <w:tblStyleColBandSize w:val="1"/>
@@ -10247,7 +10507,9 @@
       <w:spacing w:after="0" w:line="240" w:lineRule="auto"/>
     </w:pPr>
     <w:rPr>
+      <w:rFonts w:ascii="맑은고딕" w:hAnsi="맑은고딕" w:eastAsia="맑은고딕" w:cs="맑은고딕"/>
       <w:color w:val="FFFFFF" w:themeColor="background1"/>
+      <w:sz w:val="22"/>
     </w:rPr>
     <w:tblPr>
       <w:tblStyleRowBandSize w:val="1"/>
@@ -10361,7 +10623,9 @@
       <w:spacing w:after="0" w:line="240" w:lineRule="auto"/>
     </w:pPr>
     <w:rPr>
+      <w:rFonts w:ascii="맑은고딕" w:hAnsi="맑은고딕" w:eastAsia="맑은고딕" w:cs="맑은고딕"/>
       <w:color w:val="FFFFFF" w:themeColor="background1"/>
+      <w:sz w:val="22"/>
     </w:rPr>
     <w:tblPr>
       <w:tblStyleRowBandSize w:val="1"/>
@@ -10475,7 +10739,9 @@
       <w:spacing w:after="0" w:line="240" w:lineRule="auto"/>
     </w:pPr>
     <w:rPr>
+      <w:rFonts w:ascii="맑은고딕" w:hAnsi="맑은고딕" w:eastAsia="맑은고딕" w:cs="맑은고딕"/>
       <w:color w:val="FFFFFF" w:themeColor="background1"/>
+      <w:sz w:val="22"/>
     </w:rPr>
     <w:tblPr>
       <w:tblStyleRowBandSize w:val="1"/>
@@ -10589,7 +10855,9 @@
       <w:spacing w:after="0" w:line="240" w:lineRule="auto"/>
     </w:pPr>
     <w:rPr>
+      <w:rFonts w:ascii="맑은고딕" w:hAnsi="맑은고딕" w:eastAsia="맑은고딕" w:cs="맑은고딕"/>
       <w:color w:val="FFFFFF" w:themeColor="background1"/>
+      <w:sz w:val="22"/>
     </w:rPr>
     <w:tblPr>
       <w:tblStyleRowBandSize w:val="1"/>
@@ -10703,7 +10971,9 @@
       <w:spacing w:after="0" w:line="240" w:lineRule="auto"/>
     </w:pPr>
     <w:rPr>
+      <w:rFonts w:ascii="맑은고딕" w:hAnsi="맑은고딕" w:eastAsia="맑은고딕" w:cs="맑은고딕"/>
       <w:color w:val="FFFFFF" w:themeColor="background1"/>
+      <w:sz w:val="22"/>
     </w:rPr>
     <w:tblPr>
       <w:tblStyleRowBandSize w:val="1"/>
@@ -10817,7 +11087,9 @@
       <w:spacing w:after="0" w:line="240" w:lineRule="auto"/>
     </w:pPr>
     <w:rPr>
+      <w:rFonts w:ascii="맑은고딕" w:hAnsi="맑은고딕" w:eastAsia="맑은고딕" w:cs="맑은고딕"/>
       <w:color w:val="FFFFFF" w:themeColor="background1"/>
+      <w:sz w:val="22"/>
     </w:rPr>
     <w:tblPr>
       <w:tblStyleRowBandSize w:val="1"/>
@@ -10931,7 +11203,9 @@
       <w:spacing w:after="0" w:line="240" w:lineRule="auto"/>
     </w:pPr>
     <w:rPr>
+      <w:rFonts w:ascii="맑은고딕" w:hAnsi="맑은고딕" w:eastAsia="맑은고딕" w:cs="맑은고딕"/>
       <w:color w:val="FFFFFF" w:themeColor="background1"/>
+      <w:sz w:val="22"/>
     </w:rPr>
     <w:tblPr>
       <w:tblStyleRowBandSize w:val="1"/>
@@ -11045,7 +11319,9 @@
       <w:spacing w:after="0" w:line="240" w:lineRule="auto"/>
     </w:pPr>
     <w:rPr>
+      <w:rFonts w:ascii="맑은고딕" w:hAnsi="맑은고딕" w:eastAsia="맑은고딕" w:cs="맑은고딕"/>
       <w:color w:val="000000" w:themeColor="text1"/>
+      <w:sz w:val="22"/>
     </w:rPr>
     <w:tblPr>
       <w:tblStyleRowBandSize w:val="1"/>
@@ -11167,7 +11443,9 @@
       <w:spacing w:after="0" w:line="240" w:lineRule="auto"/>
     </w:pPr>
     <w:rPr>
+      <w:rFonts w:ascii="맑은고딕" w:hAnsi="맑은고딕" w:eastAsia="맑은고딕" w:cs="맑은고딕"/>
       <w:color w:val="000000" w:themeColor="text1"/>
+      <w:sz w:val="22"/>
     </w:rPr>
     <w:tblPr>
       <w:tblStyleRowBandSize w:val="1"/>
@@ -11289,7 +11567,9 @@
       <w:spacing w:after="0" w:line="240" w:lineRule="auto"/>
     </w:pPr>
     <w:rPr>
+      <w:rFonts w:ascii="맑은고딕" w:hAnsi="맑은고딕" w:eastAsia="맑은고딕" w:cs="맑은고딕"/>
       <w:color w:val="000000" w:themeColor="text1"/>
+      <w:sz w:val="22"/>
     </w:rPr>
     <w:tblPr>
       <w:tblStyleRowBandSize w:val="1"/>
@@ -11411,7 +11691,9 @@
       <w:spacing w:after="0" w:line="240" w:lineRule="auto"/>
     </w:pPr>
     <w:rPr>
+      <w:rFonts w:ascii="맑은고딕" w:hAnsi="맑은고딕" w:eastAsia="맑은고딕" w:cs="맑은고딕"/>
       <w:color w:val="000000" w:themeColor="text1"/>
+      <w:sz w:val="22"/>
     </w:rPr>
     <w:tblPr>
       <w:tblStyleRowBandSize w:val="1"/>
@@ -11523,7 +11805,9 @@
       <w:spacing w:after="0" w:line="240" w:lineRule="auto"/>
     </w:pPr>
     <w:rPr>
+      <w:rFonts w:ascii="맑은고딕" w:hAnsi="맑은고딕" w:eastAsia="맑은고딕" w:cs="맑은고딕"/>
       <w:color w:val="000000" w:themeColor="text1"/>
+      <w:sz w:val="22"/>
     </w:rPr>
     <w:tblPr>
       <w:tblStyleRowBandSize w:val="1"/>
@@ -11645,7 +11929,9 @@
       <w:spacing w:after="0" w:line="240" w:lineRule="auto"/>
     </w:pPr>
     <w:rPr>
+      <w:rFonts w:ascii="맑은고딕" w:hAnsi="맑은고딕" w:eastAsia="맑은고딕" w:cs="맑은고딕"/>
       <w:color w:val="000000" w:themeColor="text1"/>
+      <w:sz w:val="22"/>
     </w:rPr>
     <w:tblPr>
       <w:tblStyleRowBandSize w:val="1"/>
@@ -11767,7 +12053,9 @@
       <w:spacing w:after="0" w:line="240" w:lineRule="auto"/>
     </w:pPr>
     <w:rPr>
+      <w:rFonts w:ascii="맑은고딕" w:hAnsi="맑은고딕" w:eastAsia="맑은고딕" w:cs="맑은고딕"/>
       <w:color w:val="000000" w:themeColor="text1"/>
+      <w:sz w:val="22"/>
     </w:rPr>
     <w:tblPr>
       <w:tblStyleRowBandSize w:val="1"/>
@@ -11889,7 +12177,9 @@
       <w:spacing w:after="0" w:line="240" w:lineRule="auto"/>
     </w:pPr>
     <w:rPr>
+      <w:rFonts w:ascii="맑은고딕" w:hAnsi="맑은고딕" w:eastAsia="맑은고딕" w:cs="맑은고딕"/>
       <w:color w:val="000000" w:themeColor="text1"/>
+      <w:sz w:val="22"/>
     </w:rPr>
     <w:tblPr>
       <w:tblStyleRowBandSize w:val="1"/>
@@ -11975,7 +12265,9 @@
       <w:spacing w:after="0" w:line="240" w:lineRule="auto"/>
     </w:pPr>
     <w:rPr>
+      <w:rFonts w:ascii="맑은고딕" w:hAnsi="맑은고딕" w:eastAsia="맑은고딕" w:cs="맑은고딕"/>
       <w:color w:val="000000" w:themeColor="text1"/>
+      <w:sz w:val="22"/>
     </w:rPr>
     <w:tblPr>
       <w:tblStyleRowBandSize w:val="1"/>
@@ -12061,7 +12353,9 @@
       <w:spacing w:after="0" w:line="240" w:lineRule="auto"/>
     </w:pPr>
     <w:rPr>
+      <w:rFonts w:ascii="맑은고딕" w:hAnsi="맑은고딕" w:eastAsia="맑은고딕" w:cs="맑은고딕"/>
       <w:color w:val="000000" w:themeColor="text1"/>
+      <w:sz w:val="22"/>
     </w:rPr>
     <w:tblPr>
       <w:tblStyleRowBandSize w:val="1"/>
@@ -12147,7 +12441,9 @@
       <w:spacing w:after="0" w:line="240" w:lineRule="auto"/>
     </w:pPr>
     <w:rPr>
+      <w:rFonts w:ascii="맑은고딕" w:hAnsi="맑은고딕" w:eastAsia="맑은고딕" w:cs="맑은고딕"/>
       <w:color w:val="000000" w:themeColor="text1"/>
+      <w:sz w:val="22"/>
     </w:rPr>
     <w:tblPr>
       <w:tblStyleRowBandSize w:val="1"/>
@@ -12233,7 +12529,9 @@
       <w:spacing w:after="0" w:line="240" w:lineRule="auto"/>
     </w:pPr>
     <w:rPr>
+      <w:rFonts w:ascii="맑은고딕" w:hAnsi="맑은고딕" w:eastAsia="맑은고딕" w:cs="맑은고딕"/>
       <w:color w:val="000000" w:themeColor="text1"/>
+      <w:sz w:val="22"/>
     </w:rPr>
     <w:tblPr>
       <w:tblStyleRowBandSize w:val="1"/>
@@ -12319,7 +12617,9 @@
       <w:spacing w:after="0" w:line="240" w:lineRule="auto"/>
     </w:pPr>
     <w:rPr>
+      <w:rFonts w:ascii="맑은고딕" w:hAnsi="맑은고딕" w:eastAsia="맑은고딕" w:cs="맑은고딕"/>
       <w:color w:val="000000" w:themeColor="text1"/>
+      <w:sz w:val="22"/>
     </w:rPr>
     <w:tblPr>
       <w:tblStyleRowBandSize w:val="1"/>
@@ -12405,7 +12705,9 @@
       <w:spacing w:after="0" w:line="240" w:lineRule="auto"/>
     </w:pPr>
     <w:rPr>
+      <w:rFonts w:ascii="맑은고딕" w:hAnsi="맑은고딕" w:eastAsia="맑은고딕" w:cs="맑은고딕"/>
       <w:color w:val="000000" w:themeColor="text1"/>
+      <w:sz w:val="22"/>
     </w:rPr>
     <w:tblPr>
       <w:tblStyleRowBandSize w:val="1"/>
@@ -12491,7 +12793,9 @@
       <w:spacing w:after="0" w:line="240" w:lineRule="auto"/>
     </w:pPr>
     <w:rPr>
+      <w:rFonts w:ascii="맑은고딕" w:hAnsi="맑은고딕" w:eastAsia="맑은고딕" w:cs="맑은고딕"/>
       <w:color w:val="000000" w:themeColor="text1"/>
+      <w:sz w:val="22"/>
     </w:rPr>
     <w:tblPr>
       <w:tblStyleRowBandSize w:val="1"/>
@@ -12571,7 +12875,9 @@
       <w:spacing w:after="0" w:line="240" w:lineRule="auto"/>
     </w:pPr>
     <w:rPr>
+      <w:rFonts w:ascii="맑은고딕" w:hAnsi="맑은고딕" w:eastAsia="맑은고딕" w:cs="맑은고딕"/>
       <w:color w:val="000000" w:themeColor="text1"/>
+      <w:sz w:val="22"/>
     </w:rPr>
     <w:tblPr>
       <w:tblStyleRowBandSize w:val="1"/>
@@ -12651,7 +12957,9 @@
       <w:spacing w:after="0" w:line="240" w:lineRule="auto"/>
     </w:pPr>
     <w:rPr>
+      <w:rFonts w:ascii="맑은고딕" w:hAnsi="맑은고딕" w:eastAsia="맑은고딕" w:cs="맑은고딕"/>
       <w:color w:val="000000" w:themeColor="text1"/>
+      <w:sz w:val="22"/>
     </w:rPr>
     <w:tblPr>
       <w:tblStyleRowBandSize w:val="1"/>
@@ -12731,7 +13039,9 @@
       <w:spacing w:after="0" w:line="240" w:lineRule="auto"/>
     </w:pPr>
     <w:rPr>
+      <w:rFonts w:ascii="맑은고딕" w:hAnsi="맑은고딕" w:eastAsia="맑은고딕" w:cs="맑은고딕"/>
       <w:color w:val="000000" w:themeColor="text1"/>
+      <w:sz w:val="22"/>
     </w:rPr>
     <w:tblPr>
       <w:tblStyleRowBandSize w:val="1"/>
@@ -12811,7 +13121,9 @@
       <w:spacing w:after="0" w:line="240" w:lineRule="auto"/>
     </w:pPr>
     <w:rPr>
+      <w:rFonts w:ascii="맑은고딕" w:hAnsi="맑은고딕" w:eastAsia="맑은고딕" w:cs="맑은고딕"/>
       <w:color w:val="000000" w:themeColor="text1"/>
+      <w:sz w:val="22"/>
     </w:rPr>
     <w:tblPr>
       <w:tblStyleRowBandSize w:val="1"/>
@@ -12891,7 +13203,9 @@
       <w:spacing w:after="0" w:line="240" w:lineRule="auto"/>
     </w:pPr>
     <w:rPr>
+      <w:rFonts w:ascii="맑은고딕" w:hAnsi="맑은고딕" w:eastAsia="맑은고딕" w:cs="맑은고딕"/>
       <w:color w:val="000000" w:themeColor="text1"/>
+      <w:sz w:val="22"/>
     </w:rPr>
     <w:tblPr>
       <w:tblStyleRowBandSize w:val="1"/>
@@ -12971,7 +13285,9 @@
       <w:spacing w:after="0" w:line="240" w:lineRule="auto"/>
     </w:pPr>
     <w:rPr>
+      <w:rFonts w:ascii="맑은고딕" w:hAnsi="맑은고딕" w:eastAsia="맑은고딕" w:cs="맑은고딕"/>
       <w:color w:val="000000" w:themeColor="text1"/>
+      <w:sz w:val="22"/>
     </w:rPr>
     <w:tblPr>
       <w:tblStyleRowBandSize w:val="1"/>

</xml_diff>